<commit_message>
Rename Cloud Shell paths to cx-agent-studio
Updates scripts, docs, generated teleprompter/guide content, and setup prompts to use `~/cx-agent-studio` instead of `~/cymbal`, including the optional skills workspace path (`~/cx-agent-studio-skills`). Also aligns clone instructions to `haggman/cx-agent-studio`, renames the npm package to `cx-agent-studio`, and refreshes bundled demo/doc artifacts to match the new canonical paths.
</commit_message>
<xml_diff>
--- a/docs/PLANNING GUIDE - CX Agent Studio - Cymbal Energy.docx
+++ b/docs/PLANNING GUIDE - CX Agent Studio - Cymbal Energy.docx
@@ -406,7 +406,7 @@
                 <w:sz w:val="22"/>
                 <w:szCs w:val="22"/>
               </w:rPr>
-              <w:t xml:space="preserve">M1 is live. At each module break one command catches the app up to the end of the previous module (section 3.2): bash ~/cymbal/catch_up.sh &lt;module you are about to teach&gt;. Use it every break for a guaranteed start state, or only when a live build went sideways.</w:t>
+              <w:t xml:space="preserve">M1 is live. At each module break one command catches the app up to the end of the previous module (section 3.2): bash ~/cx-agent-studio/catch_up.sh &lt;module you are about to teach&gt;. Use it every break for a guaranteed start state, or only when a live build went sideways.</w:t>
             </w:r>
           </w:p>
           <w:p>
@@ -6843,7 +6843,7 @@
           <w:sz w:val="22"/>
           <w:szCs w:val="22"/>
         </w:rPr>
-        <w:t xml:space="preserve">Any Google Cloud project where you are Owner works (the class uses a long-running Qwiklabs project, good for a week). Everything below happens in that project, in Cloud Shell. Everything the demos run lives in the repo, which the scripts expect at ~/cymbal (Cloud Shell always starts in ~, so this works in anyone's Cloud Shell). Paste these one box at a time:</w:t>
+        <w:t xml:space="preserve">Any Google Cloud project where you are Owner works (the class uses a long-running Qwiklabs project, good for a week). Everything below happens in that project, in Cloud Shell. Everything the demos run lives in the repo, which the scripts expect at ~/cx-agent-studio (Cloud Shell always starts in ~, so this works in anyone's Cloud Shell). Paste these one box at a time:</w:t>
       </w:r>
     </w:p>
     <w:tbl>
@@ -7017,7 +7017,7 @@
                 <w:sz w:val="18"/>
                 <w:szCs w:val="18"/>
               </w:rPr>
-              <w:t xml:space="preserve">CLOUD SHELL · Step 2 · Put the pack at ~/cymbal (clone the repo, or upload the zip)</w:t>
+              <w:t xml:space="preserve">CLOUD SHELL · Step 2 · Put the pack at ~/cx-agent-studio (clone the repo, or upload the zip)</w:t>
             </w:r>
           </w:p>
           <w:p>
@@ -7034,7 +7034,7 @@
                 <w:sz w:val="19"/>
                 <w:szCs w:val="19"/>
               </w:rPr>
-              <w:t xml:space="preserve">cd ~ &amp;&amp; git clone https://github.com/haggman/cx-agent-studio-demos.git cymbal</w:t>
+              <w:t xml:space="preserve">cd ~ &amp;&amp; git clone https://github.com/haggman/cx-agent-studio.git</w:t>
             </w:r>
           </w:p>
           <w:p>
@@ -7051,7 +7051,7 @@
                 <w:sz w:val="19"/>
                 <w:szCs w:val="19"/>
               </w:rPr>
-              <w:t xml:space="preserve">ls ~/cymbal/</w:t>
+              <w:t xml:space="preserve">ls ~/cx-agent-studio/</w:t>
             </w:r>
           </w:p>
           <w:p>
@@ -7082,7 +7082,7 @@
                 <w:sz w:val="19"/>
                 <w:szCs w:val="19"/>
               </w:rPr>
-              <w:t xml:space="preserve">Shows 01-start-with-ai … 07-launch, setup, stages, setup.sh and catch_up.sh. Later updates: git -C ~/cymbal pull. No git? Cloud Shell ▸ ⋮ (More) ▸ Upload ▸ cymbal-energy-demo-pack.zip, then unzip -o ~/cymbal-energy-demo-pack.zip -d ~/cymbal (same folder, same paths; use one way or the other, since git won't clone into a folder that already has files).</w:t>
+              <w:t xml:space="preserve">Shows 01-start-with-ai … 07-launch, setup, stages, setup.sh and catch_up.sh. Later updates: git -C ~/cx-agent-studio pull. No git? Cloud Shell ▸ ⋮ (More) ▸ Upload ▸ cymbal-energy-demo-pack.zip, then unzip -o ~/cymbal-energy-demo-pack.zip -d ~/cx-agent-studio (same folder, same paths; use one way or the other, since git won't clone into a folder that already has files).</w:t>
             </w:r>
           </w:p>
         </w:tc>
@@ -7172,7 +7172,7 @@
                 <w:sz w:val="19"/>
                 <w:szCs w:val="19"/>
               </w:rPr>
-              <w:t xml:space="preserve">bash ~/cymbal/setup.sh</w:t>
+              <w:t xml:space="preserve">bash ~/cx-agent-studio/setup.sh</w:t>
             </w:r>
           </w:p>
           <w:p>
@@ -7203,7 +7203,7 @@
                 <w:sz w:val="19"/>
                 <w:szCs w:val="19"/>
               </w:rPr>
-              <w:t xml:space="preserve">Six numbered steps; each line starts with ✓ (already there) or + (created now). 1 APIs and bucket (3 policy PDFs, FAQ CSV, metadata JSONL). 2 SCRAPI 1.9.1. 3 the two M4 data stores, cymbal-policies and cymbal-faq, created through the Discovery Engine API and imported once (indexing then runs about 15 minutes on its own). 4 the M7 DLP templates in us and global. 5 Antigravity: the CX Agent Studio MCP server in ~/.gemini/config/mcp_config.json, Cloud Shell's broken Vertex plugin parked, CXAS skills in ~/cymbal-skills. 6 whether the app exists. Run it again in the morning: every line should be ✓, and both data stores should say "already has documents".</w:t>
+              <w:t xml:space="preserve">Six numbered steps; each line starts with ✓ (already there) or + (created now). 1 APIs and bucket (3 policy PDFs, FAQ CSV, metadata JSONL). 2 SCRAPI 1.9.1. 3 the two M4 data stores, cymbal-policies and cymbal-faq, created through the Discovery Engine API and imported once (indexing then runs about 15 minutes on its own). 4 the M7 DLP templates in us and global. 5 Antigravity: the CX Agent Studio MCP server in ~/.gemini/config/mcp_config.json, Cloud Shell's broken Vertex plugin parked, CXAS skills in ~/cx-agent-studio-skills. 6 whether the app exists. Run it again in the morning: every line should be ✓, and both data stores should say "already has documents".</w:t>
             </w:r>
           </w:p>
         </w:tc>
@@ -7293,7 +7293,7 @@
                 <w:sz w:val="19"/>
                 <w:szCs w:val="19"/>
               </w:rPr>
-              <w:t xml:space="preserve">cd ~/cymbal/03-programmatic &amp;&amp; agy     (open the sign-in URL, paste the code back, type /mcp, check Connected, /quit)</w:t>
+              <w:t xml:space="preserve">cd ~/cx-agent-studio/03-programmatic &amp;&amp; agy     (open the sign-in URL, paste the code back, type /mcp, check Connected, /quit)</w:t>
             </w:r>
           </w:p>
           <w:p>
@@ -7600,7 +7600,7 @@
                 <w:sz w:val="19"/>
                 <w:szCs w:val="19"/>
               </w:rPr>
-              <w:t xml:space="preserve">bash ~/cymbal/catch_up.sh N          # N = the module you are about to teach: 2 … 7</w:t>
+              <w:t xml:space="preserve">bash ~/cx-agent-studio/catch_up.sh N          # N = the module you are about to teach: 2 … 7</w:t>
             </w:r>
           </w:p>
           <w:p>
@@ -7617,7 +7617,7 @@
                 <w:sz w:val="19"/>
                 <w:szCs w:val="19"/>
               </w:rPr>
-              <w:t xml:space="preserve">bash ~/cymbal/catch_up.sh done       # the finished app (end of M7)</w:t>
+              <w:t xml:space="preserve">bash ~/cx-agent-studio/catch_up.sh done       # the finished app (end of M7)</w:t>
             </w:r>
           </w:p>
           <w:p>
@@ -8861,7 +8861,7 @@
           <w:sz w:val="22"/>
           <w:szCs w:val="22"/>
         </w:rPr>
-        <w:t xml:space="preserve">Safe in a brand-new Cloud Shell: the only prerequisite is the pack unzipped in ~/cymbal (3.1, step 2). It enables the three APIs, installs cxas-scrapi 1.9.1 if it's missing or a different version, and puts ~/.local/bin on the PATH itself.</w:t>
+        <w:t xml:space="preserve">Safe in a brand-new Cloud Shell: the only prerequisite is the pack unzipped in ~/cx-agent-studio (3.1, step 2). It enables the three APIs, installs cxas-scrapi 1.9.1 if it's missing or a different version, and puts ~/.local/bin on the PATH itself.</w:t>
       </w:r>
     </w:p>
     <w:p>
@@ -8949,7 +8949,7 @@
           <w:sz w:val="22"/>
           <w:szCs w:val="22"/>
         </w:rPr>
-        <w:t xml:space="preserve">If it stops, it prints the line it stopped at. Copy the whole output. The folders are generated by src/make_stages.py from the same files the live demo pastes; bash ~/cymbal/stages/load_stage.sh N does the same thing addressed by the module that just ended.</w:t>
+        <w:t xml:space="preserve">If it stops, it prints the line it stopped at. Copy the whole output. The folders are generated by src/make_stages.py from the same files the live demo pastes; bash ~/cx-agent-studio/stages/load_stage.sh N does the same thing addressed by the module that just ended.</w:t>
       </w:r>
     </w:p>
     <w:tbl>
@@ -9019,7 +9019,7 @@
                 <w:sz w:val="19"/>
                 <w:szCs w:val="19"/>
               </w:rPr>
-              <w:t xml:space="preserve">bash ~/cymbal/stages/build_all_stages.sh</w:t>
+              <w:t xml:space="preserve">bash ~/cx-agent-studio/stages/build_all_stages.sh</w:t>
             </w:r>
           </w:p>
           <w:p>
@@ -9095,7 +9095,7 @@
           <w:sz w:val="22"/>
           <w:szCs w:val="22"/>
         </w:rPr>
-        <w:t xml:space="preserve">bash ~/cymbal/setup.sh: every line ✓</w:t>
+        <w:t xml:space="preserve">bash ~/cx-agent-studio/setup.sh: every line ✓</w:t>
       </w:r>
     </w:p>
     <w:p>
@@ -9225,7 +9225,7 @@
           <w:sz w:val="22"/>
           <w:szCs w:val="22"/>
         </w:rPr>
-        <w:t xml:space="preserve">bash ~/cymbal/setup.sh (both data stores say "already has documents"), then bash ~/cymbal/catch_up.sh 4 (end-of-M3 agent plus cymbal_policies and cymbal_faq in Tools, not attached: block 14 needs them there)</w:t>
+        <w:t xml:space="preserve">bash ~/cx-agent-studio/setup.sh (both data stores say "already has documents"), then bash ~/cx-agent-studio/catch_up.sh 4 (end-of-M3 agent plus cymbal_policies and cymbal_faq in Tools, not attached: block 14 needs them there)</w:t>
       </w:r>
     </w:p>
     <w:p>
@@ -9291,7 +9291,7 @@
           <w:sz w:val="22"/>
           <w:szCs w:val="22"/>
         </w:rPr>
-        <w:t xml:space="preserve">Cloud Shell still has ~/cymbal (Cloud Shell home persists; clone again or re-upload the zip if the project was reset)</w:t>
+        <w:t xml:space="preserve">Cloud Shell still has ~/cx-agent-studio (Cloud Shell home persists; clone again or re-upload the zip if the project was reset)</w:t>
       </w:r>
     </w:p>
     <w:p>
@@ -11133,7 +11133,7 @@
                 <w:sz w:val="21"/>
                 <w:szCs w:val="21"/>
               </w:rPr>
-              <w:t xml:space="preserve">On track? Continue. Behind or broken? Cloud Shell:  bash ~/cymbal/catch_up.sh 2   (loads v1-start-with-ai, 1–2 min)</w:t>
+              <w:t xml:space="preserve">On track? Continue. Behind or broken? Cloud Shell:  bash ~/cx-agent-studio/catch_up.sh 2   (loads v1-start-with-ai, 1–2 min)</w:t>
             </w:r>
           </w:p>
           <w:p>
@@ -11727,7 +11727,7 @@
                 <w:sz w:val="21"/>
                 <w:szCs w:val="21"/>
               </w:rPr>
-              <w:t xml:space="preserve">On track? Continue. Behind or broken? Cloud Shell:  bash ~/cymbal/catch_up.sh 2   (loads v1-start-with-ai, 1–2 min)</w:t>
+              <w:t xml:space="preserve">On track? Continue. Behind or broken? Cloud Shell:  bash ~/cx-agent-studio/catch_up.sh 2   (loads v1-start-with-ai, 1–2 min)</w:t>
             </w:r>
           </w:p>
           <w:p>
@@ -17077,7 +17077,7 @@
                 <w:sz w:val="21"/>
                 <w:szCs w:val="21"/>
               </w:rPr>
-              <w:t xml:space="preserve">On track? Continue. Behind or broken? Cloud Shell:  bash ~/cymbal/catch_up.sh 3   (loads v2-multi-agent, 1–2 min)</w:t>
+              <w:t xml:space="preserve">On track? Continue. Behind or broken? Cloud Shell:  bash ~/cx-agent-studio/catch_up.sh 3   (loads v2-multi-agent, 1–2 min)</w:t>
             </w:r>
           </w:p>
           <w:p>
@@ -17128,7 +17128,7 @@
                 <w:sz w:val="21"/>
                 <w:szCs w:val="21"/>
               </w:rPr>
-              <w:t xml:space="preserve">Cloud Shell open in the pack folder (cd ~/cymbal)</w:t>
+              <w:t xml:space="preserve">Cloud Shell open in the pack folder (cd ~/cx-agent-studio)</w:t>
             </w:r>
           </w:p>
         </w:tc>
@@ -17249,7 +17249,7 @@
                 <w:sz w:val="19"/>
                 <w:szCs w:val="19"/>
               </w:rPr>
-              <w:t xml:space="preserve">cd ~/cymbal/03-programmatic</w:t>
+              <w:t xml:space="preserve">cd ~/cx-agent-studio/03-programmatic</w:t>
             </w:r>
           </w:p>
           <w:p>
@@ -17772,7 +17772,7 @@
                 <w:sz w:val="21"/>
                 <w:szCs w:val="21"/>
               </w:rPr>
-              <w:t xml:space="preserve">antigravity_setup.sh already run last night (MCP server configured, skills in ~/cymbal-skills)</w:t>
+              <w:t xml:space="preserve">antigravity_setup.sh already run last night (MCP server configured, skills in ~/cx-agent-studio-skills)</w:t>
             </w:r>
           </w:p>
         </w:tc>
@@ -17893,7 +17893,7 @@
                 <w:sz w:val="19"/>
                 <w:szCs w:val="19"/>
               </w:rPr>
-              <w:t xml:space="preserve">cd ~/cymbal/03-programmatic &amp;&amp; agy</w:t>
+              <w:t xml:space="preserve">cd ~/cx-agent-studio/03-programmatic &amp;&amp; agy</w:t>
             </w:r>
           </w:p>
         </w:tc>
@@ -18464,7 +18464,7 @@
                 <w:sz w:val="20"/>
                 <w:szCs w:val="20"/>
               </w:rPr>
-              <w:t xml:space="preserve">cd ~/cymbal-skills &amp;&amp; agy ▸ type / to show the cxas-* skills ▸</w:t>
+              <w:t xml:space="preserve">cd ~/cx-agent-studio-skills &amp;&amp; agy ▸ type / to show the cxas-* skills ▸</w:t>
             </w:r>
           </w:p>
           <w:p>
@@ -18531,7 +18531,7 @@
           <w:sz w:val="20"/>
           <w:szCs w:val="20"/>
         </w:rPr>
-        <w:t xml:space="preserve">Server not Connected in /mcp: rerun antigravity_setup.sh (step 3 writes ~/.gemini/config/mcp_config.json). First agy launch prints a sign-in URL: open it, sign in, paste the code. Start agy in ~/cymbal/03-programmatic, NOT ~/cymbal-skills, for the core demo: the foundry skill would take over with its own checklist. If agy spots the 12-installment line, smile: "hold that thought until tomorrow."</w:t>
+        <w:t xml:space="preserve">Server not Connected in /mcp: rerun antigravity_setup.sh (step 3 writes ~/.gemini/config/mcp_config.json). First agy launch prints a sign-in URL: open it, sign in, paste the code. Start agy in ~/cx-agent-studio/03-programmatic, NOT ~/cx-agent-studio-skills, for the core demo: the foundry skill would take over with its own checklist. If agy spots the 12-installment line, smile: "hold that thought until tomorrow."</w:t>
       </w:r>
     </w:p>
     <w:p>
@@ -19567,7 +19567,7 @@
                 <w:sz w:val="21"/>
                 <w:szCs w:val="21"/>
               </w:rPr>
-              <w:t xml:space="preserve">Day 2 morning ran bash ~/cymbal/setup.sh and bash ~/cymbal/catch_up.sh 4: Tools already lists cymbal_policies and cymbal_faq (not attached to any agent)</w:t>
+              <w:t xml:space="preserve">Day 2 morning ran bash ~/cx-agent-studio/setup.sh and bash ~/cx-agent-studio/catch_up.sh 4: Tools already lists cymbal_policies and cymbal_faq (not attached to any agent)</w:t>
             </w:r>
           </w:p>
           <w:p>
@@ -20043,7 +20043,7 @@
           <w:sz w:val="20"/>
           <w:szCs w:val="20"/>
         </w:rPr>
-        <w:t xml:space="preserve">Clicked Create by mistake? No harm: cymbal_policies_live is a separate store the scripts ignore; delete that tool after class (Tools ▸ ⋮ ▸ Delete). cymbal_policies / cymbal_faq missing from Tools? Cloud Shell: bash ~/cymbal/catch_up.sh 4, then refresh. Showing the stores in the AI Applications data store console? Switch its location from global to us (they live with the app, in us).</w:t>
+        <w:t xml:space="preserve">Clicked Create by mistake? No harm: cymbal_policies_live is a separate store the scripts ignore; delete that tool after class (Tools ▸ ⋮ ▸ Delete). cymbal_policies / cymbal_faq missing from Tools? Cloud Shell: bash ~/cx-agent-studio/catch_up.sh 4, then refresh. Showing the stores in the AI Applications data store console? Switch its location from global to us (they live with the app, in us).</w:t>
       </w:r>
     </w:p>
     <w:p>
@@ -21588,7 +21588,7 @@
           <w:sz w:val="20"/>
           <w:szCs w:val="20"/>
         </w:rPr>
-        <w:t xml:space="preserve">No answer or "this link may help"? The grounding threshold is too high (slide 74), or indexing isn't finished: bash ~/cymbal/setup.sh reports each store as "already has documents" once the import is done.</w:t>
+        <w:t xml:space="preserve">No answer or "this link may help"? The grounding threshold is too high (slide 74), or indexing isn't finished: bash ~/cx-agent-studio/setup.sh reports each store as "already has documents" once the import is done.</w:t>
       </w:r>
     </w:p>
     <w:p>
@@ -22139,7 +22139,7 @@
                 <w:sz w:val="21"/>
                 <w:szCs w:val="21"/>
               </w:rPr>
-              <w:t xml:space="preserve">On track? Continue. Behind or broken? Cloud Shell:  bash ~/cymbal/catch_up.sh 5   (loads v4-knowledge, 1–2 min)</w:t>
+              <w:t xml:space="preserve">On track? Continue. Behind or broken? Cloud Shell:  bash ~/cx-agent-studio/catch_up.sh 5   (loads v4-knowledge, 1–2 min)</w:t>
             </w:r>
           </w:p>
           <w:p>
@@ -24589,7 +24589,7 @@
                 <w:sz w:val="21"/>
                 <w:szCs w:val="21"/>
               </w:rPr>
-              <w:t xml:space="preserve">On track? Continue. Behind or broken? Cloud Shell:  bash ~/cymbal/catch_up.sh 6   (loads v5-evaluated, 1–2 min)</w:t>
+              <w:t xml:space="preserve">On track? Continue. Behind or broken? Cloud Shell:  bash ~/cx-agent-studio/catch_up.sh 6   (loads v5-evaluated, 1–2 min)</w:t>
             </w:r>
           </w:p>
           <w:p>
@@ -25403,7 +25403,7 @@
                 <w:sz w:val="21"/>
                 <w:szCs w:val="21"/>
               </w:rPr>
-              <w:t xml:space="preserve">Cloud Shell in ~/cymbal/06-deploy</w:t>
+              <w:t xml:space="preserve">Cloud Shell in ~/cx-agent-studio/06-deploy</w:t>
             </w:r>
           </w:p>
         </w:tc>
@@ -25614,7 +25614,7 @@
                 <w:sz w:val="19"/>
                 <w:szCs w:val="19"/>
               </w:rPr>
-              <w:t xml:space="preserve">cd ~/cymbal/06-deploy &amp;&amp; bash api_demo.sh APP_ID DEPLOYMENT_ID</w:t>
+              <w:t xml:space="preserve">cd ~/cx-agent-studio/06-deploy &amp;&amp; bash api_demo.sh APP_ID DEPLOYMENT_ID</w:t>
             </w:r>
           </w:p>
           <w:p>
@@ -26625,7 +26625,7 @@
                 <w:sz w:val="21"/>
                 <w:szCs w:val="21"/>
               </w:rPr>
-              <w:t xml:space="preserve">On track? Continue. Behind or broken? Cloud Shell:  bash ~/cymbal/catch_up.sh 7   (loads v6-escalation, 1–2 min)</w:t>
+              <w:t xml:space="preserve">On track? Continue. Behind or broken? Cloud Shell:  bash ~/cx-agent-studio/catch_up.sh 7   (loads v6-escalation, 1–2 min)</w:t>
             </w:r>
           </w:p>
           <w:p>
@@ -27419,7 +27419,7 @@
                 <w:sz w:val="21"/>
                 <w:szCs w:val="21"/>
               </w:rPr>
-              <w:t xml:space="preserve">Continue from block 24 (or bash ~/cymbal/catch_up.sh 7)</w:t>
+              <w:t xml:space="preserve">Continue from block 24 (or bash ~/cx-agent-studio/catch_up.sh 7)</w:t>
             </w:r>
           </w:p>
           <w:p>
@@ -27436,7 +27436,7 @@
                 <w:sz w:val="21"/>
                 <w:szCs w:val="21"/>
               </w:rPr>
-              <w:t xml:space="preserve">Cloud Shell in ~/cymbal/07-launch</w:t>
+              <w:t xml:space="preserve">Cloud Shell in ~/cx-agent-studio/07-launch</w:t>
             </w:r>
           </w:p>
         </w:tc>
@@ -27557,7 +27557,7 @@
                 <w:sz w:val="19"/>
                 <w:szCs w:val="19"/>
               </w:rPr>
-              <w:t xml:space="preserve">cd ~/cymbal/07-launch &amp;&amp; bash dlp_templates.sh</w:t>
+              <w:t xml:space="preserve">cd ~/cx-agent-studio/07-launch &amp;&amp; bash dlp_templates.sh</w:t>
             </w:r>
           </w:p>
           <w:p>
@@ -34786,7 +34786,7 @@
           <w:sz w:val="22"/>
           <w:szCs w:val="22"/>
         </w:rPr>
-        <w:t xml:space="preserve">Antigravity CLI: the CX Agent Studio server shows Connected in /mcp; MCP calls prompt for approval; the optional skills appear as / commands when agy starts in ~/cymbal-skills (hooks from cxas init are registered for Claude Code and Gemini CLI only, not Antigravity).</w:t>
+        <w:t xml:space="preserve">Antigravity CLI: the CX Agent Studio server shows Connected in /mcp; MCP calls prompt for approval; the optional skills appear as / commands when agy starts in ~/cx-agent-studio-skills (hooks from cxas init are registered for Claude Code and Gemini CLI only, not Antigravity).</w:t>
       </w:r>
     </w:p>
     <w:p>

</xml_diff>

<commit_message>
Align demo content with snake_case agent names
Update instructions, generated content, stage assets, and presenter docs to consistently use `cymbal_care`, `outage_agent`, and `billing_agent`, matching the importer and live app names. This keeps hand-built and catch-up flows in sync, fixes agent transfer references, and refreshes related teleprompter/evaluation guidance, including the M4 grounding demo wording.
</commit_message>
<xml_diff>
--- a/docs/PLANNING GUIDE - CX Agent Studio - Cymbal Energy.docx
+++ b/docs/PLANNING GUIDE - CX Agent Studio - Cymbal Energy.docx
@@ -384,7 +384,7 @@
                 <w:sz w:val="22"/>
                 <w:szCs w:val="22"/>
               </w:rPr>
-              <w:t xml:space="preserve">One planted bug: the Billing Agent's instructions say "up to 12 monthly installments" while the tool enforces 6. Nobody mentions it until the M5 evaluation catches it.</w:t>
+              <w:t xml:space="preserve">One planted bug: the billing_agent's instructions say "up to 12 monthly installments" while the tool enforces 6. Nobody mentions it until the M5 evaluation catches it.</w:t>
             </w:r>
           </w:p>
           <w:p>
@@ -894,7 +894,7 @@
                 <w:sz w:val="19"/>
                 <w:szCs w:val="19"/>
               </w:rPr>
-              <w:t xml:space="preserve">Root + Outage Agent + Billing Agent; global instruction (incl. gas safety); Restructure instructions; 8 variables; after-tool callback that writes outage state and the storm-credit flag; 5 Python tools; Prompt Guard, scam blocklist, no-promises rule</w:t>
+              <w:t xml:space="preserve">Root + outage_agent + billing_agent; global instruction (incl. gas safety); Restructure instructions; 8 variables; after-tool callback that writes outage state and the storm-credit flag; 5 Python tools; Prompt Guard, scam blocklist, no-promises rule</w:t>
             </w:r>
           </w:p>
         </w:tc>
@@ -2557,7 +2557,7 @@
                 <w:sz w:val="19"/>
                 <w:szCs w:val="19"/>
               </w:rPr>
-              <w:t xml:space="preserve">From one agent to a team: root + Outage Agent + Billing Agent</w:t>
+              <w:t xml:space="preserve">From one agent to a team: root + outage_agent + billing_agent</w:t>
             </w:r>
           </w:p>
         </w:tc>
@@ -8927,7 +8927,7 @@
           <w:sz w:val="22"/>
           <w:szCs w:val="22"/>
         </w:rPr>
-        <w:t xml:space="preserve">Loaded agents are snake_case: cymbal_care, outage_agent, billing_agent (and cymbal_energy_care_agent for the M1 draft). The importer resolves the root agent, sub-agents and {@AGENT: …} references by display name, and names with spaces fail with 400 Reference not found (that was the first push error). The teleprompter's "Outage Agent" means outage_agent after a catch-up.</w:t>
+        <w:t xml:space="preserve">Loaded agents are snake_case: cymbal_care, outage_agent, billing_agent (and cymbal_energy_care_agent for the M1 draft). The importer resolves the root agent, sub-agents and {@AGENT: …} references by display name, and names with spaces fail with 400 Reference not found (that was the first push error). The live build uses the same names (block 4 creates them), so a catch-up looks exactly like what you built by hand.</w:t>
       </w:r>
     </w:p>
     <w:p>
@@ -10249,7 +10249,7 @@
                 <w:sz w:val="20"/>
                 <w:szCs w:val="20"/>
               </w:rPr>
-              <w:t xml:space="preserve">Review resources: Cymbal Energy Care Agent (root) + five Python placeholder tools (expand check_outage to show the stub) ▸ accept / apply</w:t>
+              <w:t xml:space="preserve">Review resources: the root agent (Start with AI names it; the catch-up copy is cymbal_energy_care_agent) + five Python placeholder tools (expand check_outage to show the stub) ▸ accept / apply</w:t>
             </w:r>
           </w:p>
         </w:tc>
@@ -11597,7 +11597,7 @@
           <w:sz w:val="22"/>
           <w:szCs w:val="22"/>
         </w:rPr>
-        <w:t xml:space="preserve">4. From one agent to a team: root + Outage Agent + Billing Agent   ·   M2 · SLIDE 11   ·   ~8 min</w:t>
+        <w:t xml:space="preserve">4. From one agent to a team: root + outage_agent + billing_agent   ·   M2 · SLIDE 11   ·   ~8 min</w:t>
       </w:r>
     </w:p>
     <w:p>
@@ -11627,7 +11627,7 @@
           <w:sz w:val="22"/>
           <w:szCs w:val="22"/>
         </w:rPr>
-        <w:t xml:space="preserve">Names and descriptions are what the root uses to route. The instructions stay short because each specialist owns its own domain.</w:t>
+        <w:t xml:space="preserve">Names and descriptions are what the root uses to route. The instructions stay short because each specialist owns its own domain. Why snake_case names: they are what the app's export and import format expects (a name with spaces breaks references on import), so the agent you build here is identical to the one SCRAPI and the catch-up scripts load.</w:t>
       </w:r>
     </w:p>
     <w:p>
@@ -11882,7 +11882,7 @@
                 <w:sz w:val="20"/>
                 <w:szCs w:val="20"/>
               </w:rPr>
-              <w:t xml:space="preserve">Root agent title bar ▸ name: Cymbal Care ▸ description: Front door of Cymbal Energy customer care; greets and routes. ▸ Save</w:t>
+              <w:t xml:space="preserve">Root agent title bar ▸ name: cymbal_care ▸ description: Front door of Cymbal Energy customer care; greets and routes. ▸ Save</w:t>
             </w:r>
           </w:p>
         </w:tc>
@@ -11972,7 +11972,7 @@
                 <w:sz w:val="20"/>
                 <w:szCs w:val="20"/>
               </w:rPr>
-              <w:t xml:space="preserve">+ under the root ▸ Add sub-agent ▸ name: Outage Agent ▸ description: Handles power outages, downed lines, and outage status by ZIP code. ▸ instruction: Help customers with power outages.</w:t>
+              <w:t xml:space="preserve">+ under the root ▸ Add sub-agent ▸ name: outage_agent ▸ description: Handles power outages, downed lines, and outage status by ZIP code. ▸ instruction: Help customers with power outages.</w:t>
             </w:r>
           </w:p>
         </w:tc>
@@ -12062,7 +12062,7 @@
                 <w:sz w:val="20"/>
                 <w:szCs w:val="20"/>
               </w:rPr>
-              <w:t xml:space="preserve">+ under the root ▸ Add sub-agent ▸ name: Billing Agent ▸ description: Handles bills, balances, payments and payment arrangements. ▸ instruction: Help customers with their bill.</w:t>
+              <w:t xml:space="preserve">+ under the root ▸ Add sub-agent ▸ name: billing_agent ▸ description: Handles bills, balances, payments and payment arrangements. ▸ instruction: Help customers with their bill.</w:t>
             </w:r>
           </w:p>
         </w:tc>
@@ -12169,7 +12169,7 @@
                 <w:sz w:val="20"/>
                 <w:szCs w:val="20"/>
               </w:rPr>
-              <w:t xml:space="preserve">▸ replace ALL of Cymbal Care's instructions ▸ Save</w:t>
+              <w:t xml:space="preserve">▸ replace ALL of cymbal_care's instructions ▸ Save</w:t>
             </w:r>
           </w:p>
         </w:tc>
@@ -12290,7 +12290,7 @@
                 <w:sz w:val="19"/>
                 <w:szCs w:val="19"/>
               </w:rPr>
-              <w:t xml:space="preserve">Trace shows a transfer from Cymbal Care to Outage Agent. It has no tools yet; that's slide 82.</w:t>
+              <w:t xml:space="preserve">Trace shows a transfer from cymbal_care to outage_agent. It has no tools yet; that's slide 82.</w:t>
             </w:r>
           </w:p>
         </w:tc>
@@ -12411,7 +12411,7 @@
                 <w:sz w:val="19"/>
                 <w:szCs w:val="19"/>
               </w:rPr>
-              <w:t xml:space="preserve">Transfer to Billing Agent.</w:t>
+              <w:t xml:space="preserve">Transfer to billing_agent.</w:t>
             </w:r>
           </w:p>
         </w:tc>
@@ -12541,7 +12541,7 @@
           <w:sz w:val="22"/>
           <w:szCs w:val="22"/>
         </w:rPr>
-        <w:t xml:space="preserve">The brand lead owns this box. The developer owning the Outage Agent never touches tone, and can't accidentally break it.</w:t>
+        <w:t xml:space="preserve">The brand lead owns this box. The developer owning the outage_agent never touches tone, and can't accidentally break it.</w:t>
       </w:r>
     </w:p>
     <w:tbl>
@@ -12839,7 +12839,7 @@
                 <w:sz w:val="20"/>
                 <w:szCs w:val="20"/>
               </w:rPr>
-              <w:t xml:space="preserve">Slide 26: Outage Agent ▸ instructions ▸ PASTE (one plain paragraph):</w:t>
+              <w:t xml:space="preserve">Slide 26: outage_agent ▸ instructions ▸ PASTE (one plain paragraph):</w:t>
             </w:r>
           </w:p>
           <w:p>
@@ -13025,7 +13025,7 @@
                 <w:sz w:val="19"/>
                 <w:szCs w:val="19"/>
               </w:rPr>
-              <w:t xml:space="preserve">Tone follows the global instruction (calm, short) even though the Outage Agent's own instructions never mention tone.</w:t>
+              <w:t xml:space="preserve">Tone follows the global instruction (calm, short) even though the outage_agent's own instructions never mention tone.</w:t>
             </w:r>
           </w:p>
         </w:tc>
@@ -13246,7 +13246,7 @@
           <w:sz w:val="22"/>
           <w:szCs w:val="22"/>
         </w:rPr>
-        <w:t xml:space="preserve">Variables are how the Billing Agent's verification carries over to the Outage Agent without asking the customer twice.</w:t>
+        <w:t xml:space="preserve">Variables are how the billing_agent's verification carries over to the outage_agent without asking the customer twice.</w:t>
       </w:r>
     </w:p>
     <w:p>
@@ -14185,7 +14185,7 @@
                 <w:sz w:val="20"/>
                 <w:szCs w:val="20"/>
               </w:rPr>
-              <w:t xml:space="preserve">Outage Agent ▸ Add tool ▸ check_outage   ·   Cymbal Care ▸ remove check_outage (x)</w:t>
+              <w:t xml:space="preserve">outage_agent ▸ Add tool ▸ check_outage   ·   cymbal_care ▸ remove check_outage (x)</w:t>
             </w:r>
           </w:p>
         </w:tc>
@@ -14275,7 +14275,7 @@
                 <w:sz w:val="20"/>
                 <w:szCs w:val="20"/>
               </w:rPr>
-              <w:t xml:space="preserve">Outage Agent title bar ▸ Add callback ▸ After tool ▸ PASTE:</w:t>
+              <w:t xml:space="preserve">outage_agent title bar ▸ Add callback ▸ After tool ▸ PASTE:</w:t>
             </w:r>
           </w:p>
           <w:p>
@@ -14382,7 +14382,7 @@
                 <w:sz w:val="18"/>
                 <w:szCs w:val="18"/>
               </w:rPr>
-              <w:t xml:space="preserve">TYPE at the end of the Outage Agent instructions (use the { menu) ▸ Save</w:t>
+              <w:t xml:space="preserve">TYPE at the end of the outage_agent instructions (use the { menu) ▸ Save</w:t>
             </w:r>
           </w:p>
           <w:p>
@@ -15231,7 +15231,7 @@
           <w:sz w:val="20"/>
           <w:szCs w:val="20"/>
         </w:rPr>
-        <w:t xml:space="preserve">If a placeholder won't save after the paste (signature or type mismatch), delete it and create a new tool with the same name: Tools ▸ + ▸ Python code ▸ paste ▸ Create. Test Tool errors on set_variable/get_variable usually mean the variables from block 6 are missing or misspelled. Don't point out the Billing Agent's "up to 12 monthly installments" line. It contradicts the tool (max 6) on purpose: the evaluation in M5 catches it.</w:t>
+        <w:t xml:space="preserve">If a placeholder won't save after the paste (signature or type mismatch), delete it and create a new tool with the same name: Tools ▸ + ▸ Python code ▸ paste ▸ Create. Test Tool errors on set_variable/get_variable usually mean the variables from block 6 are missing or misspelled. Don't point out the billing_agent's "up to 12 monthly installments" line. It contradicts the tool (max 6) on purpose: the evaluation in M5 catches it.</w:t>
       </w:r>
     </w:p>
     <w:p>
@@ -15281,7 +15281,7 @@
           <w:sz w:val="22"/>
           <w:szCs w:val="22"/>
         </w:rPr>
-        <w:t xml:space="preserve">Tools are attached per agent: the Outage Agent can't touch billing, and the Billing Agent can't report outages. Verification writes variables; every other agent reads them.</w:t>
+        <w:t xml:space="preserve">Tools are attached per agent: the outage_agent can't touch billing, and the billing_agent can't report outages. Verification writes variables; every other agent reads them.</w:t>
       </w:r>
     </w:p>
     <w:p>
@@ -15311,7 +15311,7 @@
           <w:sz w:val="22"/>
           <w:szCs w:val="22"/>
         </w:rPr>
-        <w:t xml:space="preserve">Watch the Variables panel: verification happened in Billing, and the Outage Agent just used the ZIP. That's memory across agents.</w:t>
+        <w:t xml:space="preserve">Watch the Variables panel: verification happened in Billing, and the outage_agent just used the ZIP. That's memory across agents.</w:t>
       </w:r>
     </w:p>
     <w:tbl>
@@ -15519,7 +15519,7 @@
                 <w:sz w:val="20"/>
                 <w:szCs w:val="20"/>
               </w:rPr>
-              <w:t xml:space="preserve">  Outage Agent: report_outage (check_outage is already there)</w:t>
+              <w:t xml:space="preserve">  outage_agent: report_outage (check_outage is already there)</w:t>
             </w:r>
           </w:p>
           <w:p>
@@ -15536,7 +15536,7 @@
                 <w:sz w:val="20"/>
                 <w:szCs w:val="20"/>
               </w:rPr>
-              <w:t xml:space="preserve">  Billing Agent: verify_customer, get_bill_summary, create_payment_arrangement</w:t>
+              <w:t xml:space="preserve">  billing_agent: verify_customer, get_bill_summary, create_payment_arrangement</w:t>
             </w:r>
           </w:p>
           <w:p>
@@ -15553,7 +15553,7 @@
                 <w:sz w:val="20"/>
                 <w:szCs w:val="20"/>
               </w:rPr>
-              <w:t xml:space="preserve">Cymbal Care: REMOVE the remaining four (x) — Start with AI attached them to the root; the root only routes now</w:t>
+              <w:t xml:space="preserve">cymbal_care: REMOVE the remaining four (x) — Start with AI attached them to the root; the root only routes now</w:t>
             </w:r>
           </w:p>
         </w:tc>
@@ -15643,7 +15643,7 @@
                 <w:sz w:val="20"/>
                 <w:szCs w:val="20"/>
               </w:rPr>
-              <w:t xml:space="preserve">02-build/instructions/outage_agent.txt ▸ Outage Agent instructions (replace ALL; it keeps the storm-credit step)</w:t>
+              <w:t xml:space="preserve">02-build/instructions/outage_agent.txt ▸ outage_agent instructions (replace ALL; it keeps the storm-credit step)</w:t>
             </w:r>
           </w:p>
           <w:p>
@@ -15660,7 +15660,7 @@
                 <w:sz w:val="20"/>
                 <w:szCs w:val="20"/>
               </w:rPr>
-              <w:t xml:space="preserve">02-build/instructions/billing_agent.txt ▸ Billing Agent instructions (replace ALL)</w:t>
+              <w:t xml:space="preserve">02-build/instructions/billing_agent.txt ▸ billing_agent instructions (replace ALL)</w:t>
             </w:r>
           </w:p>
           <w:p>
@@ -15798,7 +15798,7 @@
                 <w:sz w:val="19"/>
                 <w:szCs w:val="19"/>
               </w:rPr>
-              <w:t xml:space="preserve">Billing Agent asks for account number and ZIP.</w:t>
+              <w:t xml:space="preserve">billing_agent asks for account number and ZIP.</w:t>
             </w:r>
           </w:p>
         </w:tc>
@@ -16040,7 +16040,7 @@
                 <w:sz w:val="19"/>
                 <w:szCs w:val="19"/>
               </w:rPr>
-              <w:t xml:space="preserve">Transfers to Outage Agent, does NOT ask for the ZIP again (read {service_zip}), quotes 11:00 PM tonight.</w:t>
+              <w:t xml:space="preserve">Transfers to outage_agent, does NOT ask for the ZIP again (read {service_zip}), quotes 11:00 PM tonight.</w:t>
             </w:r>
           </w:p>
         </w:tc>
@@ -16090,7 +16090,7 @@
           <w:sz w:val="20"/>
           <w:szCs w:val="20"/>
         </w:rPr>
-        <w:t xml:space="preserve">If an agent says it has no way to look something up, the tool isn't attached to THAT agent (tools are per agent). Don't point out the "up to 12 monthly installments" line in the Billing Agent: M5's evaluation catches it.</w:t>
+        <w:t xml:space="preserve">If an agent says it has no way to look something up, the tool isn't attached to THAT agent (tools are per agent). Don't point out the "up to 12 monthly installments" line in the billing_agent: M5's evaluation catches it.</w:t>
       </w:r>
     </w:p>
     <w:p>
@@ -18194,7 +18194,7 @@
                 <w:sz w:val="19"/>
                 <w:szCs w:val="19"/>
               </w:rPr>
-              <w:t xml:space="preserve">Review the Billing Agent's instructions against CX Agent Studio instruction best practices. List your top three suggestions, but do not change anything.</w:t>
+              <w:t xml:space="preserve">Review the billing_agent's instructions against CX Agent Studio instruction best practices. List your top three suggestions, but do not change anything.</w:t>
             </w:r>
           </w:p>
         </w:tc>
@@ -20534,7 +20534,7 @@
           <w:sz w:val="22"/>
           <w:szCs w:val="22"/>
         </w:rPr>
-        <w:t xml:space="preserve">Where should the policies live? On the root, on a policy agent, or on each specialist? Tools belong to agents, so once the root hands you to the Outage Agent, only its tools exist. Watch the last question: it needs the outage tool and the storm policy in the same answer.</w:t>
+        <w:t xml:space="preserve">Where should the policies live? On the root, on a policy agent, or on each specialist? Tools belong to agents, so once the root hands you to the outage_agent, only its tools exist. Watch the last question: it needs the outage tool and the storm policy in the same answer.</w:t>
       </w:r>
     </w:p>
     <w:p>
@@ -20789,7 +20789,7 @@
                 <w:sz w:val="20"/>
                 <w:szCs w:val="20"/>
               </w:rPr>
-              <w:t xml:space="preserve">    Cymbal Care (root):  cymbal_policies AND cymbal_faq</w:t>
+              <w:t xml:space="preserve">    cymbal_care (root):  cymbal_policies AND cymbal_faq</w:t>
             </w:r>
           </w:p>
           <w:p>
@@ -20806,7 +20806,7 @@
                 <w:sz w:val="20"/>
                 <w:szCs w:val="20"/>
               </w:rPr>
-              <w:t xml:space="preserve">    Outage Agent:        cymbal_policies</w:t>
+              <w:t xml:space="preserve">    outage_agent:        cymbal_policies</w:t>
             </w:r>
           </w:p>
           <w:p>
@@ -20823,7 +20823,7 @@
                 <w:sz w:val="20"/>
                 <w:szCs w:val="20"/>
               </w:rPr>
-              <w:t xml:space="preserve">    Billing Agent:       cymbal_policies</w:t>
+              <w:t xml:space="preserve">    billing_agent:       cymbal_policies</w:t>
             </w:r>
           </w:p>
           <w:p>
@@ -20961,7 +20961,7 @@
                 <w:sz w:val="20"/>
                 <w:szCs w:val="20"/>
               </w:rPr>
-              <w:t xml:space="preserve">▸ end of Cymbal Care instructions, just before &lt;/taskflow&gt; ▸ Save</w:t>
+              <w:t xml:space="preserve">▸ end of cymbal_care instructions, just before &lt;/taskflow&gt; ▸ Save</w:t>
             </w:r>
           </w:p>
         </w:tc>
@@ -21068,7 +21068,7 @@
                 <w:sz w:val="20"/>
                 <w:szCs w:val="20"/>
               </w:rPr>
-              <w:t xml:space="preserve">▸ Outage Agent instructions, just before &lt;step name="Wrap up"&gt; ▸ Save</w:t>
+              <w:t xml:space="preserve">▸ outage_agent instructions, just before &lt;step name="Wrap up"&gt; ▸ Save</w:t>
             </w:r>
           </w:p>
           <w:p>
@@ -21085,7 +21085,7 @@
                 <w:sz w:val="20"/>
                 <w:szCs w:val="20"/>
               </w:rPr>
-              <w:t xml:space="preserve">▸ Billing Agent instructions, same place ▸ Save</w:t>
+              <w:t xml:space="preserve">▸ billing_agent instructions, same place ▸ Save</w:t>
             </w:r>
           </w:p>
         </w:tc>
@@ -21448,7 +21448,7 @@
                 <w:sz w:val="19"/>
                 <w:szCs w:val="19"/>
               </w:rPr>
-              <w:t xml:space="preserve">check_outage says 76 hours in MSE-2026-04, so yes: eligible, request within 30 days of restoration. Trace: both calls happen inside Outage Agent, with no hand-back to the root.</w:t>
+              <w:t xml:space="preserve">check_outage says 76 hours in MSE-2026-04, so yes: eligible, request within 30 days of restoration. Trace: both calls happen inside outage_agent, with no hand-back to the root.</w:t>
             </w:r>
           </w:p>
         </w:tc>
@@ -21811,7 +21811,7 @@
                 <w:sz w:val="18"/>
                 <w:szCs w:val="18"/>
               </w:rPr>
-              <w:t xml:space="preserve">TYPE in Preview</w:t>
+              <w:t xml:space="preserve">TYPE in Preview ▸ NEW CONVERSATION</w:t>
             </w:r>
           </w:p>
           <w:p>
@@ -21828,7 +21828,7 @@
                 <w:sz w:val="19"/>
                 <w:szCs w:val="19"/>
               </w:rPr>
-              <w:t xml:space="preserve">Do you sell rooftop solar panels?</w:t>
+              <w:t xml:space="preserve">What's your policy related to excess energy generated by solar panels?</w:t>
             </w:r>
           </w:p>
           <w:p>
@@ -21859,7 +21859,7 @@
                 <w:sz w:val="19"/>
                 <w:szCs w:val="19"/>
               </w:rPr>
-              <w:t xml:space="preserve">Not in the content: the agent says it doesn't know and offers a representative (the Not found step).</w:t>
+              <w:t xml:space="preserve">A policy question, so it searches cymbal_policies, but no policy covers net metering: the agent says it doesn't have that policy and offers a representative (the Not found step).</w:t>
             </w:r>
           </w:p>
         </w:tc>
@@ -21949,7 +21949,7 @@
                 <w:sz w:val="20"/>
                 <w:szCs w:val="20"/>
               </w:rPr>
-              <w:t xml:space="preserve">Trace: the data store call returned nothing; point at the grounding setting on the tool (slide 74)</w:t>
+              <w:t xml:space="preserve">Trace: the cymbal_policies call ran but returned nothing relevant; point at the grounding setting on the tool (slide 74)</w:t>
             </w:r>
           </w:p>
         </w:tc>
@@ -21970,6 +21970,36 @@
           <w:szCs w:val="22"/>
         </w:rPr>
         <w:t xml:space="preserve"/>
+      </w:r>
+    </w:p>
+    <w:p>
+      <w:pPr>
+        <w:spacing w:after="80" w:before="40" w:line="264"/>
+      </w:pPr>
+      <w:r>
+        <w:rPr>
+          <w:rFonts w:ascii="Calibri" w:cs="Calibri" w:eastAsia="Calibri" w:hAnsi="Calibri"/>
+          <w:b/>
+          <w:bCs/>
+          <w:i w:val="false"/>
+          <w:iCs w:val="false"/>
+          <w:color w:val="FF5C5C"/>
+          <w:sz w:val="20"/>
+          <w:szCs w:val="20"/>
+        </w:rPr>
+        <w:t xml:space="preserve">GOTCHA  </w:t>
+      </w:r>
+      <w:r>
+        <w:rPr>
+          <w:rFonts w:ascii="Calibri" w:cs="Calibri" w:eastAsia="Calibri" w:hAnsi="Calibri"/>
+          <w:b w:val="false"/>
+          <w:bCs w:val="false"/>
+          <w:i w:val="false"/>
+          <w:iCs w:val="false"/>
+          <w:sz w:val="20"/>
+          <w:szCs w:val="20"/>
+        </w:rPr>
+        <w:t xml:space="preserve">If the answer leans on the generator backfeed warning in the gas safety guide (the only nearby content), that's loss type 2, ungrounded stretch: raise the grounding threshold on the tool (slide 74) and ask again. A reply like "I can only help with Cymbal Energy outages, billing and payment arrangements" with no tool call is the prompt guard answering first: open the trace and point at the guardrail.</w:t>
       </w:r>
     </w:p>
     <w:p>
@@ -23990,7 +24020,7 @@
                 <w:sz w:val="20"/>
                 <w:szCs w:val="20"/>
               </w:rPr>
-              <w:t xml:space="preserve">Billing Agent instructions: find "up to 12 monthly installments" — the bug planted on day 1</w:t>
+              <w:t xml:space="preserve">billing_agent instructions: find "up to 12 monthly installments" — the bug planted on day 1</w:t>
             </w:r>
           </w:p>
         </w:tc>
@@ -24097,7 +24127,7 @@
                 <w:sz w:val="20"/>
                 <w:szCs w:val="20"/>
               </w:rPr>
-              <w:t xml:space="preserve">▸ Billing Agent instructions (replace ALL) ▸ Save</w:t>
+              <w:t xml:space="preserve">▸ billing_agent instructions (replace ALL) ▸ Save</w:t>
             </w:r>
           </w:p>
           <w:p>
@@ -26780,7 +26810,7 @@
                 <w:sz w:val="20"/>
                 <w:szCs w:val="20"/>
               </w:rPr>
-              <w:t xml:space="preserve">Cymbal Care ▸ Add tool ▸ customize_response</w:t>
+              <w:t xml:space="preserve">cymbal_care ▸ Add tool ▸ customize_response</w:t>
             </w:r>
           </w:p>
         </w:tc>
@@ -26887,7 +26917,7 @@
                 <w:sz w:val="20"/>
                 <w:szCs w:val="20"/>
               </w:rPr>
-              <w:t xml:space="preserve">▸ TOP of Cymbal Care instructions ▸ Save</w:t>
+              <w:t xml:space="preserve">▸ TOP of cymbal_care instructions ▸ Save</w:t>
             </w:r>
           </w:p>
         </w:tc>
@@ -31069,7 +31099,7 @@
                 <w:sz w:val="19"/>
                 <w:szCs w:val="19"/>
               </w:rPr>
-              <w:t xml:space="preserve">Cymbal Care (root)</w:t>
+              <w:t xml:space="preserve">cymbal_care (root)</w:t>
             </w:r>
           </w:p>
         </w:tc>
@@ -31210,7 +31240,7 @@
                 <w:sz w:val="19"/>
                 <w:szCs w:val="19"/>
               </w:rPr>
-              <w:t xml:space="preserve">Outage Agent</w:t>
+              <w:t xml:space="preserve">outage_agent</w:t>
             </w:r>
           </w:p>
         </w:tc>
@@ -31351,7 +31381,7 @@
                 <w:sz w:val="19"/>
                 <w:szCs w:val="19"/>
               </w:rPr>
-              <w:t xml:space="preserve">Billing Agent</w:t>
+              <w:t xml:space="preserve">billing_agent</w:t>
             </w:r>
           </w:p>
         </w:tc>
@@ -31808,7 +31838,7 @@
                 <w:sz w:val="19"/>
                 <w:szCs w:val="19"/>
               </w:rPr>
-              <w:t xml:space="preserve">Outage Agent</w:t>
+              <w:t xml:space="preserve">outage_agent</w:t>
             </w:r>
           </w:p>
         </w:tc>
@@ -32627,7 +32657,7 @@
                 <w:sz w:val="19"/>
                 <w:szCs w:val="19"/>
               </w:rPr>
-              <w:t xml:space="preserve">Root + Outage Agent + Billing Agent, global instruction, 8 variables, after-tool callback (outage state + storm-credit flag), 5 Python tools, 3 guardrails</w:t>
+              <w:t xml:space="preserve">cymbal_care (root) + outage_agent + billing_agent, global instruction, 8 variables, after-tool callback (outage state + storm-credit flag), 5 Python tools, 3 guardrails</w:t>
             </w:r>
           </w:p>
         </w:tc>
@@ -33055,7 +33085,7 @@
                 <w:sz w:val="19"/>
                 <w:szCs w:val="19"/>
               </w:rPr>
-              <w:t xml:space="preserve">Billing Agent fixed after the evaluation caught the 12-installment bug</w:t>
+              <w:t xml:space="preserve">billing_agent fixed after the evaluation caught the 12-installment bug</w:t>
             </w:r>
           </w:p>
         </w:tc>

</xml_diff>

<commit_message>
Refine billing evaluation scenarios
Updated the evaluation setup to use app-level yes/no checks for billing-policy regressions, added mock tool expectations for max-6-installments and ineligible-not-approved scenarios, and refreshed the docs/content to match the new scenario flow. This also renames the outage golden and aligns staged evaluation JSONs for M5–M7 with the current policy language.
</commit_message>
<xml_diff>
--- a/docs/PLANNING GUIDE - CX Agent Studio - Cymbal Energy.docx
+++ b/docs/PLANNING GUIDE - CX Agent Studio - Cymbal Energy.docx
@@ -22594,7 +22594,7 @@
                 <w:sz w:val="20"/>
                 <w:szCs w:val="20"/>
               </w:rPr>
-              <w:t xml:space="preserve">Preview ⋮ ▸ Save as golden ▸ golden-outage-renee</w:t>
+              <w:t xml:space="preserve">Preview ⋮ ▸ Save as golden ▸ golden-storm-outage-39567</w:t>
             </w:r>
           </w:p>
         </w:tc>
@@ -23313,7 +23313,7 @@
                 <w:sz w:val="20"/>
                 <w:szCs w:val="20"/>
               </w:rPr>
-              <w:t xml:space="preserve">  User goal: You are Marcus Bell, account 100871, service ZIP 39564. You cannot pay your past-due bill this month. Get a payment arrangement with as many monthly installments as the agent will allow, and find out the monthly amount.</w:t>
+              <w:t xml:space="preserve">  User goal: Must achieve ▸ You are Marcus Bell, account 100871, service ZIP 39564. You cannot pay your past-due bill this month. Get a payment arrangement with as many monthly installments as the agent will allow, and find out the monthly amount.</w:t>
             </w:r>
           </w:p>
           <w:p>
@@ -23330,7 +23330,7 @@
                 <w:sz w:val="20"/>
                 <w:szCs w:val="20"/>
               </w:rPr>
-              <w:t xml:space="preserve">  Expectation 1: Tool call create_payment_arrangement ▸ Must have</w:t>
+              <w:t xml:space="preserve">  + Add expectation ▸ create_payment_arrangement ▸ Expected input: installments 6 ▸ Intercept and mock OFF (the real tool runs)</w:t>
             </w:r>
           </w:p>
           <w:p>
@@ -23347,7 +23347,89 @@
                 <w:sz w:val="20"/>
                 <w:szCs w:val="20"/>
               </w:rPr>
-              <w:t xml:space="preserve">  Expectation 2: Message "the agent offers or agrees to more than 6 monthly installments" ▸ Must not have</w:t>
+              <w:t xml:space="preserve">  Bottom of the left panel ▸ + Add expectations ▸ Create expectation</w:t>
+            </w:r>
+          </w:p>
+          <w:p>
+            <w:pPr>
+              <w:spacing w:after="0" w:before="0" w:line="264"/>
+            </w:pPr>
+            <w:r>
+              <w:rPr>
+                <w:rFonts w:ascii="Calibri" w:cs="Calibri" w:eastAsia="Calibri" w:hAnsi="Calibri"/>
+                <w:b w:val="false"/>
+                <w:bCs w:val="false"/>
+                <w:i w:val="false"/>
+                <w:iCs w:val="false"/>
+                <w:sz w:val="20"/>
+                <w:szCs w:val="20"/>
+              </w:rPr>
+              <w:t xml:space="preserve">      Display name: max-6-installments    Category: Billing policy</w:t>
+            </w:r>
+          </w:p>
+          <w:p>
+            <w:pPr>
+              <w:spacing w:after="0" w:before="0" w:line="264"/>
+            </w:pPr>
+            <w:r>
+              <w:rPr>
+                <w:rFonts w:ascii="Calibri" w:cs="Calibri" w:eastAsia="Calibri" w:hAnsi="Calibri"/>
+                <w:b w:val="false"/>
+                <w:bCs w:val="false"/>
+                <w:i w:val="false"/>
+                <w:iCs w:val="false"/>
+                <w:sz w:val="20"/>
+                <w:szCs w:val="20"/>
+              </w:rPr>
+              <w:t xml:space="preserve">      Expectation: Did the agent keep every payment arrangement it offered or agreed to at 6 monthly installments or fewer?</w:t>
+            </w:r>
+          </w:p>
+          <w:p>
+            <w:pPr>
+              <w:spacing w:after="0" w:before="0" w:line="264"/>
+            </w:pPr>
+            <w:r>
+              <w:rPr>
+                <w:rFonts w:ascii="Calibri" w:cs="Calibri" w:eastAsia="Calibri" w:hAnsi="Calibri"/>
+                <w:b w:val="false"/>
+                <w:bCs w:val="false"/>
+                <w:i w:val="false"/>
+                <w:iCs w:val="false"/>
+                <w:sz w:val="20"/>
+                <w:szCs w:val="20"/>
+              </w:rPr>
+              <w:t xml:space="preserve">  ▸ Create ▸ tick it ▸ Create (the scenario)</w:t>
+            </w:r>
+          </w:p>
+          <w:p>
+            <w:pPr>
+              <w:spacing w:after="0" w:before="60" w:line="264"/>
+            </w:pPr>
+            <w:r>
+              <w:rPr>
+                <w:rFonts w:ascii="Calibri" w:cs="Calibri" w:eastAsia="Calibri" w:hAnsi="Calibri"/>
+                <w:b/>
+                <w:bCs/>
+                <w:i w:val="false"/>
+                <w:iCs w:val="false"/>
+                <w:color w:val="2ECC71"/>
+                <w:sz w:val="19"/>
+                <w:szCs w:val="19"/>
+              </w:rPr>
+              <w:t xml:space="preserve">→ </w:t>
+            </w:r>
+            <w:r>
+              <w:rPr>
+                <w:rFonts w:ascii="Calibri" w:cs="Calibri" w:eastAsia="Calibri" w:hAnsi="Calibri"/>
+                <w:b w:val="false"/>
+                <w:bCs w:val="false"/>
+                <w:i w:val="false"/>
+                <w:iCs w:val="false"/>
+                <w:color w:val="9AA4B2"/>
+                <w:sz w:val="19"/>
+                <w:szCs w:val="19"/>
+              </w:rPr>
+              <w:t xml:space="preserve">No must-not switch: a yes/no question is the "must NOT" (passes only on Yes). The tool expectation fails if the call isn't 6; the question fails if the agent even offers 12.</w:t>
             </w:r>
           </w:p>
         </w:tc>
@@ -23454,7 +23536,7 @@
                 <w:sz w:val="20"/>
                 <w:szCs w:val="20"/>
               </w:rPr>
-              <w:t xml:space="preserve">  User goal: You are Linh Nguyen, account 100455, service ZIP 39563. Ask to split your bill into 3 payments.</w:t>
+              <w:t xml:space="preserve">  User goal: change Must achieve to the rejected option (Linh should NOT get an arrangement) ▸ You are Linh Nguyen, account 100455, service ZIP 39563. Ask to split your bill into 3 payments.</w:t>
             </w:r>
           </w:p>
           <w:p>
@@ -23471,7 +23553,7 @@
                 <w:sz w:val="20"/>
                 <w:szCs w:val="20"/>
               </w:rPr>
-              <w:t xml:space="preserve">  Expectation 1: Message "the agent explains that the account is not eligible for a payment arrangement" ▸ Must have</w:t>
+              <w:t xml:space="preserve">  + Add expectation ▸ create_payment_arrangement ▸ Expected input: installments 3 ▸ Intercept and mock OFF (eligibility comes from the tool, not the agent)</w:t>
             </w:r>
           </w:p>
           <w:p>
@@ -23488,7 +23570,89 @@
                 <w:sz w:val="20"/>
                 <w:szCs w:val="20"/>
               </w:rPr>
-              <w:t xml:space="preserve">  Expectation 2: Message "the agent says an arrangement was approved or set up" ▸ Must not have</w:t>
+              <w:t xml:space="preserve">  + Add expectations ▸ Create expectation</w:t>
+            </w:r>
+          </w:p>
+          <w:p>
+            <w:pPr>
+              <w:spacing w:after="0" w:before="0" w:line="264"/>
+            </w:pPr>
+            <w:r>
+              <w:rPr>
+                <w:rFonts w:ascii="Calibri" w:cs="Calibri" w:eastAsia="Calibri" w:hAnsi="Calibri"/>
+                <w:b w:val="false"/>
+                <w:bCs w:val="false"/>
+                <w:i w:val="false"/>
+                <w:iCs w:val="false"/>
+                <w:sz w:val="20"/>
+                <w:szCs w:val="20"/>
+              </w:rPr>
+              <w:t xml:space="preserve">      Display name: ineligible-not-approved    Category: Billing policy</w:t>
+            </w:r>
+          </w:p>
+          <w:p>
+            <w:pPr>
+              <w:spacing w:after="0" w:before="0" w:line="264"/>
+            </w:pPr>
+            <w:r>
+              <w:rPr>
+                <w:rFonts w:ascii="Calibri" w:cs="Calibri" w:eastAsia="Calibri" w:hAnsi="Calibri"/>
+                <w:b w:val="false"/>
+                <w:bCs w:val="false"/>
+                <w:i w:val="false"/>
+                <w:iCs w:val="false"/>
+                <w:sz w:val="20"/>
+                <w:szCs w:val="20"/>
+              </w:rPr>
+              <w:t xml:space="preserve">      Expectation: Did the agent tell the customer the account is not eligible for a payment arrangement, without saying an arrangement was approved or set up?</w:t>
+            </w:r>
+          </w:p>
+          <w:p>
+            <w:pPr>
+              <w:spacing w:after="0" w:before="0" w:line="264"/>
+            </w:pPr>
+            <w:r>
+              <w:rPr>
+                <w:rFonts w:ascii="Calibri" w:cs="Calibri" w:eastAsia="Calibri" w:hAnsi="Calibri"/>
+                <w:b w:val="false"/>
+                <w:bCs w:val="false"/>
+                <w:i w:val="false"/>
+                <w:iCs w:val="false"/>
+                <w:sz w:val="20"/>
+                <w:szCs w:val="20"/>
+              </w:rPr>
+              <w:t xml:space="preserve">  ▸ Create ▸ tick it ▸ Create (the scenario)</w:t>
+            </w:r>
+          </w:p>
+          <w:p>
+            <w:pPr>
+              <w:spacing w:after="0" w:before="60" w:line="264"/>
+            </w:pPr>
+            <w:r>
+              <w:rPr>
+                <w:rFonts w:ascii="Calibri" w:cs="Calibri" w:eastAsia="Calibri" w:hAnsi="Calibri"/>
+                <w:b/>
+                <w:bCs/>
+                <w:i w:val="false"/>
+                <w:iCs w:val="false"/>
+                <w:color w:val="2ECC71"/>
+                <w:sz w:val="19"/>
+                <w:szCs w:val="19"/>
+              </w:rPr>
+              <w:t xml:space="preserve">→ </w:t>
+            </w:r>
+            <w:r>
+              <w:rPr>
+                <w:rFonts w:ascii="Calibri" w:cs="Calibri" w:eastAsia="Calibri" w:hAnsi="Calibri"/>
+                <w:b w:val="false"/>
+                <w:bCs w:val="false"/>
+                <w:i w:val="false"/>
+                <w:iCs w:val="false"/>
+                <w:color w:val="9AA4B2"/>
+                <w:sz w:val="19"/>
+                <w:szCs w:val="19"/>
+              </w:rPr>
+              <w:t xml:space="preserve">The "rejected" goal is how a scenario says this customer should be turned down: the test passes when she is. Both yes/no expectations are saved to the app: next time, pick them from Add expectations.</w:t>
             </w:r>
           </w:p>
         </w:tc>
@@ -23930,7 +24094,7 @@
                 <w:sz w:val="20"/>
                 <w:szCs w:val="20"/>
               </w:rPr>
-              <w:t xml:space="preserve">Results: Marcus scenario fails "more than 6 installments" in some runs ▸ open a failing transcript ▸ the agent offered 12, the tool refused</w:t>
+              <w:t xml:space="preserve">Results: Marcus scenario fails in some runs ▸ open a failing transcript ▸ the agent offered up to 12 (max-6-installments: No), Marcus asked for 12, the tool refused (expected input was 6)</w:t>
             </w:r>
           </w:p>
         </w:tc>
@@ -24369,7 +24533,7 @@
                 <w:sz w:val="19"/>
                 <w:szCs w:val="19"/>
               </w:rPr>
-              <w:t xml:space="preserve">Task completion up; the "more than 6" expectation passes.</w:t>
+              <w:t xml:space="preserve">Task completion up; the call now carries 6 installments and max-6-installments answers Yes.</w:t>
             </w:r>
           </w:p>
         </w:tc>

</xml_diff>

<commit_message>
Ground payment plans in tool output
Updated payment-arrangement behavior across build/stage artifacts so the tool now returns an explicit `fees_and_interest` field and agent instructions require always calling the tool for eligibility decisions. The billing prompt now limits responses to tool-returned terms (with no fees/interest) and escalates out-of-scope questions instead of guessing. Also normalized evaluation scenario names from snake_case to kebab-case (including file paths/display names) and refreshed evaluation/teleprompter setup steps to match the current UI flow.
</commit_message>
<xml_diff>
--- a/docs/PLANNING GUIDE - CX Agent Studio - Cymbal Energy.docx
+++ b/docs/PLANNING GUIDE - CX Agent Studio - Cymbal Energy.docx
@@ -23398,7 +23398,7 @@
                 <w:sz w:val="20"/>
                 <w:szCs w:val="20"/>
               </w:rPr>
-              <w:t xml:space="preserve">  ▸ Create ▸ tick it ▸ Create (the scenario)</w:t>
+              <w:t xml:space="preserve">  ▸ Create ▸ tick it ▸ Add ▸ Create (the scenario)</w:t>
             </w:r>
           </w:p>
           <w:p>
@@ -23621,7 +23621,7 @@
                 <w:sz w:val="20"/>
                 <w:szCs w:val="20"/>
               </w:rPr>
-              <w:t xml:space="preserve">  ▸ Create ▸ tick it ▸ Create (the scenario)</w:t>
+              <w:t xml:space="preserve">  ▸ Create ▸ tick it ▸ Add ▸ Create (the scenario)</w:t>
             </w:r>
           </w:p>
           <w:p>
@@ -24583,7 +24583,7 @@
           <w:sz w:val="20"/>
           <w:szCs w:val="20"/>
         </w:rPr>
-        <w:t xml:space="preserve">LLM runs vary. If the first run happened to pass, open a transcript anyway: the 12 is in the instructions and the fix is the same. Say it: that's why we run 5 times.</w:t>
+        <w:t xml:space="preserve">LLM runs vary. If the first run happened to pass, open a transcript anyway: the 12 is in the instructions and the fix is the same. Say it: that's why we run 5 times. A failure marked as a hallucination (the frustrated persona asks about fees and the agent invents an answer) is a second, real catch: the fix is grounding, not prompting. The tool returns fees_and_interest and billing_agent_FIXED.txt says to state only the terms the tool returned.</w:t>
       </w:r>
     </w:p>
     <w:p>

</xml_diff>

<commit_message>
Fix payment-arrangement grounding and eval docs
The billing agent now avoids re-asking for verification when already authenticated, and payment-arrangement responses are grounded in tool output plus BP-210 policy. This updates the tool schema and evaluation expectations, removes the rejected Linh scenario, and refreshes the demo docs/text to reflect the grounded 2–6 installment guidance.
</commit_message>
<xml_diff>
--- a/docs/PLANNING GUIDE - CX Agent Studio - Cymbal Energy.docx
+++ b/docs/PLANNING GUIDE - CX Agent Studio - Cymbal Energy.docx
@@ -1317,7 +1317,7 @@
                 <w:sz w:val="19"/>
                 <w:szCs w:val="19"/>
               </w:rPr>
-              <w:t xml:space="preserve">Two goldens, a frustrated persona, two scenarios; the eval catches the 12-installment bug; fix and re-run</w:t>
+              <w:t xml:space="preserve">Two goldens, a frustrated persona, a scenario; the eval catches the 12-installment bug; fix and re-run</w:t>
             </w:r>
           </w:p>
         </w:tc>
@@ -5420,7 +5420,7 @@
                 <w:sz w:val="19"/>
                 <w:szCs w:val="19"/>
               </w:rPr>
-              <w:t xml:space="preserve">A frustrated persona, two scenarios, and start the run</w:t>
+              <w:t xml:space="preserve">A frustrated persona, a scenario, and start the run</w:t>
             </w:r>
           </w:p>
         </w:tc>
@@ -22904,7 +22904,7 @@
           <w:sz w:val="22"/>
           <w:szCs w:val="22"/>
         </w:rPr>
-        <w:t xml:space="preserve">19. A frustrated persona, two scenarios, and start the run   ·   M5 · SLIDES 25–27   ·   ~8 min</w:t>
+        <w:t xml:space="preserve">19. A frustrated persona, a scenario, and start the run   ·   M5 · SLIDES 25–27   ·   ~8 min</w:t>
       </w:r>
     </w:p>
     <w:p>
@@ -23519,109 +23519,7 @@
                 <w:sz w:val="20"/>
                 <w:szCs w:val="20"/>
               </w:rPr>
-              <w:t xml:space="preserve">+ Add test case ▸ Scenario ▸ Create from scratch ▸ name: arrangement-linh-not-eligible</w:t>
-            </w:r>
-          </w:p>
-          <w:p>
-            <w:pPr>
-              <w:spacing w:after="0" w:before="0" w:line="264"/>
-            </w:pPr>
-            <w:r>
-              <w:rPr>
-                <w:rFonts w:ascii="Calibri" w:cs="Calibri" w:eastAsia="Calibri" w:hAnsi="Calibri"/>
-                <w:b w:val="false"/>
-                <w:bCs w:val="false"/>
-                <w:i w:val="false"/>
-                <w:iCs w:val="false"/>
-                <w:sz w:val="20"/>
-                <w:szCs w:val="20"/>
-              </w:rPr>
-              <w:t xml:space="preserve">  User goal: change Must achieve to the rejected option (Linh should NOT get an arrangement) ▸ You are Linh Nguyen, account 100455, service ZIP 39563. Ask to split your bill into 3 payments.</w:t>
-            </w:r>
-          </w:p>
-          <w:p>
-            <w:pPr>
-              <w:spacing w:after="0" w:before="0" w:line="264"/>
-            </w:pPr>
-            <w:r>
-              <w:rPr>
-                <w:rFonts w:ascii="Calibri" w:cs="Calibri" w:eastAsia="Calibri" w:hAnsi="Calibri"/>
-                <w:b w:val="false"/>
-                <w:bCs w:val="false"/>
-                <w:i w:val="false"/>
-                <w:iCs w:val="false"/>
-                <w:sz w:val="20"/>
-                <w:szCs w:val="20"/>
-              </w:rPr>
-              <w:t xml:space="preserve">  + Add expectation ▸ create_payment_arrangement ▸ Expected input: installments 3 ▸ Intercept and mock OFF (eligibility comes from the tool, not the agent)</w:t>
-            </w:r>
-          </w:p>
-          <w:p>
-            <w:pPr>
-              <w:spacing w:after="0" w:before="0" w:line="264"/>
-            </w:pPr>
-            <w:r>
-              <w:rPr>
-                <w:rFonts w:ascii="Calibri" w:cs="Calibri" w:eastAsia="Calibri" w:hAnsi="Calibri"/>
-                <w:b w:val="false"/>
-                <w:bCs w:val="false"/>
-                <w:i w:val="false"/>
-                <w:iCs w:val="false"/>
-                <w:sz w:val="20"/>
-                <w:szCs w:val="20"/>
-              </w:rPr>
-              <w:t xml:space="preserve">  + Add expectations ▸ Create expectation</w:t>
-            </w:r>
-          </w:p>
-          <w:p>
-            <w:pPr>
-              <w:spacing w:after="0" w:before="0" w:line="264"/>
-            </w:pPr>
-            <w:r>
-              <w:rPr>
-                <w:rFonts w:ascii="Calibri" w:cs="Calibri" w:eastAsia="Calibri" w:hAnsi="Calibri"/>
-                <w:b w:val="false"/>
-                <w:bCs w:val="false"/>
-                <w:i w:val="false"/>
-                <w:iCs w:val="false"/>
-                <w:sz w:val="20"/>
-                <w:szCs w:val="20"/>
-              </w:rPr>
-              <w:t xml:space="preserve">      Display name: ineligible-not-approved    Category: Billing policy</w:t>
-            </w:r>
-          </w:p>
-          <w:p>
-            <w:pPr>
-              <w:spacing w:after="0" w:before="0" w:line="264"/>
-            </w:pPr>
-            <w:r>
-              <w:rPr>
-                <w:rFonts w:ascii="Calibri" w:cs="Calibri" w:eastAsia="Calibri" w:hAnsi="Calibri"/>
-                <w:b w:val="false"/>
-                <w:bCs w:val="false"/>
-                <w:i w:val="false"/>
-                <w:iCs w:val="false"/>
-                <w:sz w:val="20"/>
-                <w:szCs w:val="20"/>
-              </w:rPr>
-              <w:t xml:space="preserve">      Expectation: Did the agent tell the customer the account is not eligible for a payment arrangement, without saying an arrangement was approved or set up?</w:t>
-            </w:r>
-          </w:p>
-          <w:p>
-            <w:pPr>
-              <w:spacing w:after="0" w:before="0" w:line="264"/>
-            </w:pPr>
-            <w:r>
-              <w:rPr>
-                <w:rFonts w:ascii="Calibri" w:cs="Calibri" w:eastAsia="Calibri" w:hAnsi="Calibri"/>
-                <w:b w:val="false"/>
-                <w:bCs w:val="false"/>
-                <w:i w:val="false"/>
-                <w:iCs w:val="false"/>
-                <w:sz w:val="20"/>
-                <w:szCs w:val="20"/>
-              </w:rPr>
-              <w:t xml:space="preserve">  ▸ Create ▸ tick it ▸ Add ▸ Create (the scenario)</w:t>
+              <w:t xml:space="preserve">Select all ▸ Run selected ▸ current draft ▸ runs: 5 ▸ persona: Frustrated after the storm ▸ tick Find issues with AI if offered</w:t>
             </w:r>
           </w:p>
           <w:p>
@@ -23652,7 +23550,7 @@
                 <w:sz w:val="19"/>
                 <w:szCs w:val="19"/>
               </w:rPr>
-              <w:t xml:space="preserve">The "rejected" goal is how a scenario says this customer should be turned down: the test passes when she is. Both yes/no expectations are saved to the app: next time, pick them from Add expectations.</w:t>
+              <w:t xml:space="preserve">Leave it running; results on slide 31.</w:t>
             </w:r>
           </w:p>
         </w:tc>
@@ -23673,6 +23571,176 @@
           <w:szCs w:val="22"/>
         </w:rPr>
         <w:t xml:space="preserve"/>
+      </w:r>
+    </w:p>
+    <w:p>
+      <w:pPr>
+        <w:spacing w:after="80" w:before="40" w:line="264"/>
+      </w:pPr>
+      <w:r>
+        <w:rPr>
+          <w:rFonts w:ascii="Calibri" w:cs="Calibri" w:eastAsia="Calibri" w:hAnsi="Calibri"/>
+          <w:b/>
+          <w:bCs/>
+          <w:i w:val="false"/>
+          <w:iCs w:val="false"/>
+          <w:color w:val="FF5C5C"/>
+          <w:sz w:val="20"/>
+          <w:szCs w:val="20"/>
+        </w:rPr>
+        <w:t xml:space="preserve">GOTCHA  </w:t>
+      </w:r>
+      <w:r>
+        <w:rPr>
+          <w:rFonts w:ascii="Calibri" w:cs="Calibri" w:eastAsia="Calibri" w:hAnsi="Calibri"/>
+          <w:b w:val="false"/>
+          <w:bCs w:val="false"/>
+          <w:i w:val="false"/>
+          <w:iCs w:val="false"/>
+          <w:sz w:val="20"/>
+          <w:szCs w:val="20"/>
+        </w:rPr>
+        <w:t xml:space="preserve">If the persona can't be chosen at run time, it's an app-level setting: skip it; the goal text already carries the frustration.</w:t>
+      </w:r>
+    </w:p>
+    <w:p>
+      <w:pPr>
+        <w:pStyle w:val="Heading3"/>
+        <w:keepNext/>
+        <w:spacing w:after="40" w:before="160"/>
+      </w:pPr>
+      <w:r>
+        <w:rPr>
+          <w:rFonts w:ascii="Calibri" w:cs="Calibri" w:eastAsia="Calibri" w:hAnsi="Calibri"/>
+          <w:b/>
+          <w:bCs/>
+          <w:i w:val="false"/>
+          <w:iCs w:val="false"/>
+          <w:color w:val="3D8BFF"/>
+          <w:sz w:val="22"/>
+          <w:szCs w:val="22"/>
+        </w:rPr>
+        <w:t xml:space="preserve">20. Read the failure, fix it, run again (quality hill climbing)   ·   M5 · SLIDE 31   ·   ~10 min</w:t>
+      </w:r>
+    </w:p>
+    <w:p>
+      <w:pPr>
+        <w:spacing w:after="80" w:before="40" w:line="264"/>
+      </w:pPr>
+      <w:r>
+        <w:rPr>
+          <w:rFonts w:ascii="Calibri" w:cs="Calibri" w:eastAsia="Calibri" w:hAnsi="Calibri"/>
+          <w:b/>
+          <w:bCs/>
+          <w:i w:val="false"/>
+          <w:iCs w:val="false"/>
+          <w:color w:val="2ECC71"/>
+          <w:sz w:val="20"/>
+          <w:szCs w:val="20"/>
+        </w:rPr>
+        <w:t xml:space="preserve">WHY  </w:t>
+      </w:r>
+      <w:r>
+        <w:rPr>
+          <w:rFonts w:ascii="Calibri" w:cs="Calibri" w:eastAsia="Calibri" w:hAnsi="Calibri"/>
+          <w:b w:val="false"/>
+          <w:bCs w:val="false"/>
+          <w:i w:val="false"/>
+          <w:iCs w:val="false"/>
+          <w:sz w:val="22"/>
+          <w:szCs w:val="22"/>
+        </w:rPr>
+        <w:t xml:space="preserve">Instructions drifted from the business rule that lives in code. A human reviewer missed it yesterday; the evaluation caught it. Fix, re-run, compare: that's the hill climb. It is also how hill climbing really goes: when this demo was built, fixing the 12 exposed four more failures, all from the frustrated persona's follow-up questions (fees, the payment schedule, "will this stop a disconnection?", "will my service stay on?"). Each was the agent helpfully stating a fact it didn't have, and each was fixed by putting the fact where the agent could ground on it: the tool's result (schedule and BP-210 terms) and the policy, not by prompting harder. Those fixes are already in the pack, so the class sees the first climb; tell the rest as the story.</w:t>
+      </w:r>
+    </w:p>
+    <w:p>
+      <w:pPr>
+        <w:spacing w:after="80" w:before="40" w:line="264"/>
+      </w:pPr>
+      <w:r>
+        <w:rPr>
+          <w:rFonts w:ascii="Calibri" w:cs="Calibri" w:eastAsia="Calibri" w:hAnsi="Calibri"/>
+          <w:b/>
+          <w:bCs/>
+          <w:i w:val="false"/>
+          <w:iCs w:val="false"/>
+          <w:color w:val="2BB3B1"/>
+          <w:sz w:val="20"/>
+          <w:szCs w:val="20"/>
+        </w:rPr>
+        <w:t xml:space="preserve">SAY  </w:t>
+      </w:r>
+      <w:r>
+        <w:rPr>
+          <w:rFonts w:ascii="Calibri" w:cs="Calibri" w:eastAsia="Calibri" w:hAnsi="Calibri"/>
+          <w:b w:val="false"/>
+          <w:bCs w:val="false"/>
+          <w:i/>
+          <w:iCs/>
+          <w:sz w:val="22"/>
+          <w:szCs w:val="22"/>
+        </w:rPr>
+        <w:t xml:space="preserve">That line has been in the agent since yesterday morning. Nobody caught it. The eval did, on the first run, with a simulated customer.</w:t>
+      </w:r>
+    </w:p>
+    <w:p>
+      <w:pPr>
+        <w:spacing w:after="80" w:before="40" w:line="264"/>
+      </w:pPr>
+      <w:r>
+        <w:rPr>
+          <w:rFonts w:ascii="Calibri" w:cs="Calibri" w:eastAsia="Calibri" w:hAnsi="Calibri"/>
+          <w:b/>
+          <w:bCs/>
+          <w:i w:val="false"/>
+          <w:iCs w:val="false"/>
+          <w:color w:val="2BB3B1"/>
+          <w:sz w:val="20"/>
+          <w:szCs w:val="20"/>
+        </w:rPr>
+        <w:t xml:space="preserve">SAY  </w:t>
+      </w:r>
+      <w:r>
+        <w:rPr>
+          <w:rFonts w:ascii="Calibri" w:cs="Calibri" w:eastAsia="Calibri" w:hAnsi="Calibri"/>
+          <w:b w:val="false"/>
+          <w:bCs w:val="false"/>
+          <w:i/>
+          <w:iCs/>
+          <w:sz w:val="22"/>
+          <w:szCs w:val="22"/>
+        </w:rPr>
+        <w:t xml:space="preserve">When I built this, fixing the 12 wasn't the end. The frustrated customer kept asking follow-ups: are there fees, will my service stay on? Every time, the agent made up a reassuring answer and the hallucination check caught it. The fix was never a stronger prompt. It was giving the agent the fact, in the tool's result or the policy.</w:t>
+      </w:r>
+    </w:p>
+    <w:p>
+      <w:pPr>
+        <w:spacing w:after="80" w:before="40" w:line="264"/>
+      </w:pPr>
+      <w:r>
+        <w:rPr>
+          <w:rFonts w:ascii="Calibri" w:cs="Calibri" w:eastAsia="Calibri" w:hAnsi="Calibri"/>
+          <w:b/>
+          <w:bCs/>
+          <w:i w:val="false"/>
+          <w:iCs w:val="false"/>
+          <w:color w:val="2BB3B1"/>
+          <w:sz w:val="20"/>
+          <w:szCs w:val="20"/>
+        </w:rPr>
+        <w:t xml:space="preserve">SAY  </w:t>
+      </w:r>
+      <w:r>
+        <w:rPr>
+          <w:rFonts w:ascii="Calibri" w:cs="Calibri" w:eastAsia="Calibri" w:hAnsi="Calibri"/>
+          <w:b w:val="false"/>
+          <w:bCs w:val="false"/>
+          <w:i/>
+          <w:iCs/>
+          <w:sz w:val="22"/>
+          <w:szCs w:val="22"/>
+        </w:rPr>
+        <w:t xml:space="preserve">And sometimes the judge is the one that's wrong. Read its reasoning before you change the agent.</w:t>
       </w:r>
     </w:p>
     <w:tbl>
@@ -23725,55 +23793,24 @@
                 <w:sz w:val="18"/>
                 <w:szCs w:val="18"/>
               </w:rPr>
-              <w:t xml:space="preserve">DO</w:t>
-            </w:r>
-          </w:p>
-          <w:p>
-            <w:pPr>
-              <w:spacing w:after="0" w:before="0" w:line="264"/>
-            </w:pPr>
-            <w:r>
-              <w:rPr>
-                <w:rFonts w:ascii="Calibri" w:cs="Calibri" w:eastAsia="Calibri" w:hAnsi="Calibri"/>
-                <w:b w:val="false"/>
-                <w:bCs w:val="false"/>
-                <w:i w:val="false"/>
-                <w:iCs w:val="false"/>
-                <w:sz w:val="20"/>
-                <w:szCs w:val="20"/>
-              </w:rPr>
-              <w:t xml:space="preserve">Select all ▸ Run selected ▸ current draft ▸ runs: 5 ▸ persona: Frustrated after the storm ▸ tick Find issues with AI if offered</w:t>
-            </w:r>
-          </w:p>
-          <w:p>
-            <w:pPr>
-              <w:spacing w:after="0" w:before="60" w:line="264"/>
-            </w:pPr>
-            <w:r>
-              <w:rPr>
-                <w:rFonts w:ascii="Calibri" w:cs="Calibri" w:eastAsia="Calibri" w:hAnsi="Calibri"/>
-                <w:b/>
-                <w:bCs/>
-                <w:i w:val="false"/>
-                <w:iCs w:val="false"/>
-                <w:color w:val="2ECC71"/>
-                <w:sz w:val="19"/>
-                <w:szCs w:val="19"/>
-              </w:rPr>
-              <w:t xml:space="preserve">→ </w:t>
-            </w:r>
-            <w:r>
-              <w:rPr>
-                <w:rFonts w:ascii="Calibri" w:cs="Calibri" w:eastAsia="Calibri" w:hAnsi="Calibri"/>
-                <w:b w:val="false"/>
-                <w:bCs w:val="false"/>
-                <w:i w:val="false"/>
-                <w:iCs w:val="false"/>
-                <w:color w:val="9AA4B2"/>
-                <w:sz w:val="19"/>
-                <w:szCs w:val="19"/>
-              </w:rPr>
-              <w:t xml:space="preserve">Leave it running; results on slide 31.</w:t>
+              <w:t xml:space="preserve">RESET TO START STATE</w:t>
+            </w:r>
+          </w:p>
+          <w:p>
+            <w:pPr>
+              <w:spacing w:after="20" w:before="0" w:line="264"/>
+            </w:pPr>
+            <w:r>
+              <w:rPr>
+                <w:rFonts w:ascii="Calibri" w:cs="Calibri" w:eastAsia="Calibri" w:hAnsi="Calibri"/>
+                <w:b w:val="false"/>
+                <w:bCs w:val="false"/>
+                <w:i w:val="false"/>
+                <w:iCs w:val="false"/>
+                <w:sz w:val="21"/>
+                <w:szCs w:val="21"/>
+              </w:rPr>
+              <w:t xml:space="preserve">Runs from block 19 finished</w:t>
             </w:r>
           </w:p>
         </w:tc>
@@ -23781,7 +23818,7 @@
     </w:tbl>
     <w:p>
       <w:pPr>
-        <w:spacing w:after="20" w:before="0" w:line="264"/>
+        <w:spacing w:after="60" w:before="0" w:line="264"/>
       </w:pPr>
       <w:r>
         <w:rPr>
@@ -23807,11 +23844,11 @@
           <w:bCs/>
           <w:i w:val="false"/>
           <w:iCs w:val="false"/>
-          <w:color w:val="FF5C5C"/>
+          <w:color w:val="B07CFF"/>
           <w:sz w:val="20"/>
           <w:szCs w:val="20"/>
         </w:rPr>
-        <w:t xml:space="preserve">GOTCHA  </w:t>
+        <w:t xml:space="preserve">FILES  </w:t>
       </w:r>
       <w:r>
         <w:rPr>
@@ -23820,90 +23857,11 @@
           <w:bCs w:val="false"/>
           <w:i w:val="false"/>
           <w:iCs w:val="false"/>
+          <w:color w:val="B07CFF"/>
           <w:sz w:val="20"/>
           <w:szCs w:val="20"/>
         </w:rPr>
-        <w:t xml:space="preserve">If the persona can't be chosen at run time, it's an app-level setting: skip it; the goal text already carries the frustration.</w:t>
-      </w:r>
-    </w:p>
-    <w:p>
-      <w:pPr>
-        <w:pStyle w:val="Heading3"/>
-        <w:keepNext/>
-        <w:spacing w:after="40" w:before="160"/>
-      </w:pPr>
-      <w:r>
-        <w:rPr>
-          <w:rFonts w:ascii="Calibri" w:cs="Calibri" w:eastAsia="Calibri" w:hAnsi="Calibri"/>
-          <w:b/>
-          <w:bCs/>
-          <w:i w:val="false"/>
-          <w:iCs w:val="false"/>
-          <w:color w:val="3D8BFF"/>
-          <w:sz w:val="22"/>
-          <w:szCs w:val="22"/>
-        </w:rPr>
-        <w:t xml:space="preserve">20. Read the failure, fix it, run again (quality hill climbing)   ·   M5 · SLIDE 31   ·   ~10 min</w:t>
-      </w:r>
-    </w:p>
-    <w:p>
-      <w:pPr>
-        <w:spacing w:after="80" w:before="40" w:line="264"/>
-      </w:pPr>
-      <w:r>
-        <w:rPr>
-          <w:rFonts w:ascii="Calibri" w:cs="Calibri" w:eastAsia="Calibri" w:hAnsi="Calibri"/>
-          <w:b/>
-          <w:bCs/>
-          <w:i w:val="false"/>
-          <w:iCs w:val="false"/>
-          <w:color w:val="2ECC71"/>
-          <w:sz w:val="20"/>
-          <w:szCs w:val="20"/>
-        </w:rPr>
-        <w:t xml:space="preserve">WHY  </w:t>
-      </w:r>
-      <w:r>
-        <w:rPr>
-          <w:rFonts w:ascii="Calibri" w:cs="Calibri" w:eastAsia="Calibri" w:hAnsi="Calibri"/>
-          <w:b w:val="false"/>
-          <w:bCs w:val="false"/>
-          <w:i w:val="false"/>
-          <w:iCs w:val="false"/>
-          <w:sz w:val="22"/>
-          <w:szCs w:val="22"/>
-        </w:rPr>
-        <w:t xml:space="preserve">Instructions drifted from the business rule that lives in code. A human reviewer missed it yesterday; the evaluation caught it. Fix, re-run, compare: that's the hill climb.</w:t>
-      </w:r>
-    </w:p>
-    <w:p>
-      <w:pPr>
-        <w:spacing w:after="80" w:before="40" w:line="264"/>
-      </w:pPr>
-      <w:r>
-        <w:rPr>
-          <w:rFonts w:ascii="Calibri" w:cs="Calibri" w:eastAsia="Calibri" w:hAnsi="Calibri"/>
-          <w:b/>
-          <w:bCs/>
-          <w:i w:val="false"/>
-          <w:iCs w:val="false"/>
-          <w:color w:val="2BB3B1"/>
-          <w:sz w:val="20"/>
-          <w:szCs w:val="20"/>
-        </w:rPr>
-        <w:t xml:space="preserve">SAY  </w:t>
-      </w:r>
-      <w:r>
-        <w:rPr>
-          <w:rFonts w:ascii="Calibri" w:cs="Calibri" w:eastAsia="Calibri" w:hAnsi="Calibri"/>
-          <w:b w:val="false"/>
-          <w:bCs w:val="false"/>
-          <w:i/>
-          <w:iCs/>
-          <w:sz w:val="22"/>
-          <w:szCs w:val="22"/>
-        </w:rPr>
-        <w:t xml:space="preserve">That line has been in the agent since yesterday morning. Nobody caught it. The eval did, on the first run, with a simulated customer.</w:t>
+        <w:t xml:space="preserve">05-evaluate/billing_agent_FIXED.txt</w:t>
       </w:r>
     </w:p>
     <w:tbl>
@@ -23956,24 +23914,24 @@
                 <w:sz w:val="18"/>
                 <w:szCs w:val="18"/>
               </w:rPr>
-              <w:t xml:space="preserve">RESET TO START STATE</w:t>
-            </w:r>
-          </w:p>
-          <w:p>
-            <w:pPr>
-              <w:spacing w:after="20" w:before="0" w:line="264"/>
-            </w:pPr>
-            <w:r>
-              <w:rPr>
-                <w:rFonts w:ascii="Calibri" w:cs="Calibri" w:eastAsia="Calibri" w:hAnsi="Calibri"/>
-                <w:b w:val="false"/>
-                <w:bCs w:val="false"/>
-                <w:i w:val="false"/>
-                <w:iCs w:val="false"/>
-                <w:sz w:val="21"/>
-                <w:szCs w:val="21"/>
-              </w:rPr>
-              <w:t xml:space="preserve">Runs from block 19 finished</w:t>
+              <w:t xml:space="preserve">DO</w:t>
+            </w:r>
+          </w:p>
+          <w:p>
+            <w:pPr>
+              <w:spacing w:after="0" w:before="0" w:line="264"/>
+            </w:pPr>
+            <w:r>
+              <w:rPr>
+                <w:rFonts w:ascii="Calibri" w:cs="Calibri" w:eastAsia="Calibri" w:hAnsi="Calibri"/>
+                <w:b w:val="false"/>
+                <w:bCs w:val="false"/>
+                <w:i w:val="false"/>
+                <w:iCs w:val="false"/>
+                <w:sz w:val="20"/>
+                <w:szCs w:val="20"/>
+              </w:rPr>
+              <w:t xml:space="preserve">Results: Marcus scenario fails in some runs ▸ open a failing transcript ▸ the agent offered up to 12 (max-6-installments: No), Marcus asked for 12, the tool refused (expected input was 6)</w:t>
             </w:r>
           </w:p>
         </w:tc>
@@ -23981,7 +23939,7 @@
     </w:tbl>
     <w:p>
       <w:pPr>
-        <w:spacing w:after="60" w:before="0" w:line="264"/>
+        <w:spacing w:after="20" w:before="0" w:line="264"/>
       </w:pPr>
       <w:r>
         <w:rPr>
@@ -23994,37 +23952,6 @@
           <w:szCs w:val="22"/>
         </w:rPr>
         <w:t xml:space="preserve"/>
-      </w:r>
-    </w:p>
-    <w:p>
-      <w:pPr>
-        <w:spacing w:after="80" w:before="40" w:line="264"/>
-      </w:pPr>
-      <w:r>
-        <w:rPr>
-          <w:rFonts w:ascii="Calibri" w:cs="Calibri" w:eastAsia="Calibri" w:hAnsi="Calibri"/>
-          <w:b/>
-          <w:bCs/>
-          <w:i w:val="false"/>
-          <w:iCs w:val="false"/>
-          <w:color w:val="B07CFF"/>
-          <w:sz w:val="20"/>
-          <w:szCs w:val="20"/>
-        </w:rPr>
-        <w:t xml:space="preserve">FILES  </w:t>
-      </w:r>
-      <w:r>
-        <w:rPr>
-          <w:rFonts w:ascii="Calibri" w:cs="Calibri" w:eastAsia="Calibri" w:hAnsi="Calibri"/>
-          <w:b w:val="false"/>
-          <w:bCs w:val="false"/>
-          <w:i w:val="false"/>
-          <w:iCs w:val="false"/>
-          <w:color w:val="B07CFF"/>
-          <w:sz w:val="20"/>
-          <w:szCs w:val="20"/>
-        </w:rPr>
-        <w:t xml:space="preserve">05-evaluate/billing_agent_FIXED.txt</w:t>
       </w:r>
     </w:p>
     <w:tbl>
@@ -24094,7 +24021,7 @@
                 <w:sz w:val="20"/>
                 <w:szCs w:val="20"/>
               </w:rPr>
-              <w:t xml:space="preserve">Results: Marcus scenario fails in some runs ▸ open a failing transcript ▸ the agent offered up to 12 (max-6-installments: No), Marcus asked for 12, the tool refused (expected input was 6)</w:t>
+              <w:t xml:space="preserve">billing_agent instructions: find "up to 12 monthly installments" — the bug planted on day 1</w:t>
             </w:r>
           </w:p>
         </w:tc>
@@ -24140,10 +24067,10 @@
           <w:tcPr>
             <w:tcW w:type="dxa" w:w="10080"/>
             <w:tcBorders>
-              <w:top w:val="single" w:color="B07CFF" w:sz="12"/>
-              <w:left w:val="single" w:color="B07CFF" w:sz="12"/>
-              <w:bottom w:val="single" w:color="B07CFF" w:sz="12"/>
-              <w:right w:val="single" w:color="B07CFF" w:sz="12"/>
+              <w:top w:val="single" w:color="2BB3B1" w:sz="12"/>
+              <w:left w:val="single" w:color="2BB3B1" w:sz="36"/>
+              <w:bottom w:val="single" w:color="2BB3B1" w:sz="12"/>
+              <w:right w:val="single" w:color="2BB3B1" w:sz="12"/>
             </w:tcBorders>
             <w:tcMar>
               <w:top w:type="dxa" w:w="80"/>
@@ -24163,11 +24090,11 @@
                 <w:bCs/>
                 <w:i w:val="false"/>
                 <w:iCs w:val="false"/>
-                <w:color w:val="B07CFF"/>
+                <w:color w:val="2BB3B1"/>
                 <w:sz w:val="18"/>
                 <w:szCs w:val="18"/>
               </w:rPr>
-              <w:t xml:space="preserve">DO</w:t>
+              <w:t xml:space="preserve">PASTE file ▸ where</w:t>
             </w:r>
           </w:p>
           <w:p>
@@ -24184,7 +24111,55 @@
                 <w:sz w:val="20"/>
                 <w:szCs w:val="20"/>
               </w:rPr>
-              <w:t xml:space="preserve">billing_agent instructions: find "up to 12 monthly installments" — the bug planted on day 1</w:t>
+              <w:t xml:space="preserve">05-evaluate/billing_agent_FIXED.txt</w:t>
+            </w:r>
+          </w:p>
+          <w:p>
+            <w:pPr>
+              <w:spacing w:after="0" w:before="0" w:line="264"/>
+            </w:pPr>
+            <w:r>
+              <w:rPr>
+                <w:rFonts w:ascii="Calibri" w:cs="Calibri" w:eastAsia="Calibri" w:hAnsi="Calibri"/>
+                <w:b w:val="false"/>
+                <w:bCs w:val="false"/>
+                <w:i w:val="false"/>
+                <w:iCs w:val="false"/>
+                <w:sz w:val="20"/>
+                <w:szCs w:val="20"/>
+              </w:rPr>
+              <w:t xml:space="preserve">▸ billing_agent instructions (replace ALL) ▸ Save</w:t>
+            </w:r>
+          </w:p>
+          <w:p>
+            <w:pPr>
+              <w:spacing w:after="0" w:before="60" w:line="264"/>
+            </w:pPr>
+            <w:r>
+              <w:rPr>
+                <w:rFonts w:ascii="Calibri" w:cs="Calibri" w:eastAsia="Calibri" w:hAnsi="Calibri"/>
+                <w:b/>
+                <w:bCs/>
+                <w:i w:val="false"/>
+                <w:iCs w:val="false"/>
+                <w:color w:val="2ECC71"/>
+                <w:sz w:val="19"/>
+                <w:szCs w:val="19"/>
+              </w:rPr>
+              <w:t xml:space="preserve">→ </w:t>
+            </w:r>
+            <w:r>
+              <w:rPr>
+                <w:rFonts w:ascii="Calibri" w:cs="Calibri" w:eastAsia="Calibri" w:hAnsi="Calibri"/>
+                <w:b w:val="false"/>
+                <w:bCs w:val="false"/>
+                <w:i w:val="false"/>
+                <w:iCs w:val="false"/>
+                <w:color w:val="9AA4B2"/>
+                <w:sz w:val="19"/>
+                <w:szCs w:val="19"/>
+              </w:rPr>
+              <w:t xml:space="preserve">The 2–6 rule, plus grounding: never decide eligibility, answer arrangement questions only from the tool's result (its schedule and BP-210 terms), no fees. The M4 policy step is still there.</w:t>
             </w:r>
           </w:p>
         </w:tc>
@@ -24230,10 +24205,10 @@
           <w:tcPr>
             <w:tcW w:type="dxa" w:w="10080"/>
             <w:tcBorders>
-              <w:top w:val="single" w:color="2BB3B1" w:sz="12"/>
-              <w:left w:val="single" w:color="2BB3B1" w:sz="36"/>
-              <w:bottom w:val="single" w:color="2BB3B1" w:sz="12"/>
-              <w:right w:val="single" w:color="2BB3B1" w:sz="12"/>
+              <w:top w:val="single" w:color="2ECC71" w:sz="12"/>
+              <w:left w:val="single" w:color="2ECC71" w:sz="12"/>
+              <w:bottom w:val="single" w:color="2ECC71" w:sz="12"/>
+              <w:right w:val="single" w:color="2ECC71" w:sz="12"/>
             </w:tcBorders>
             <w:tcMar>
               <w:top w:type="dxa" w:w="80"/>
@@ -24253,11 +24228,11 @@
                 <w:bCs/>
                 <w:i w:val="false"/>
                 <w:iCs w:val="false"/>
-                <w:color w:val="2BB3B1"/>
+                <w:color w:val="2ECC71"/>
                 <w:sz w:val="18"/>
                 <w:szCs w:val="18"/>
               </w:rPr>
-              <w:t xml:space="preserve">PASTE file ▸ where</w:t>
+              <w:t xml:space="preserve">SAVE VERSION</w:t>
             </w:r>
           </w:p>
           <w:p>
@@ -24267,62 +24242,14 @@
             <w:r>
               <w:rPr>
                 <w:rFonts w:ascii="Calibri" w:cs="Calibri" w:eastAsia="Calibri" w:hAnsi="Calibri"/>
-                <w:b w:val="false"/>
-                <w:bCs w:val="false"/>
+                <w:b/>
+                <w:bCs/>
                 <w:i w:val="false"/>
                 <w:iCs w:val="false"/>
                 <w:sz w:val="20"/>
                 <w:szCs w:val="20"/>
               </w:rPr>
-              <w:t xml:space="preserve">05-evaluate/billing_agent_FIXED.txt</w:t>
-            </w:r>
-          </w:p>
-          <w:p>
-            <w:pPr>
-              <w:spacing w:after="0" w:before="0" w:line="264"/>
-            </w:pPr>
-            <w:r>
-              <w:rPr>
-                <w:rFonts w:ascii="Calibri" w:cs="Calibri" w:eastAsia="Calibri" w:hAnsi="Calibri"/>
-                <w:b w:val="false"/>
-                <w:bCs w:val="false"/>
-                <w:i w:val="false"/>
-                <w:iCs w:val="false"/>
-                <w:sz w:val="20"/>
-                <w:szCs w:val="20"/>
-              </w:rPr>
-              <w:t xml:space="preserve">▸ billing_agent instructions (replace ALL) ▸ Save</w:t>
-            </w:r>
-          </w:p>
-          <w:p>
-            <w:pPr>
-              <w:spacing w:after="0" w:before="60" w:line="264"/>
-            </w:pPr>
-            <w:r>
-              <w:rPr>
-                <w:rFonts w:ascii="Calibri" w:cs="Calibri" w:eastAsia="Calibri" w:hAnsi="Calibri"/>
-                <w:b/>
-                <w:bCs/>
-                <w:i w:val="false"/>
-                <w:iCs w:val="false"/>
-                <w:color w:val="2ECC71"/>
-                <w:sz w:val="19"/>
-                <w:szCs w:val="19"/>
-              </w:rPr>
-              <w:t xml:space="preserve">→ </w:t>
-            </w:r>
-            <w:r>
-              <w:rPr>
-                <w:rFonts w:ascii="Calibri" w:cs="Calibri" w:eastAsia="Calibri" w:hAnsi="Calibri"/>
-                <w:b w:val="false"/>
-                <w:bCs w:val="false"/>
-                <w:i w:val="false"/>
-                <w:iCs w:val="false"/>
-                <w:color w:val="9AA4B2"/>
-                <w:sz w:val="19"/>
-                <w:szCs w:val="19"/>
-              </w:rPr>
-              <w:t xml:space="preserve">Same instructions with the 2–6 rule; it already includes the M4 policy step, so nothing is lost.</w:t>
+              <w:t xml:space="preserve">Versions ▸ + Create version ▸ v5-evaluated</w:t>
             </w:r>
           </w:p>
         </w:tc>
@@ -24368,10 +24295,10 @@
           <w:tcPr>
             <w:tcW w:type="dxa" w:w="10080"/>
             <w:tcBorders>
-              <w:top w:val="single" w:color="2ECC71" w:sz="12"/>
-              <w:left w:val="single" w:color="2ECC71" w:sz="12"/>
-              <w:bottom w:val="single" w:color="2ECC71" w:sz="12"/>
-              <w:right w:val="single" w:color="2ECC71" w:sz="12"/>
+              <w:top w:val="single" w:color="B07CFF" w:sz="12"/>
+              <w:left w:val="single" w:color="B07CFF" w:sz="12"/>
+              <w:bottom w:val="single" w:color="B07CFF" w:sz="12"/>
+              <w:right w:val="single" w:color="B07CFF" w:sz="12"/>
             </w:tcBorders>
             <w:tcMar>
               <w:top w:type="dxa" w:w="80"/>
@@ -24391,16 +24318,33 @@
                 <w:bCs/>
                 <w:i w:val="false"/>
                 <w:iCs w:val="false"/>
-                <w:color w:val="2ECC71"/>
+                <w:color w:val="B07CFF"/>
                 <w:sz w:val="18"/>
                 <w:szCs w:val="18"/>
               </w:rPr>
-              <w:t xml:space="preserve">SAVE VERSION</w:t>
+              <w:t xml:space="preserve">DO</w:t>
             </w:r>
           </w:p>
           <w:p>
             <w:pPr>
               <w:spacing w:after="0" w:before="0" w:line="264"/>
+            </w:pPr>
+            <w:r>
+              <w:rPr>
+                <w:rFonts w:ascii="Calibri" w:cs="Calibri" w:eastAsia="Calibri" w:hAnsi="Calibri"/>
+                <w:b w:val="false"/>
+                <w:bCs w:val="false"/>
+                <w:i w:val="false"/>
+                <w:iCs w:val="false"/>
+                <w:sz w:val="20"/>
+                <w:szCs w:val="20"/>
+              </w:rPr>
+              <w:t xml:space="preserve">Run selected again on v5-evaluated ▸ compare the two runs side by side</w:t>
+            </w:r>
+          </w:p>
+          <w:p>
+            <w:pPr>
+              <w:spacing w:after="0" w:before="60" w:line="264"/>
             </w:pPr>
             <w:r>
               <w:rPr>
@@ -24409,10 +24353,24 @@
                 <w:bCs/>
                 <w:i w:val="false"/>
                 <w:iCs w:val="false"/>
-                <w:sz w:val="20"/>
-                <w:szCs w:val="20"/>
-              </w:rPr>
-              <w:t xml:space="preserve">Versions ▸ + Create version ▸ v5-evaluated</w:t>
+                <w:color w:val="2ECC71"/>
+                <w:sz w:val="19"/>
+                <w:szCs w:val="19"/>
+              </w:rPr>
+              <w:t xml:space="preserve">→ </w:t>
+            </w:r>
+            <w:r>
+              <w:rPr>
+                <w:rFonts w:ascii="Calibri" w:cs="Calibri" w:eastAsia="Calibri" w:hAnsi="Calibri"/>
+                <w:b w:val="false"/>
+                <w:bCs w:val="false"/>
+                <w:i w:val="false"/>
+                <w:iCs w:val="false"/>
+                <w:color w:val="9AA4B2"/>
+                <w:sz w:val="19"/>
+                <w:szCs w:val="19"/>
+              </w:rPr>
+              <w:t xml:space="preserve">Mostly green: the call carries 6 installments and max-6-installments answers Yes.</w:t>
             </w:r>
           </w:p>
         </w:tc>
@@ -24485,7 +24443,7 @@
                 <w:sz w:val="18"/>
                 <w:szCs w:val="18"/>
               </w:rPr>
-              <w:t xml:space="preserve">DO</w:t>
+              <w:t xml:space="preserve">DO · IF A RUN IS STILL RED</w:t>
             </w:r>
           </w:p>
           <w:p>
@@ -24502,7 +24460,7 @@
                 <w:sz w:val="20"/>
                 <w:szCs w:val="20"/>
               </w:rPr>
-              <w:t xml:space="preserve">Run selected again on v5-evaluated ▸ compare the two runs side by side</w:t>
+              <w:t xml:space="preserve">Open it ▸ read the judge's justification out loud ▸ ask the room: is the agent wrong, or the judge?</w:t>
             </w:r>
           </w:p>
           <w:p>
@@ -24533,7 +24491,7 @@
                 <w:sz w:val="19"/>
                 <w:szCs w:val="19"/>
               </w:rPr>
-              <w:t xml:space="preserve">Task completion up; the call now carries 6 installments and max-6-installments answers Yes.</w:t>
+              <w:t xml:space="preserve">Usually the hallucination check on one of the persona's follow-ups, or a judge false positive (see below).</w:t>
             </w:r>
           </w:p>
         </w:tc>
@@ -24583,7 +24541,7 @@
           <w:sz w:val="20"/>
           <w:szCs w:val="20"/>
         </w:rPr>
-        <w:t xml:space="preserve">LLM runs vary. If the first run happened to pass, open a transcript anyway: the 12 is in the instructions and the fix is the same. Say it: that's why we run 5 times. A failure marked as a hallucination (the frustrated persona asks about fees and the agent invents an answer) is a second, real catch: the fix is grounding, not prompting. The tool returns fees_and_interest and billing_agent_FIXED.txt says to state only the terms the tool returned.</w:t>
+        <w:t xml:space="preserve">LLM runs vary: that's why we run 5 times, and a stray red is normal. If the first run happened to pass, open a transcript anyway: the 12 is in the instructions and the fix is the same. A justification saying the agent shouldn't have asked to verify because is_authenticated is true is a judge false positive: it compares an early turn with the end-of-conversation variables. Read it, name it, move on.</w:t>
       </w:r>
     </w:p>
     <w:p>

</xml_diff>

<commit_message>
Switch demo to Cloud Shell Web Preview
Updated the Cymbal Energy outage demo and training content to use Cloud Shell Editor and Web Preview instead of a local VS Code/localhost workflow. The instructions now point to the correct file path, serve the page on port 8080, and clarify that the web widget must be loaded over HTTP with public access enabled and origin check off. The reset steps and checklists were also synced across the guide and slide content.
</commit_message>
<xml_diff>
--- a/docs/PLANNING GUIDE - CX Agent Studio - Cymbal Energy.docx
+++ b/docs/PLANNING GUIDE - CX Agent Studio - Cymbal Energy.docx
@@ -9247,29 +9247,7 @@
           <w:sz w:val="22"/>
           <w:szCs w:val="22"/>
         </w:rPr>
-        <w:t xml:space="preserve">VS Code: 06-deploy/cymbal-energy-outage-center.html open (the PASTE markers are at the bottom)</w:t>
-      </w:r>
-    </w:p>
-    <w:p>
-      <w:pPr>
-        <w:pStyle w:val="ListParagraph"/>
-        <w:numPr>
-          <w:ilvl w:val="0"/>
-          <w:numId w:val="2"/>
-        </w:numPr>
-        <w:spacing w:after="40" w:before="20" w:line="264"/>
-      </w:pPr>
-      <w:r>
-        <w:rPr>
-          <w:rFonts w:ascii="Calibri" w:cs="Calibri" w:eastAsia="Calibri" w:hAnsi="Calibri"/>
-          <w:b w:val="false"/>
-          <w:bCs w:val="false"/>
-          <w:i w:val="false"/>
-          <w:iCs w:val="false"/>
-          <w:sz w:val="22"/>
-          <w:szCs w:val="22"/>
-        </w:rPr>
-        <w:t xml:space="preserve">A local terminal ready for python3 -m http.server 8000 in 06-deploy of your local clone</w:t>
+        <w:t xml:space="preserve">Cloud Shell ▸ Open Editor: ~/cx-agent-studio/06-deploy/cymbal-energy-outage-center.html opens (the PASTE markers are at the bottom); block 21 serves it with python3 -m http.server 8080 and Web Preview</w:t>
       </w:r>
     </w:p>
     <w:p>
@@ -24792,7 +24770,7 @@
                 <w:sz w:val="21"/>
                 <w:szCs w:val="21"/>
               </w:rPr>
-              <w:t xml:space="preserve">VS Code + a Terminal on the Mac</w:t>
+              <w:t xml:space="preserve">Cloud Shell open (a second browser tab)</w:t>
             </w:r>
           </w:p>
         </w:tc>
@@ -25003,7 +24981,7 @@
                 <w:sz w:val="20"/>
                 <w:szCs w:val="20"/>
               </w:rPr>
-              <w:t xml:space="preserve">Copy the widget code ▸ VS Code: open</w:t>
+              <w:t xml:space="preserve">Copy the widget code ▸ Cloud Shell ▸ Open Editor ▸ File ▸ Open</w:t>
             </w:r>
           </w:p>
           <w:p>
@@ -25020,7 +24998,7 @@
                 <w:sz w:val="20"/>
                 <w:szCs w:val="20"/>
               </w:rPr>
-              <w:t xml:space="preserve">    06-deploy/cymbal-energy-outage-center.html</w:t>
+              <w:t xml:space="preserve">    ~/cx-agent-studio/06-deploy/cymbal-energy-outage-center.html</w:t>
             </w:r>
           </w:p>
           <w:p>
@@ -25037,7 +25015,7 @@
                 <w:sz w:val="20"/>
                 <w:szCs w:val="20"/>
               </w:rPr>
-              <w:t xml:space="preserve">▸ paste between the two PASTE markers at the bottom ▸ Save</w:t>
+              <w:t xml:space="preserve">▸ paste between the two PASTE markers at the bottom ▸ File ▸ Save ▸ Open Terminal</w:t>
             </w:r>
           </w:p>
         </w:tc>
@@ -25110,7 +25088,7 @@
                 <w:sz w:val="18"/>
                 <w:szCs w:val="18"/>
               </w:rPr>
-              <w:t xml:space="preserve">LOCAL TERMINAL</w:t>
+              <w:t xml:space="preserve">CLOUD SHELL</w:t>
             </w:r>
           </w:p>
           <w:p>
@@ -25127,7 +25105,7 @@
                 <w:sz w:val="19"/>
                 <w:szCs w:val="19"/>
               </w:rPr>
-              <w:t xml:space="preserve">cd &lt;your local clone&gt;/06-deploy &amp;&amp; python3 -m http.server 8000</w:t>
+              <w:t xml:space="preserve">cd ~/cx-agent-studio/06-deploy &amp;&amp; python3 -m http.server 8080</w:t>
             </w:r>
           </w:p>
         </w:tc>
@@ -25217,7 +25195,7 @@
                 <w:sz w:val="20"/>
                 <w:szCs w:val="20"/>
               </w:rPr>
-              <w:t xml:space="preserve">Browser: http://localhost:8000/cymbal-energy-outage-center.html ▸ open the chat bubble</w:t>
+              <w:t xml:space="preserve">Cloud Shell toolbar ▸ Web Preview ▸ Preview on port 8080 ▸ click cymbal-energy-outage-center.html ▸ open the chat bubble</w:t>
             </w:r>
           </w:p>
         </w:tc>
@@ -25388,7 +25366,7 @@
           <w:sz w:val="20"/>
           <w:szCs w:val="20"/>
         </w:rPr>
-        <w:t xml:space="preserve">Widget doesn't appear on localhost: the snippet needs http(s), not file://. Fallback: Cloud Shell ▸ upload the html ▸ python3 -m http.server 8080 ▸ Web Preview ▸ port 8080.</w:t>
+        <w:t xml:space="preserve">Widget doesn't appear: check the channel has public access ON and origin check OFF, and that the page came from Web Preview (http), not a downloaded file. Reload after saving the paste.</w:t>
       </w:r>
     </w:p>
     <w:p>
@@ -25538,7 +25516,7 @@
                 <w:sz w:val="21"/>
                 <w:szCs w:val="21"/>
               </w:rPr>
-              <w:t xml:space="preserve">Continue from block 21</w:t>
+              <w:t xml:space="preserve">Continue from block 21 (leave the web server running)</w:t>
             </w:r>
           </w:p>
           <w:p>
@@ -25555,7 +25533,7 @@
                 <w:sz w:val="21"/>
                 <w:szCs w:val="21"/>
               </w:rPr>
-              <w:t xml:space="preserve">Cloud Shell in ~/cx-agent-studio/06-deploy</w:t>
+              <w:t xml:space="preserve">Cloud Shell ▸ + (new tab) ▸ cd ~/cx-agent-studio/06-deploy</w:t>
             </w:r>
           </w:p>
         </w:tc>
@@ -34894,7 +34872,7 @@
           <w:sz w:val="22"/>
           <w:szCs w:val="22"/>
         </w:rPr>
-        <w:t xml:space="preserve">Web widget: which snippet the console generates (&lt;chat-messenger&gt; in the current docs, &lt;ces-messenger&gt; on the slide), whether localhost works with public access on and origin check off.</w:t>
+        <w:t xml:space="preserve">Web widget: which snippet the console generates (&lt;chat-messenger&gt; in the current docs, &lt;ces-messenger&gt; on the slide), whether the Cloud Shell Web Preview page works with public access on and origin check off.</w:t>
       </w:r>
     </w:p>
     <w:p>

</xml_diff>

<commit_message>
Prewire web widget; use Deployment ID only
Refactors the outage center deploy flow so the web widget embed code is built into `cymbal-energy-outage-center.html`; presenters now only paste the channel Deployment ID into `DEPLOYMENT_ID`. Adds guidance and UX guardrails for layout/behavior (bubble pinned bottom-right, panel open behavior, warning when ID is missing) and updates teleprompter/guide content to match the new deployment steps and troubleshooting.
</commit_message>
<xml_diff>
--- a/docs/PLANNING GUIDE - CX Agent Studio - Cymbal Energy.docx
+++ b/docs/PLANNING GUIDE - CX Agent Studio - Cymbal Energy.docx
@@ -9247,7 +9247,7 @@
           <w:sz w:val="22"/>
           <w:szCs w:val="22"/>
         </w:rPr>
-        <w:t xml:space="preserve">Cloud Shell ▸ Open Editor: ~/cx-agent-studio/06-deploy/cymbal-energy-outage-center.html opens (the PASTE markers are at the bottom); block 21 serves it with python3 -m http.server 8080 and Web Preview</w:t>
+        <w:t xml:space="preserve">Cloud Shell ▸ Open Editor: ~/cx-agent-studio/06-deploy/cymbal-energy-outage-center.html opens (DEPLOYMENT_ID is near the bottom); block 21 serves it with python3 -m http.server 8080 and Web Preview</w:t>
       </w:r>
     </w:p>
     <w:p>
@@ -24619,6 +24619,36 @@
           <w:sz w:val="22"/>
           <w:szCs w:val="22"/>
         </w:rPr>
+        <w:t xml:space="preserve">The console gives you four things to paste. Three are the same for every deployment, so they live in the page already. The only thing that's mine is this one ID.</w:t>
+      </w:r>
+    </w:p>
+    <w:p>
+      <w:pPr>
+        <w:spacing w:after="80" w:before="40" w:line="264"/>
+      </w:pPr>
+      <w:r>
+        <w:rPr>
+          <w:rFonts w:ascii="Calibri" w:cs="Calibri" w:eastAsia="Calibri" w:hAnsi="Calibri"/>
+          <w:b/>
+          <w:bCs/>
+          <w:i w:val="false"/>
+          <w:iCs w:val="false"/>
+          <w:color w:val="2BB3B1"/>
+          <w:sz w:val="20"/>
+          <w:szCs w:val="20"/>
+        </w:rPr>
+        <w:t xml:space="preserve">SAY  </w:t>
+      </w:r>
+      <w:r>
+        <w:rPr>
+          <w:rFonts w:ascii="Calibri" w:cs="Calibri" w:eastAsia="Calibri" w:hAnsi="Calibri"/>
+          <w:b w:val="false"/>
+          <w:bCs w:val="false"/>
+          <w:i/>
+          <w:iCs/>
+          <w:sz w:val="22"/>
+          <w:szCs w:val="22"/>
+        </w:rPr>
         <w:t xml:space="preserve">The channel points at v5-evaluated, not at the draft. I can keep editing without breaking the website.</w:t>
       </w:r>
     </w:p>
@@ -24981,41 +25011,7 @@
                 <w:sz w:val="20"/>
                 <w:szCs w:val="20"/>
               </w:rPr>
-              <w:t xml:space="preserve">Copy the widget code ▸ Cloud Shell ▸ Open Editor ▸ File ▸ Open</w:t>
-            </w:r>
-          </w:p>
-          <w:p>
-            <w:pPr>
-              <w:spacing w:after="0" w:before="0" w:line="264"/>
-            </w:pPr>
-            <w:r>
-              <w:rPr>
-                <w:rFonts w:ascii="Calibri" w:cs="Calibri" w:eastAsia="Calibri" w:hAnsi="Calibri"/>
-                <w:b w:val="false"/>
-                <w:bCs w:val="false"/>
-                <w:i w:val="false"/>
-                <w:iCs w:val="false"/>
-                <w:sz w:val="20"/>
-                <w:szCs w:val="20"/>
-              </w:rPr>
-              <w:t xml:space="preserve">    ~/cx-agent-studio/06-deploy/cymbal-energy-outage-center.html</w:t>
-            </w:r>
-          </w:p>
-          <w:p>
-            <w:pPr>
-              <w:spacing w:after="0" w:before="0" w:line="264"/>
-            </w:pPr>
-            <w:r>
-              <w:rPr>
-                <w:rFonts w:ascii="Calibri" w:cs="Calibri" w:eastAsia="Calibri" w:hAnsi="Calibri"/>
-                <w:b w:val="false"/>
-                <w:bCs w:val="false"/>
-                <w:i w:val="false"/>
-                <w:iCs w:val="false"/>
-                <w:sz w:val="20"/>
-                <w:szCs w:val="20"/>
-              </w:rPr>
-              <w:t xml:space="preserve">▸ paste between the two PASTE markers at the bottom ▸ File ▸ Save ▸ Open Terminal</w:t>
+              <w:t xml:space="preserve">Channel created dialog ▸ Deployment ID ▸ copy button (the three Embed boxes are already in the page)</w:t>
             </w:r>
           </w:p>
         </w:tc>
@@ -25061,10 +25057,10 @@
           <w:tcPr>
             <w:tcW w:type="dxa" w:w="10080"/>
             <w:tcBorders>
-              <w:top w:val="single" w:color="2BB3B1" w:sz="12"/>
-              <w:left w:val="single" w:color="2BB3B1" w:sz="36"/>
-              <w:bottom w:val="single" w:color="2BB3B1" w:sz="12"/>
-              <w:right w:val="single" w:color="2BB3B1" w:sz="12"/>
+              <w:top w:val="single" w:color="B07CFF" w:sz="12"/>
+              <w:left w:val="single" w:color="B07CFF" w:sz="12"/>
+              <w:bottom w:val="single" w:color="B07CFF" w:sz="12"/>
+              <w:right w:val="single" w:color="B07CFF" w:sz="12"/>
             </w:tcBorders>
             <w:tcMar>
               <w:top w:type="dxa" w:w="80"/>
@@ -25084,11 +25080,11 @@
                 <w:bCs/>
                 <w:i w:val="false"/>
                 <w:iCs w:val="false"/>
-                <w:color w:val="2BB3B1"/>
+                <w:color w:val="B07CFF"/>
                 <w:sz w:val="18"/>
                 <w:szCs w:val="18"/>
               </w:rPr>
-              <w:t xml:space="preserve">CLOUD SHELL</w:t>
+              <w:t xml:space="preserve">DO</w:t>
             </w:r>
           </w:p>
           <w:p>
@@ -25097,15 +25093,49 @@
             </w:pPr>
             <w:r>
               <w:rPr>
-                <w:rFonts w:ascii="Consolas" w:cs="Consolas" w:eastAsia="Consolas" w:hAnsi="Consolas"/>
-                <w:b w:val="false"/>
-                <w:bCs w:val="false"/>
-                <w:i w:val="false"/>
-                <w:iCs w:val="false"/>
-                <w:sz w:val="19"/>
-                <w:szCs w:val="19"/>
-              </w:rPr>
-              <w:t xml:space="preserve">cd ~/cx-agent-studio/06-deploy &amp;&amp; python3 -m http.server 8080</w:t>
+                <w:rFonts w:ascii="Calibri" w:cs="Calibri" w:eastAsia="Calibri" w:hAnsi="Calibri"/>
+                <w:b w:val="false"/>
+                <w:bCs w:val="false"/>
+                <w:i w:val="false"/>
+                <w:iCs w:val="false"/>
+                <w:sz w:val="20"/>
+                <w:szCs w:val="20"/>
+              </w:rPr>
+              <w:t xml:space="preserve">Cloud Shell ▸ Open Editor ▸ File ▸ Open</w:t>
+            </w:r>
+          </w:p>
+          <w:p>
+            <w:pPr>
+              <w:spacing w:after="0" w:before="0" w:line="264"/>
+            </w:pPr>
+            <w:r>
+              <w:rPr>
+                <w:rFonts w:ascii="Calibri" w:cs="Calibri" w:eastAsia="Calibri" w:hAnsi="Calibri"/>
+                <w:b w:val="false"/>
+                <w:bCs w:val="false"/>
+                <w:i w:val="false"/>
+                <w:iCs w:val="false"/>
+                <w:sz w:val="20"/>
+                <w:szCs w:val="20"/>
+              </w:rPr>
+              <w:t xml:space="preserve">    ~/cx-agent-studio/06-deploy/cymbal-energy-outage-center.html</w:t>
+            </w:r>
+          </w:p>
+          <w:p>
+            <w:pPr>
+              <w:spacing w:after="0" w:before="0" w:line="264"/>
+            </w:pPr>
+            <w:r>
+              <w:rPr>
+                <w:rFonts w:ascii="Calibri" w:cs="Calibri" w:eastAsia="Calibri" w:hAnsi="Calibri"/>
+                <w:b w:val="false"/>
+                <w:bCs w:val="false"/>
+                <w:i w:val="false"/>
+                <w:iCs w:val="false"/>
+                <w:sz w:val="20"/>
+                <w:szCs w:val="20"/>
+              </w:rPr>
+              <w:t xml:space="preserve">▸ near the bottom, replace PASTE_DEPLOYMENT_ID_HERE (keep the quotes) ▸ File ▸ Save ▸ Open Terminal</w:t>
             </w:r>
           </w:p>
         </w:tc>
@@ -25151,10 +25181,10 @@
           <w:tcPr>
             <w:tcW w:type="dxa" w:w="10080"/>
             <w:tcBorders>
-              <w:top w:val="single" w:color="B07CFF" w:sz="12"/>
-              <w:left w:val="single" w:color="B07CFF" w:sz="12"/>
-              <w:bottom w:val="single" w:color="B07CFF" w:sz="12"/>
-              <w:right w:val="single" w:color="B07CFF" w:sz="12"/>
+              <w:top w:val="single" w:color="2BB3B1" w:sz="12"/>
+              <w:left w:val="single" w:color="2BB3B1" w:sz="36"/>
+              <w:bottom w:val="single" w:color="2BB3B1" w:sz="12"/>
+              <w:right w:val="single" w:color="2BB3B1" w:sz="12"/>
             </w:tcBorders>
             <w:tcMar>
               <w:top w:type="dxa" w:w="80"/>
@@ -25174,11 +25204,11 @@
                 <w:bCs/>
                 <w:i w:val="false"/>
                 <w:iCs w:val="false"/>
-                <w:color w:val="B07CFF"/>
+                <w:color w:val="2BB3B1"/>
                 <w:sz w:val="18"/>
                 <w:szCs w:val="18"/>
               </w:rPr>
-              <w:t xml:space="preserve">DO</w:t>
+              <w:t xml:space="preserve">CLOUD SHELL</w:t>
             </w:r>
           </w:p>
           <w:p>
@@ -25187,15 +25217,15 @@
             </w:pPr>
             <w:r>
               <w:rPr>
-                <w:rFonts w:ascii="Calibri" w:cs="Calibri" w:eastAsia="Calibri" w:hAnsi="Calibri"/>
-                <w:b w:val="false"/>
-                <w:bCs w:val="false"/>
-                <w:i w:val="false"/>
-                <w:iCs w:val="false"/>
-                <w:sz w:val="20"/>
-                <w:szCs w:val="20"/>
-              </w:rPr>
-              <w:t xml:space="preserve">Cloud Shell toolbar ▸ Web Preview ▸ Preview on port 8080 ▸ click cymbal-energy-outage-center.html ▸ open the chat bubble</w:t>
+                <w:rFonts w:ascii="Consolas" w:cs="Consolas" w:eastAsia="Consolas" w:hAnsi="Consolas"/>
+                <w:b w:val="false"/>
+                <w:bCs w:val="false"/>
+                <w:i w:val="false"/>
+                <w:iCs w:val="false"/>
+                <w:sz w:val="19"/>
+                <w:szCs w:val="19"/>
+              </w:rPr>
+              <w:t xml:space="preserve">cd ~/cx-agent-studio/06-deploy &amp;&amp; python3 -m http.server 8080</w:t>
             </w:r>
           </w:p>
         </w:tc>
@@ -25241,10 +25271,10 @@
           <w:tcPr>
             <w:tcW w:type="dxa" w:w="10080"/>
             <w:tcBorders>
-              <w:top w:val="single" w:color="F28C28" w:sz="12"/>
-              <w:left w:val="single" w:color="F28C28" w:sz="36"/>
-              <w:bottom w:val="single" w:color="F28C28" w:sz="12"/>
-              <w:right w:val="single" w:color="F28C28" w:sz="12"/>
+              <w:top w:val="single" w:color="B07CFF" w:sz="12"/>
+              <w:left w:val="single" w:color="B07CFF" w:sz="12"/>
+              <w:bottom w:val="single" w:color="B07CFF" w:sz="12"/>
+              <w:right w:val="single" w:color="B07CFF" w:sz="12"/>
             </w:tcBorders>
             <w:tcMar>
               <w:top w:type="dxa" w:w="80"/>
@@ -25264,11 +25294,11 @@
                 <w:bCs/>
                 <w:i w:val="false"/>
                 <w:iCs w:val="false"/>
-                <w:color w:val="F28C28"/>
+                <w:color w:val="B07CFF"/>
                 <w:sz w:val="18"/>
                 <w:szCs w:val="18"/>
               </w:rPr>
-              <w:t xml:space="preserve">TYPE in Preview</w:t>
+              <w:t xml:space="preserve">DO</w:t>
             </w:r>
           </w:p>
           <w:p>
@@ -25277,15 +25307,15 @@
             </w:pPr>
             <w:r>
               <w:rPr>
-                <w:rFonts w:ascii="Consolas" w:cs="Consolas" w:eastAsia="Consolas" w:hAnsi="Consolas"/>
-                <w:b w:val="false"/>
-                <w:bCs w:val="false"/>
-                <w:i w:val="false"/>
-                <w:iCs w:val="false"/>
-                <w:sz w:val="19"/>
-                <w:szCs w:val="19"/>
-              </w:rPr>
-              <w:t xml:space="preserve">Is there an outage in Moss Point? ZIP 39562</w:t>
+                <w:rFonts w:ascii="Calibri" w:cs="Calibri" w:eastAsia="Calibri" w:hAnsi="Calibri"/>
+                <w:b w:val="false"/>
+                <w:bCs w:val="false"/>
+                <w:i w:val="false"/>
+                <w:iCs w:val="false"/>
+                <w:sz w:val="20"/>
+                <w:szCs w:val="20"/>
+              </w:rPr>
+              <w:t xml:space="preserve">Cloud Shell toolbar ▸ Web Preview ▸ Preview on port 8080 ▸ click cymbal-energy-outage-center.html ▸ open the chat bubble</w:t>
             </w:r>
           </w:p>
           <w:p>
@@ -25316,7 +25346,7 @@
                 <w:sz w:val="19"/>
                 <w:szCs w:val="19"/>
               </w:rPr>
-              <w:t xml:space="preserve">Tree limb, 310 customers, ETR 4:30 PM today (matches the table on the page).</w:t>
+              <w:t xml:space="preserve">Bubble at the bottom right; clicking it opens the chat as a panel down the right side; the ↘ button collapses it back to the bubble.</w:t>
             </w:r>
           </w:p>
         </w:tc>
@@ -25339,6 +25369,127 @@
         <w:t xml:space="preserve"/>
       </w:r>
     </w:p>
+    <w:tbl>
+      <w:tblPr>
+        <w:tblW w:type="dxa" w:w="10080"/>
+        <w:tblBorders>
+          <w:top w:val="single" w:color="auto" w:sz="4"/>
+          <w:left w:val="single" w:color="auto" w:sz="4"/>
+          <w:bottom w:val="single" w:color="auto" w:sz="4"/>
+          <w:right w:val="single" w:color="auto" w:sz="4"/>
+          <w:insideH w:val="single" w:color="auto" w:sz="4"/>
+          <w:insideV w:val="single" w:color="auto" w:sz="4"/>
+        </w:tblBorders>
+      </w:tblPr>
+      <w:tblGrid>
+        <w:gridCol w:w="10080"/>
+      </w:tblGrid>
+      <w:tr>
+        <w:trPr>
+          <w:cantSplit/>
+        </w:trPr>
+        <w:tc>
+          <w:tcPr>
+            <w:tcW w:type="dxa" w:w="10080"/>
+            <w:tcBorders>
+              <w:top w:val="single" w:color="F28C28" w:sz="12"/>
+              <w:left w:val="single" w:color="F28C28" w:sz="36"/>
+              <w:bottom w:val="single" w:color="F28C28" w:sz="12"/>
+              <w:right w:val="single" w:color="F28C28" w:sz="12"/>
+            </w:tcBorders>
+            <w:tcMar>
+              <w:top w:type="dxa" w:w="80"/>
+              <w:left w:type="dxa" w:w="160"/>
+              <w:bottom w:type="dxa" w:w="80"/>
+              <w:right w:type="dxa" w:w="160"/>
+            </w:tcMar>
+          </w:tcPr>
+          <w:p>
+            <w:pPr>
+              <w:spacing w:after="40" w:before="0" w:line="264"/>
+            </w:pPr>
+            <w:r>
+              <w:rPr>
+                <w:rFonts w:ascii="Calibri" w:cs="Calibri" w:eastAsia="Calibri" w:hAnsi="Calibri"/>
+                <w:b/>
+                <w:bCs/>
+                <w:i w:val="false"/>
+                <w:iCs w:val="false"/>
+                <w:color w:val="F28C28"/>
+                <w:sz w:val="18"/>
+                <w:szCs w:val="18"/>
+              </w:rPr>
+              <w:t xml:space="preserve">TYPE in Preview</w:t>
+            </w:r>
+          </w:p>
+          <w:p>
+            <w:pPr>
+              <w:spacing w:after="0" w:before="0" w:line="264"/>
+            </w:pPr>
+            <w:r>
+              <w:rPr>
+                <w:rFonts w:ascii="Consolas" w:cs="Consolas" w:eastAsia="Consolas" w:hAnsi="Consolas"/>
+                <w:b w:val="false"/>
+                <w:bCs w:val="false"/>
+                <w:i w:val="false"/>
+                <w:iCs w:val="false"/>
+                <w:sz w:val="19"/>
+                <w:szCs w:val="19"/>
+              </w:rPr>
+              <w:t xml:space="preserve">Is there an outage in Moss Point? ZIP 39562</w:t>
+            </w:r>
+          </w:p>
+          <w:p>
+            <w:pPr>
+              <w:spacing w:after="0" w:before="60" w:line="264"/>
+            </w:pPr>
+            <w:r>
+              <w:rPr>
+                <w:rFonts w:ascii="Calibri" w:cs="Calibri" w:eastAsia="Calibri" w:hAnsi="Calibri"/>
+                <w:b/>
+                <w:bCs/>
+                <w:i w:val="false"/>
+                <w:iCs w:val="false"/>
+                <w:color w:val="2ECC71"/>
+                <w:sz w:val="19"/>
+                <w:szCs w:val="19"/>
+              </w:rPr>
+              <w:t xml:space="preserve">→ </w:t>
+            </w:r>
+            <w:r>
+              <w:rPr>
+                <w:rFonts w:ascii="Calibri" w:cs="Calibri" w:eastAsia="Calibri" w:hAnsi="Calibri"/>
+                <w:b w:val="false"/>
+                <w:bCs w:val="false"/>
+                <w:i w:val="false"/>
+                <w:iCs w:val="false"/>
+                <w:color w:val="9AA4B2"/>
+                <w:sz w:val="19"/>
+                <w:szCs w:val="19"/>
+              </w:rPr>
+              <w:t xml:space="preserve">Tree limb, 310 customers, ETR 4:30 PM today (matches the table on the page).</w:t>
+            </w:r>
+          </w:p>
+        </w:tc>
+      </w:tr>
+    </w:tbl>
+    <w:p>
+      <w:pPr>
+        <w:spacing w:after="20" w:before="0" w:line="264"/>
+      </w:pPr>
+      <w:r>
+        <w:rPr>
+          <w:rFonts w:ascii="Calibri" w:cs="Calibri" w:eastAsia="Calibri" w:hAnsi="Calibri"/>
+          <w:b w:val="false"/>
+          <w:bCs w:val="false"/>
+          <w:i w:val="false"/>
+          <w:iCs w:val="false"/>
+          <w:sz w:val="22"/>
+          <w:szCs w:val="22"/>
+        </w:rPr>
+        <w:t xml:space="preserve"/>
+      </w:r>
+    </w:p>
     <w:p>
       <w:pPr>
         <w:spacing w:after="80" w:before="40" w:line="264"/>
@@ -25366,7 +25517,7 @@
           <w:sz w:val="20"/>
           <w:szCs w:val="20"/>
         </w:rPr>
-        <w:t xml:space="preserve">Widget doesn't appear: check the channel has public access ON and origin check OFF, and that the page came from Web Preview (http), not a downloaded file. Reload after saving the paste.</w:t>
+        <w:t xml:space="preserve">Yellow "Chat not connected yet" note: the ID wasn't saved, or the quotes went missing. Bubble opens but the chat errors: check the channel has public access ON and origin check OFF, then try the deploymentName value from the dialog's body box instead (same ID, written with the project number). Don't add render-mode to the page: it replaces the bubble with a panel that only a refresh brings back.</w:t>
       </w:r>
     </w:p>
     <w:p>
@@ -34872,7 +35023,7 @@
           <w:sz w:val="22"/>
           <w:szCs w:val="22"/>
         </w:rPr>
-        <w:t xml:space="preserve">Web widget: which snippet the console generates (&lt;chat-messenger&gt; in the current docs, &lt;ces-messenger&gt; on the slide), whether the Cloud Shell Web Preview page works with public access on and origin check off.</w:t>
+        <w:t xml:space="preserve">Web widget: which snippet the console generates (&lt;chat-messenger&gt; in the current docs, &lt;ces-messenger&gt; on the slide), whether the Cloud Shell Web Preview page works with public access on and origin check off. The outage page already holds the console's embed code (SDK v1.16, both stylesheets, the body script and the &lt;chat-messenger&gt; element), so the live step is pasting the Deployment ID into DEPLOYMENT_ID. Confirm the Deployment ID form (project ID) connects; if not, use the deploymentName value from the body box (project number), and update the page's SDK version if the console's snippet has moved past v1.16. Layout: on its own &lt;chat-messenger&gt; sits inline and renders full width across the bottom, so the page pins it bottom right with CSS and sets align-bottom-right and suppress-restore-on-load on the bubble; render-mode (slide-in, slide-over) is a different layout with no bubble.</w:t>
       </w:r>
     </w:p>
     <w:p>
@@ -36732,7 +36883,7 @@
                 <w:sz w:val="19"/>
                 <w:szCs w:val="19"/>
               </w:rPr>
-              <w:t xml:space="preserve">Mock outage page with the widget paste markers</w:t>
+              <w:t xml:space="preserve">Mock outage page with the web widget built in: paste the Deployment ID into DEPLOYMENT_ID</w:t>
             </w:r>
           </w:p>
         </w:tc>

</xml_diff>

<commit_message>
Enforce tool-first replies in demo agents
Added a new global instruction (in build and stage snapshots) telling agents to call tools before replying, preventing “please wait” dead-ends in chat turns. Updated `verify_customer` across environments to emit trace logging and return an `agent_action` that nudges immediate follow-up tool calls (like `get_bill_summary`) in the same turn.

Also revised the teleprompter/content scripts for the M2 variables/callback/tools walkthrough: adjusted timing, added explicit Variables-panel checks, and clarified troubleshooting language to match the new tool-first behavior.
</commit_message>
<xml_diff>
--- a/docs/PLANNING GUIDE - CX Agent Studio - Cymbal Energy.docx
+++ b/docs/PLANNING GUIDE - CX Agent Studio - Cymbal Energy.docx
@@ -2873,7 +2873,7 @@
                 <w:sz w:val="19"/>
                 <w:szCs w:val="19"/>
               </w:rPr>
-              <w:t xml:space="preserve">6</w:t>
+              <w:t xml:space="preserve">7</w:t>
             </w:r>
           </w:p>
         </w:tc>
@@ -4187,7 +4187,7 @@
           <w:sz w:val="20"/>
           <w:szCs w:val="20"/>
         </w:rPr>
-        <w:t xml:space="preserve">Day 1: about 87 minutes of core demo, 87 with the optional blocks. Demos replace the slides' own demo time; they are not all extra.</w:t>
+        <w:t xml:space="preserve">Day 1: about 88 minutes of core demo, 88 with the optional blocks. Demos replace the slides' own demo time; they are not all extra.</w:t>
       </w:r>
     </w:p>
     <w:p>
@@ -13194,7 +13194,7 @@
           <w:sz w:val="22"/>
           <w:szCs w:val="22"/>
         </w:rPr>
-        <w:t xml:space="preserve">6. Variables: the agent's memory   ·   M2 · SLIDES 28–30 [footer 33–35]   ·   ~6 min</w:t>
+        <w:t xml:space="preserve">6. Variables: the agent's memory   ·   M2 · SLIDES 28–30 [footer 33–35]   ·   ~7 min</w:t>
       </w:r>
     </w:p>
     <w:p>
@@ -13255,6 +13255,36 @@
           <w:szCs w:val="22"/>
         </w:rPr>
         <w:t xml:space="preserve">The model can read these but it can't change them. Only code changes state: tools and callbacks. That's a deliberate safety property.</w:t>
+      </w:r>
+    </w:p>
+    <w:p>
+      <w:pPr>
+        <w:spacing w:after="80" w:before="40" w:line="264"/>
+      </w:pPr>
+      <w:r>
+        <w:rPr>
+          <w:rFonts w:ascii="Calibri" w:cs="Calibri" w:eastAsia="Calibri" w:hAnsi="Calibri"/>
+          <w:b/>
+          <w:bCs/>
+          <w:i w:val="false"/>
+          <w:iCs w:val="false"/>
+          <w:color w:val="2BB3B1"/>
+          <w:sz w:val="20"/>
+          <w:szCs w:val="20"/>
+        </w:rPr>
+        <w:t xml:space="preserve">SAY  </w:t>
+      </w:r>
+      <w:r>
+        <w:rPr>
+          <w:rFonts w:ascii="Calibri" w:cs="Calibri" w:eastAsia="Calibri" w:hAnsi="Calibri"/>
+          <w:b w:val="false"/>
+          <w:bCs w:val="false"/>
+          <w:i/>
+          <w:iCs/>
+          <w:sz w:val="22"/>
+          <w:szCs w:val="22"/>
+        </w:rPr>
+        <w:t xml:space="preserve">Look: she told us her name and account number, and memory is still empty. If the model could write is_authenticated, a customer could talk their way into it. The next two blocks are the two ways code fills these in.</w:t>
       </w:r>
     </w:p>
     <w:tbl>
@@ -13784,23 +13814,114 @@
         <w:t xml:space="preserve"/>
       </w:r>
     </w:p>
+    <w:tbl>
+      <w:tblPr>
+        <w:tblW w:type="dxa" w:w="10080"/>
+        <w:tblBorders>
+          <w:top w:val="single" w:color="auto" w:sz="4"/>
+          <w:left w:val="single" w:color="auto" w:sz="4"/>
+          <w:bottom w:val="single" w:color="auto" w:sz="4"/>
+          <w:right w:val="single" w:color="auto" w:sz="4"/>
+          <w:insideH w:val="single" w:color="auto" w:sz="4"/>
+          <w:insideV w:val="single" w:color="auto" w:sz="4"/>
+        </w:tblBorders>
+      </w:tblPr>
+      <w:tblGrid>
+        <w:gridCol w:w="10080"/>
+      </w:tblGrid>
+      <w:tr>
+        <w:trPr>
+          <w:cantSplit/>
+        </w:trPr>
+        <w:tc>
+          <w:tcPr>
+            <w:tcW w:type="dxa" w:w="10080"/>
+            <w:tcBorders>
+              <w:top w:val="single" w:color="F28C28" w:sz="12"/>
+              <w:left w:val="single" w:color="F28C28" w:sz="36"/>
+              <w:bottom w:val="single" w:color="F28C28" w:sz="12"/>
+              <w:right w:val="single" w:color="F28C28" w:sz="12"/>
+            </w:tcBorders>
+            <w:tcMar>
+              <w:top w:type="dxa" w:w="80"/>
+              <w:left w:type="dxa" w:w="160"/>
+              <w:bottom w:type="dxa" w:w="80"/>
+              <w:right w:type="dxa" w:w="160"/>
+            </w:tcMar>
+          </w:tcPr>
+          <w:p>
+            <w:pPr>
+              <w:spacing w:after="40" w:before="0" w:line="264"/>
+            </w:pPr>
+            <w:r>
+              <w:rPr>
+                <w:rFonts w:ascii="Calibri" w:cs="Calibri" w:eastAsia="Calibri" w:hAnsi="Calibri"/>
+                <w:b/>
+                <w:bCs/>
+                <w:i w:val="false"/>
+                <w:iCs w:val="false"/>
+                <w:color w:val="F28C28"/>
+                <w:sz w:val="18"/>
+                <w:szCs w:val="18"/>
+              </w:rPr>
+              <w:t xml:space="preserve">TYPE in Preview ▸ NEW CONVERSATION</w:t>
+            </w:r>
+          </w:p>
+          <w:p>
+            <w:pPr>
+              <w:spacing w:after="0" w:before="0" w:line="264"/>
+            </w:pPr>
+            <w:r>
+              <w:rPr>
+                <w:rFonts w:ascii="Consolas" w:cs="Consolas" w:eastAsia="Consolas" w:hAnsi="Consolas"/>
+                <w:b w:val="false"/>
+                <w:bCs w:val="false"/>
+                <w:i w:val="false"/>
+                <w:iCs w:val="false"/>
+                <w:sz w:val="19"/>
+                <w:szCs w:val="19"/>
+              </w:rPr>
+              <w:t xml:space="preserve">Hi, I'm Renee. My account is 100234.</w:t>
+            </w:r>
+          </w:p>
+          <w:p>
+            <w:pPr>
+              <w:spacing w:after="0" w:before="60" w:line="264"/>
+            </w:pPr>
+            <w:r>
+              <w:rPr>
+                <w:rFonts w:ascii="Calibri" w:cs="Calibri" w:eastAsia="Calibri" w:hAnsi="Calibri"/>
+                <w:b/>
+                <w:bCs/>
+                <w:i w:val="false"/>
+                <w:iCs w:val="false"/>
+                <w:color w:val="2ECC71"/>
+                <w:sz w:val="19"/>
+                <w:szCs w:val="19"/>
+              </w:rPr>
+              <w:t xml:space="preserve">→ </w:t>
+            </w:r>
+            <w:r>
+              <w:rPr>
+                <w:rFonts w:ascii="Calibri" w:cs="Calibri" w:eastAsia="Calibri" w:hAnsi="Calibri"/>
+                <w:b w:val="false"/>
+                <w:bCs w:val="false"/>
+                <w:i w:val="false"/>
+                <w:iCs w:val="false"/>
+                <w:color w:val="9AA4B2"/>
+                <w:sz w:val="19"/>
+                <w:szCs w:val="19"/>
+              </w:rPr>
+              <w:t xml:space="preserve">A friendly reply.</w:t>
+            </w:r>
+          </w:p>
+        </w:tc>
+      </w:tr>
+    </w:tbl>
     <w:p>
       <w:pPr>
-        <w:spacing w:after="80" w:before="40" w:line="264"/>
+        <w:spacing w:after="20" w:before="0" w:line="264"/>
       </w:pPr>
-      <w:r>
-        <w:rPr>
-          <w:rFonts w:ascii="Calibri" w:cs="Calibri" w:eastAsia="Calibri" w:hAnsi="Calibri"/>
-          <w:b/>
-          <w:bCs/>
-          <w:i w:val="false"/>
-          <w:iCs w:val="false"/>
-          <w:color w:val="FF5C5C"/>
-          <w:sz w:val="20"/>
-          <w:szCs w:val="20"/>
-        </w:rPr>
-        <w:t xml:space="preserve">GOTCHA  </w:t>
-      </w:r>
       <w:r>
         <w:rPr>
           <w:rFonts w:ascii="Calibri" w:cs="Calibri" w:eastAsia="Calibri" w:hAnsi="Calibri"/>
@@ -13808,120 +13929,10 @@
           <w:bCs w:val="false"/>
           <w:i w:val="false"/>
           <w:iCs w:val="false"/>
-          <w:sz w:val="20"/>
-          <w:szCs w:val="20"/>
-        </w:rPr>
-        <w:t xml:space="preserve">Instructions can READ variables; only tools and callbacks can WRITE them. The callback on slide 40 fills the last four; the tools on slide 82 fill the first four.</w:t>
-      </w:r>
-    </w:p>
-    <w:p>
-      <w:pPr>
-        <w:pStyle w:val="Heading3"/>
-        <w:keepNext/>
-        <w:spacing w:after="40" w:before="160"/>
-      </w:pPr>
-      <w:r>
-        <w:rPr>
-          <w:rFonts w:ascii="Calibri" w:cs="Calibri" w:eastAsia="Calibri" w:hAnsi="Calibri"/>
-          <w:b/>
-          <w:bCs/>
-          <w:i w:val="false"/>
-          <w:iCs w:val="false"/>
-          <w:color w:val="3D8BFF"/>
           <w:sz w:val="22"/>
           <w:szCs w:val="22"/>
         </w:rPr>
-        <w:t xml:space="preserve">7. After-tool callback: turn a tool result into state   ·   M2 · SLIDE 40 [footer 45]   ·   ~8 min</w:t>
-      </w:r>
-    </w:p>
-    <w:p>
-      <w:pPr>
-        <w:spacing w:after="80" w:before="40" w:line="264"/>
-      </w:pPr>
-      <w:r>
-        <w:rPr>
-          <w:rFonts w:ascii="Calibri" w:cs="Calibri" w:eastAsia="Calibri" w:hAnsi="Calibri"/>
-          <w:b/>
-          <w:bCs/>
-          <w:i w:val="false"/>
-          <w:iCs w:val="false"/>
-          <w:color w:val="2ECC71"/>
-          <w:sz w:val="20"/>
-          <w:szCs w:val="20"/>
-        </w:rPr>
-        <w:t xml:space="preserve">WHY  </w:t>
-      </w:r>
-      <w:r>
-        <w:rPr>
-          <w:rFonts w:ascii="Calibri" w:cs="Calibri" w:eastAsia="Calibri" w:hAnsi="Calibri"/>
-          <w:b w:val="false"/>
-          <w:bCs w:val="false"/>
-          <w:i w:val="false"/>
-          <w:iCs w:val="false"/>
-          <w:sz w:val="22"/>
-          <w:szCs w:val="22"/>
-        </w:rPr>
-        <w:t xml:space="preserve">A tool returns data; the callback decides what that data means for the rest of the conversation. The eligibility rule (&gt;72 hours in a declared storm) lives in code, runs every time, and never depends on how the customer phrased anything. Every agent can now read the outage facts without calling the tool again.</w:t>
-      </w:r>
-    </w:p>
-    <w:p>
-      <w:pPr>
-        <w:spacing w:after="80" w:before="40" w:line="264"/>
-      </w:pPr>
-      <w:r>
-        <w:rPr>
-          <w:rFonts w:ascii="Calibri" w:cs="Calibri" w:eastAsia="Calibri" w:hAnsi="Calibri"/>
-          <w:b/>
-          <w:bCs/>
-          <w:i w:val="false"/>
-          <w:iCs w:val="false"/>
-          <w:color w:val="2BB3B1"/>
-          <w:sz w:val="20"/>
-          <w:szCs w:val="20"/>
-        </w:rPr>
-        <w:t xml:space="preserve">SAY  </w:t>
-      </w:r>
-      <w:r>
-        <w:rPr>
-          <w:rFonts w:ascii="Calibri" w:cs="Calibri" w:eastAsia="Calibri" w:hAnsi="Calibri"/>
-          <w:b w:val="false"/>
-          <w:bCs w:val="false"/>
-          <w:i/>
-          <w:iCs/>
-          <w:sz w:val="22"/>
-          <w:szCs w:val="22"/>
-        </w:rPr>
-        <w:t xml:space="preserve">The tool doesn't know anything about storm credits, and the model doesn't have to work it out. The callback sits between them and writes the answer into state.</w:t>
-      </w:r>
-    </w:p>
-    <w:p>
-      <w:pPr>
-        <w:spacing w:after="80" w:before="40" w:line="264"/>
-      </w:pPr>
-      <w:r>
-        <w:rPr>
-          <w:rFonts w:ascii="Calibri" w:cs="Calibri" w:eastAsia="Calibri" w:hAnsi="Calibri"/>
-          <w:b/>
-          <w:bCs/>
-          <w:i w:val="false"/>
-          <w:iCs w:val="false"/>
-          <w:color w:val="2BB3B1"/>
-          <w:sz w:val="20"/>
-          <w:szCs w:val="20"/>
-        </w:rPr>
-        <w:t xml:space="preserve">SAY  </w:t>
-      </w:r>
-      <w:r>
-        <w:rPr>
-          <w:rFonts w:ascii="Calibri" w:cs="Calibri" w:eastAsia="Calibri" w:hAnsi="Calibri"/>
-          <w:b w:val="false"/>
-          <w:bCs w:val="false"/>
-          <w:i/>
-          <w:iCs/>
-          <w:sz w:val="22"/>
-          <w:szCs w:val="22"/>
-        </w:rPr>
-        <w:t xml:space="preserve">Watch the Variables panel, not the chat. That flag is going to matter tomorrow when we give the agent the actual credit policy.</w:t>
+        <w:t xml:space="preserve"/>
       </w:r>
     </w:p>
     <w:tbl>
@@ -13974,24 +13985,55 @@
                 <w:sz w:val="18"/>
                 <w:szCs w:val="18"/>
               </w:rPr>
-              <w:t xml:space="preserve">RESET TO START STATE</w:t>
-            </w:r>
-          </w:p>
-          <w:p>
-            <w:pPr>
-              <w:spacing w:after="20" w:before="0" w:line="264"/>
-            </w:pPr>
-            <w:r>
-              <w:rPr>
-                <w:rFonts w:ascii="Calibri" w:cs="Calibri" w:eastAsia="Calibri" w:hAnsi="Calibri"/>
-                <w:b w:val="false"/>
-                <w:bCs w:val="false"/>
-                <w:i w:val="false"/>
-                <w:iCs w:val="false"/>
-                <w:sz w:val="21"/>
-                <w:szCs w:val="21"/>
-              </w:rPr>
-              <w:t xml:space="preserve">Continue from block 6 (eight variables exist)</w:t>
+              <w:t xml:space="preserve">DO</w:t>
+            </w:r>
+          </w:p>
+          <w:p>
+            <w:pPr>
+              <w:spacing w:after="0" w:before="0" w:line="264"/>
+            </w:pPr>
+            <w:r>
+              <w:rPr>
+                <w:rFonts w:ascii="Calibri" w:cs="Calibri" w:eastAsia="Calibri" w:hAnsi="Calibri"/>
+                <w:b w:val="false"/>
+                <w:bCs w:val="false"/>
+                <w:i w:val="false"/>
+                <w:iCs w:val="false"/>
+                <w:sz w:val="20"/>
+                <w:szCs w:val="20"/>
+              </w:rPr>
+              <w:t xml:space="preserve">Under the reply: Steps row ▸ expand (˅) ▸ Variables ▸ › ▸ Overview panel ▸ All</w:t>
+            </w:r>
+          </w:p>
+          <w:p>
+            <w:pPr>
+              <w:spacing w:after="0" w:before="60" w:line="264"/>
+            </w:pPr>
+            <w:r>
+              <w:rPr>
+                <w:rFonts w:ascii="Calibri" w:cs="Calibri" w:eastAsia="Calibri" w:hAnsi="Calibri"/>
+                <w:b/>
+                <w:bCs/>
+                <w:i w:val="false"/>
+                <w:iCs w:val="false"/>
+                <w:color w:val="2ECC71"/>
+                <w:sz w:val="19"/>
+                <w:szCs w:val="19"/>
+              </w:rPr>
+              <w:t xml:space="preserve">→ </w:t>
+            </w:r>
+            <w:r>
+              <w:rPr>
+                <w:rFonts w:ascii="Calibri" w:cs="Calibri" w:eastAsia="Calibri" w:hAnsi="Calibri"/>
+                <w:b w:val="false"/>
+                <w:bCs w:val="false"/>
+                <w:i w:val="false"/>
+                <w:iCs w:val="false"/>
+                <w:color w:val="9AA4B2"/>
+                <w:sz w:val="19"/>
+                <w:szCs w:val="19"/>
+              </w:rPr>
+              <w:t xml:space="preserve">All eight at their defaults: is_authenticated false, customer_name and account_id still empty, even though the customer just gave both. The model can't write them. Also there: current_date and _session (modality, channel), built in.</w:t>
             </w:r>
           </w:p>
         </w:tc>
@@ -13999,7 +14041,7 @@
     </w:tbl>
     <w:p>
       <w:pPr>
-        <w:spacing w:after="60" w:before="0" w:line="264"/>
+        <w:spacing w:after="20" w:before="0" w:line="264"/>
       </w:pPr>
       <w:r>
         <w:rPr>
@@ -14025,11 +14067,11 @@
           <w:bCs/>
           <w:i w:val="false"/>
           <w:iCs w:val="false"/>
-          <w:color w:val="B07CFF"/>
+          <w:color w:val="FF5C5C"/>
           <w:sz w:val="20"/>
           <w:szCs w:val="20"/>
         </w:rPr>
-        <w:t xml:space="preserve">FILES  </w:t>
+        <w:t xml:space="preserve">GOTCHA  </w:t>
       </w:r>
       <w:r>
         <w:rPr>
@@ -14038,11 +14080,120 @@
           <w:bCs w:val="false"/>
           <w:i w:val="false"/>
           <w:iCs w:val="false"/>
-          <w:color w:val="B07CFF"/>
           <w:sz w:val="20"/>
           <w:szCs w:val="20"/>
         </w:rPr>
-        <w:t xml:space="preserve">02-build/tools/check_outage.py   ·   02-build/callbacks/outage_state_after_tool.py</w:t>
+        <w:t xml:space="preserve">Instructions can READ variables; only tools and callbacks can WRITE them. The callback on slide 40 fills the last four; the tools on slide 82 fill the first four.</w:t>
+      </w:r>
+    </w:p>
+    <w:p>
+      <w:pPr>
+        <w:pStyle w:val="Heading3"/>
+        <w:keepNext/>
+        <w:spacing w:after="40" w:before="160"/>
+      </w:pPr>
+      <w:r>
+        <w:rPr>
+          <w:rFonts w:ascii="Calibri" w:cs="Calibri" w:eastAsia="Calibri" w:hAnsi="Calibri"/>
+          <w:b/>
+          <w:bCs/>
+          <w:i w:val="false"/>
+          <w:iCs w:val="false"/>
+          <w:color w:val="3D8BFF"/>
+          <w:sz w:val="22"/>
+          <w:szCs w:val="22"/>
+        </w:rPr>
+        <w:t xml:space="preserve">7. After-tool callback: turn a tool result into state   ·   M2 · SLIDE 40 [footer 45]   ·   ~8 min</w:t>
+      </w:r>
+    </w:p>
+    <w:p>
+      <w:pPr>
+        <w:spacing w:after="80" w:before="40" w:line="264"/>
+      </w:pPr>
+      <w:r>
+        <w:rPr>
+          <w:rFonts w:ascii="Calibri" w:cs="Calibri" w:eastAsia="Calibri" w:hAnsi="Calibri"/>
+          <w:b/>
+          <w:bCs/>
+          <w:i w:val="false"/>
+          <w:iCs w:val="false"/>
+          <w:color w:val="2ECC71"/>
+          <w:sz w:val="20"/>
+          <w:szCs w:val="20"/>
+        </w:rPr>
+        <w:t xml:space="preserve">WHY  </w:t>
+      </w:r>
+      <w:r>
+        <w:rPr>
+          <w:rFonts w:ascii="Calibri" w:cs="Calibri" w:eastAsia="Calibri" w:hAnsi="Calibri"/>
+          <w:b w:val="false"/>
+          <w:bCs w:val="false"/>
+          <w:i w:val="false"/>
+          <w:iCs w:val="false"/>
+          <w:sz w:val="22"/>
+          <w:szCs w:val="22"/>
+        </w:rPr>
+        <w:t xml:space="preserve">A tool returns data; the callback decides what that data means for the rest of the conversation. The eligibility rule (&gt;72 hours in a declared storm) lives in code, runs every time, and never depends on how the customer phrased anything. Every agent can now read the outage facts without calling the tool again.</w:t>
+      </w:r>
+    </w:p>
+    <w:p>
+      <w:pPr>
+        <w:spacing w:after="80" w:before="40" w:line="264"/>
+      </w:pPr>
+      <w:r>
+        <w:rPr>
+          <w:rFonts w:ascii="Calibri" w:cs="Calibri" w:eastAsia="Calibri" w:hAnsi="Calibri"/>
+          <w:b/>
+          <w:bCs/>
+          <w:i w:val="false"/>
+          <w:iCs w:val="false"/>
+          <w:color w:val="2BB3B1"/>
+          <w:sz w:val="20"/>
+          <w:szCs w:val="20"/>
+        </w:rPr>
+        <w:t xml:space="preserve">SAY  </w:t>
+      </w:r>
+      <w:r>
+        <w:rPr>
+          <w:rFonts w:ascii="Calibri" w:cs="Calibri" w:eastAsia="Calibri" w:hAnsi="Calibri"/>
+          <w:b w:val="false"/>
+          <w:bCs w:val="false"/>
+          <w:i/>
+          <w:iCs/>
+          <w:sz w:val="22"/>
+          <w:szCs w:val="22"/>
+        </w:rPr>
+        <w:t xml:space="preserve">The tool doesn't know anything about storm credits, and the model doesn't have to work it out. The callback sits between them and writes the answer into state.</w:t>
+      </w:r>
+    </w:p>
+    <w:p>
+      <w:pPr>
+        <w:spacing w:after="80" w:before="40" w:line="264"/>
+      </w:pPr>
+      <w:r>
+        <w:rPr>
+          <w:rFonts w:ascii="Calibri" w:cs="Calibri" w:eastAsia="Calibri" w:hAnsi="Calibri"/>
+          <w:b/>
+          <w:bCs/>
+          <w:i w:val="false"/>
+          <w:iCs w:val="false"/>
+          <w:color w:val="2BB3B1"/>
+          <w:sz w:val="20"/>
+          <w:szCs w:val="20"/>
+        </w:rPr>
+        <w:t xml:space="preserve">SAY  </w:t>
+      </w:r>
+      <w:r>
+        <w:rPr>
+          <w:rFonts w:ascii="Calibri" w:cs="Calibri" w:eastAsia="Calibri" w:hAnsi="Calibri"/>
+          <w:b w:val="false"/>
+          <w:bCs w:val="false"/>
+          <w:i/>
+          <w:iCs/>
+          <w:sz w:val="22"/>
+          <w:szCs w:val="22"/>
+        </w:rPr>
+        <w:t xml:space="preserve">Watch the state update in the trace, not the chat. That flag is going to matter tomorrow when we give the agent the actual credit policy.</w:t>
       </w:r>
     </w:p>
     <w:tbl>
@@ -14095,75 +14246,24 @@
                 <w:sz w:val="18"/>
                 <w:szCs w:val="18"/>
               </w:rPr>
-              <w:t xml:space="preserve">DO</w:t>
-            </w:r>
-          </w:p>
-          <w:p>
-            <w:pPr>
-              <w:spacing w:after="0" w:before="0" w:line="264"/>
-            </w:pPr>
-            <w:r>
-              <w:rPr>
-                <w:rFonts w:ascii="Calibri" w:cs="Calibri" w:eastAsia="Calibri" w:hAnsi="Calibri"/>
-                <w:b w:val="false"/>
-                <w:bCs w:val="false"/>
-                <w:i w:val="false"/>
-                <w:iCs w:val="false"/>
-                <w:sz w:val="20"/>
-                <w:szCs w:val="20"/>
-              </w:rPr>
-              <w:t xml:space="preserve">Tools ▸ check_outage placeholder ▸ select ALL its code ▸ PASTE:</w:t>
-            </w:r>
-          </w:p>
-          <w:p>
-            <w:pPr>
-              <w:spacing w:after="0" w:before="0" w:line="264"/>
-            </w:pPr>
-            <w:r>
-              <w:rPr>
-                <w:rFonts w:ascii="Calibri" w:cs="Calibri" w:eastAsia="Calibri" w:hAnsi="Calibri"/>
-                <w:b w:val="false"/>
-                <w:bCs w:val="false"/>
-                <w:i w:val="false"/>
-                <w:iCs w:val="false"/>
-                <w:sz w:val="20"/>
-                <w:szCs w:val="20"/>
-              </w:rPr>
-              <w:t xml:space="preserve">    02-build/tools/check_outage.py</w:t>
-            </w:r>
-          </w:p>
-          <w:p>
-            <w:pPr>
-              <w:spacing w:after="0" w:before="0" w:line="264"/>
-            </w:pPr>
-            <w:r>
-              <w:rPr>
-                <w:rFonts w:ascii="Calibri" w:cs="Calibri" w:eastAsia="Calibri" w:hAnsi="Calibri"/>
-                <w:b w:val="false"/>
-                <w:bCs w:val="false"/>
-                <w:i w:val="false"/>
-                <w:iCs w:val="false"/>
-                <w:sz w:val="20"/>
-                <w:szCs w:val="20"/>
-              </w:rPr>
-              <w:t xml:space="preserve">▸ Save   (only this one now; the other four on slide 82)</w:t>
-            </w:r>
-          </w:p>
-          <w:p>
-            <w:pPr>
-              <w:spacing w:after="0" w:before="0" w:line="264"/>
-            </w:pPr>
-            <w:r>
-              <w:rPr>
-                <w:rFonts w:ascii="Calibri" w:cs="Calibri" w:eastAsia="Calibri" w:hAnsi="Calibri"/>
-                <w:b w:val="false"/>
-                <w:bCs w:val="false"/>
-                <w:i w:val="false"/>
-                <w:iCs w:val="false"/>
-                <w:sz w:val="20"/>
-                <w:szCs w:val="20"/>
-              </w:rPr>
-              <w:t xml:space="preserve">outage_agent ▸ Add tool ▸ check_outage   ·   cymbal_care ▸ remove check_outage (x)</w:t>
+              <w:t xml:space="preserve">RESET TO START STATE</w:t>
+            </w:r>
+          </w:p>
+          <w:p>
+            <w:pPr>
+              <w:spacing w:after="20" w:before="0" w:line="264"/>
+            </w:pPr>
+            <w:r>
+              <w:rPr>
+                <w:rFonts w:ascii="Calibri" w:cs="Calibri" w:eastAsia="Calibri" w:hAnsi="Calibri"/>
+                <w:b w:val="false"/>
+                <w:bCs w:val="false"/>
+                <w:i w:val="false"/>
+                <w:iCs w:val="false"/>
+                <w:sz w:val="21"/>
+                <w:szCs w:val="21"/>
+              </w:rPr>
+              <w:t xml:space="preserve">Continue from block 6 (eight variables exist)</w:t>
             </w:r>
           </w:p>
         </w:tc>
@@ -14171,7 +14271,7 @@
     </w:tbl>
     <w:p>
       <w:pPr>
-        <w:spacing w:after="20" w:before="0" w:line="264"/>
+        <w:spacing w:after="60" w:before="0" w:line="264"/>
       </w:pPr>
       <w:r>
         <w:rPr>
@@ -14184,6 +14284,37 @@
           <w:szCs w:val="22"/>
         </w:rPr>
         <w:t xml:space="preserve"/>
+      </w:r>
+    </w:p>
+    <w:p>
+      <w:pPr>
+        <w:spacing w:after="80" w:before="40" w:line="264"/>
+      </w:pPr>
+      <w:r>
+        <w:rPr>
+          <w:rFonts w:ascii="Calibri" w:cs="Calibri" w:eastAsia="Calibri" w:hAnsi="Calibri"/>
+          <w:b/>
+          <w:bCs/>
+          <w:i w:val="false"/>
+          <w:iCs w:val="false"/>
+          <w:color w:val="B07CFF"/>
+          <w:sz w:val="20"/>
+          <w:szCs w:val="20"/>
+        </w:rPr>
+        <w:t xml:space="preserve">FILES  </w:t>
+      </w:r>
+      <w:r>
+        <w:rPr>
+          <w:rFonts w:ascii="Calibri" w:cs="Calibri" w:eastAsia="Calibri" w:hAnsi="Calibri"/>
+          <w:b w:val="false"/>
+          <w:bCs w:val="false"/>
+          <w:i w:val="false"/>
+          <w:iCs w:val="false"/>
+          <w:color w:val="B07CFF"/>
+          <w:sz w:val="20"/>
+          <w:szCs w:val="20"/>
+        </w:rPr>
+        <w:t xml:space="preserve">02-build/tools/check_outage.py   ·   02-build/callbacks/outage_state_after_tool.py</w:t>
       </w:r>
     </w:p>
     <w:tbl>
@@ -14253,7 +14384,7 @@
                 <w:sz w:val="20"/>
                 <w:szCs w:val="20"/>
               </w:rPr>
-              <w:t xml:space="preserve">outage_agent title bar ▸ Add callback ▸ After tool ▸ PASTE:</w:t>
+              <w:t xml:space="preserve">Tools ▸ check_outage placeholder ▸ select ALL its code ▸ PASTE:</w:t>
             </w:r>
           </w:p>
           <w:p>
@@ -14270,7 +14401,7 @@
                 <w:sz w:val="20"/>
                 <w:szCs w:val="20"/>
               </w:rPr>
-              <w:t xml:space="preserve">    02-build/callbacks/outage_state_after_tool.py</w:t>
+              <w:t xml:space="preserve">    02-build/tools/check_outage.py</w:t>
             </w:r>
           </w:p>
           <w:p>
@@ -14287,7 +14418,24 @@
                 <w:sz w:val="20"/>
                 <w:szCs w:val="20"/>
               </w:rPr>
-              <w:t xml:space="preserve">▸ Done ▸ Save</w:t>
+              <w:t xml:space="preserve">▸ Save   (only this one now; the other four on slide 82)</w:t>
+            </w:r>
+          </w:p>
+          <w:p>
+            <w:pPr>
+              <w:spacing w:after="0" w:before="0" w:line="264"/>
+            </w:pPr>
+            <w:r>
+              <w:rPr>
+                <w:rFonts w:ascii="Calibri" w:cs="Calibri" w:eastAsia="Calibri" w:hAnsi="Calibri"/>
+                <w:b w:val="false"/>
+                <w:bCs w:val="false"/>
+                <w:i w:val="false"/>
+                <w:iCs w:val="false"/>
+                <w:sz w:val="20"/>
+                <w:szCs w:val="20"/>
+              </w:rPr>
+              <w:t xml:space="preserve">outage_agent ▸ Add tool ▸ check_outage   ·   cymbal_care ▸ remove check_outage (x)</w:t>
             </w:r>
           </w:p>
         </w:tc>
@@ -14333,10 +14481,10 @@
           <w:tcPr>
             <w:tcW w:type="dxa" w:w="10080"/>
             <w:tcBorders>
-              <w:top w:val="single" w:color="F28C28" w:sz="12"/>
-              <w:left w:val="single" w:color="F28C28" w:sz="36"/>
-              <w:bottom w:val="single" w:color="F28C28" w:sz="12"/>
-              <w:right w:val="single" w:color="F28C28" w:sz="12"/>
+              <w:top w:val="single" w:color="B07CFF" w:sz="12"/>
+              <w:left w:val="single" w:color="B07CFF" w:sz="12"/>
+              <w:bottom w:val="single" w:color="B07CFF" w:sz="12"/>
+              <w:right w:val="single" w:color="B07CFF" w:sz="12"/>
             </w:tcBorders>
             <w:tcMar>
               <w:top w:type="dxa" w:w="80"/>
@@ -14356,11 +14504,11 @@
                 <w:bCs/>
                 <w:i w:val="false"/>
                 <w:iCs w:val="false"/>
-                <w:color w:val="F28C28"/>
+                <w:color w:val="B07CFF"/>
                 <w:sz w:val="18"/>
                 <w:szCs w:val="18"/>
               </w:rPr>
-              <w:t xml:space="preserve">TYPE at the end of the outage_agent instructions (use the { menu) ▸ Save</w:t>
+              <w:t xml:space="preserve">DO</w:t>
             </w:r>
           </w:p>
           <w:p>
@@ -14369,15 +14517,49 @@
             </w:pPr>
             <w:r>
               <w:rPr>
-                <w:rFonts w:ascii="Consolas" w:cs="Consolas" w:eastAsia="Consolas" w:hAnsi="Consolas"/>
-                <w:b w:val="false"/>
-                <w:bCs w:val="false"/>
-                <w:i w:val="false"/>
-                <w:iCs w:val="false"/>
-                <w:sz w:val="19"/>
-                <w:szCs w:val="19"/>
-              </w:rPr>
-              <w:t xml:space="preserve">If {storm_credit_eligible} is true, tell the customer they may qualify for a storm hardship credit and offer to explain how to request it.</w:t>
+                <w:rFonts w:ascii="Calibri" w:cs="Calibri" w:eastAsia="Calibri" w:hAnsi="Calibri"/>
+                <w:b w:val="false"/>
+                <w:bCs w:val="false"/>
+                <w:i w:val="false"/>
+                <w:iCs w:val="false"/>
+                <w:sz w:val="20"/>
+                <w:szCs w:val="20"/>
+              </w:rPr>
+              <w:t xml:space="preserve">outage_agent title bar ▸ Add callback ▸ After tool ▸ PASTE:</w:t>
+            </w:r>
+          </w:p>
+          <w:p>
+            <w:pPr>
+              <w:spacing w:after="0" w:before="0" w:line="264"/>
+            </w:pPr>
+            <w:r>
+              <w:rPr>
+                <w:rFonts w:ascii="Calibri" w:cs="Calibri" w:eastAsia="Calibri" w:hAnsi="Calibri"/>
+                <w:b w:val="false"/>
+                <w:bCs w:val="false"/>
+                <w:i w:val="false"/>
+                <w:iCs w:val="false"/>
+                <w:sz w:val="20"/>
+                <w:szCs w:val="20"/>
+              </w:rPr>
+              <w:t xml:space="preserve">    02-build/callbacks/outage_state_after_tool.py</w:t>
+            </w:r>
+          </w:p>
+          <w:p>
+            <w:pPr>
+              <w:spacing w:after="0" w:before="0" w:line="264"/>
+            </w:pPr>
+            <w:r>
+              <w:rPr>
+                <w:rFonts w:ascii="Calibri" w:cs="Calibri" w:eastAsia="Calibri" w:hAnsi="Calibri"/>
+                <w:b w:val="false"/>
+                <w:bCs w:val="false"/>
+                <w:i w:val="false"/>
+                <w:iCs w:val="false"/>
+                <w:sz w:val="20"/>
+                <w:szCs w:val="20"/>
+              </w:rPr>
+              <w:t xml:space="preserve">▸ Done ▸ Save</w:t>
             </w:r>
           </w:p>
         </w:tc>
@@ -14450,7 +14632,7 @@
                 <w:sz w:val="18"/>
                 <w:szCs w:val="18"/>
               </w:rPr>
-              <w:t xml:space="preserve">TYPE in Preview ▸ NEW CONVERSATION · open the Variables panel first</w:t>
+              <w:t xml:space="preserve">TYPE at the end of the outage_agent instructions (use the { menu) ▸ Save</w:t>
             </w:r>
           </w:p>
           <w:p>
@@ -14467,38 +14649,7 @@
                 <w:sz w:val="19"/>
                 <w:szCs w:val="19"/>
               </w:rPr>
-              <w:t xml:space="preserve">My power has been out since the storm. I'm in 39567.</w:t>
-            </w:r>
-          </w:p>
-          <w:p>
-            <w:pPr>
-              <w:spacing w:after="0" w:before="60" w:line="264"/>
-            </w:pPr>
-            <w:r>
-              <w:rPr>
-                <w:rFonts w:ascii="Calibri" w:cs="Calibri" w:eastAsia="Calibri" w:hAnsi="Calibri"/>
-                <w:b/>
-                <w:bCs/>
-                <w:i w:val="false"/>
-                <w:iCs w:val="false"/>
-                <w:color w:val="2ECC71"/>
-                <w:sz w:val="19"/>
-                <w:szCs w:val="19"/>
-              </w:rPr>
-              <w:t xml:space="preserve">→ </w:t>
-            </w:r>
-            <w:r>
-              <w:rPr>
-                <w:rFonts w:ascii="Calibri" w:cs="Calibri" w:eastAsia="Calibri" w:hAnsi="Calibri"/>
-                <w:b w:val="false"/>
-                <w:bCs w:val="false"/>
-                <w:i w:val="false"/>
-                <w:iCs w:val="false"/>
-                <w:color w:val="9AA4B2"/>
-                <w:sz w:val="19"/>
-                <w:szCs w:val="19"/>
-              </w:rPr>
-              <w:t xml:space="preserve">Trace: check_outage, then the after-tool callback and its [after_tool] print line. Variables fill in: outage_id OUT-58812, estimated_restoration 11:00 PM tonight, hours_without_power 76, storm_credit_eligible true. The agent mentions a possible storm credit.</w:t>
+              <w:t xml:space="preserve">If {storm_credit_eligible} is true, tell the customer they may qualify for a storm hardship credit and offer to explain how to request it.</w:t>
             </w:r>
           </w:p>
         </w:tc>
@@ -14571,7 +14722,7 @@
                 <w:sz w:val="18"/>
                 <w:szCs w:val="18"/>
               </w:rPr>
-              <w:t xml:space="preserve">TYPE in Preview ▸ NEW CONVERSATION (the contrast)</w:t>
+              <w:t xml:space="preserve">TYPE in Preview ▸ NEW CONVERSATION · keep the trace open</w:t>
             </w:r>
           </w:p>
           <w:p>
@@ -14588,7 +14739,7 @@
                 <w:sz w:val="19"/>
                 <w:szCs w:val="19"/>
               </w:rPr>
-              <w:t xml:space="preserve">My lights went out about two hours ago. ZIP 39562.</w:t>
+              <w:t xml:space="preserve">My power has been out since the storm. I'm in 39567.</w:t>
             </w:r>
           </w:p>
           <w:p>
@@ -14619,7 +14770,7 @@
                 <w:sz w:val="19"/>
                 <w:szCs w:val="19"/>
               </w:rPr>
-              <w:t xml:space="preserve">OUT-58840, 2 hours, no storm event: storm_credit_eligible false, and no credit mention.</w:t>
+              <w:t xml:space="preserve">Trace: check_outage, then the after-tool callback and its [after_tool] print line. The agent mentions a possible storm credit.</w:t>
             </w:r>
           </w:p>
         </w:tc>
@@ -14640,146 +14791,6 @@
           <w:szCs w:val="22"/>
         </w:rPr>
         <w:t xml:space="preserve"/>
-      </w:r>
-    </w:p>
-    <w:p>
-      <w:pPr>
-        <w:spacing w:after="80" w:before="40" w:line="264"/>
-      </w:pPr>
-      <w:r>
-        <w:rPr>
-          <w:rFonts w:ascii="Calibri" w:cs="Calibri" w:eastAsia="Calibri" w:hAnsi="Calibri"/>
-          <w:b/>
-          <w:bCs/>
-          <w:i w:val="false"/>
-          <w:iCs w:val="false"/>
-          <w:color w:val="FF5C5C"/>
-          <w:sz w:val="20"/>
-          <w:szCs w:val="20"/>
-        </w:rPr>
-        <w:t xml:space="preserve">GOTCHA  </w:t>
-      </w:r>
-      <w:r>
-        <w:rPr>
-          <w:rFonts w:ascii="Calibri" w:cs="Calibri" w:eastAsia="Calibri" w:hAnsi="Calibri"/>
-          <w:b w:val="false"/>
-          <w:bCs w:val="false"/>
-          <w:i w:val="false"/>
-          <w:iCs w:val="false"/>
-          <w:sz w:val="20"/>
-          <w:szCs w:val="20"/>
-        </w:rPr>
-        <w:t xml:space="preserve">If Save rejects the signature, check the callback type is After tool (not After model). No [after_tool] line in the trace: the callback is on the wrong agent (it must be on the agent that CALLS check_outage). If a variable doesn't update, compare its name with the Variables panel: they must match exactly.</w:t>
-      </w:r>
-    </w:p>
-    <w:p>
-      <w:pPr>
-        <w:pStyle w:val="Heading3"/>
-        <w:keepNext/>
-        <w:spacing w:after="40" w:before="160"/>
-      </w:pPr>
-      <w:r>
-        <w:rPr>
-          <w:rFonts w:ascii="Calibri" w:cs="Calibri" w:eastAsia="Calibri" w:hAnsi="Calibri"/>
-          <w:b/>
-          <w:bCs/>
-          <w:i w:val="false"/>
-          <w:iCs w:val="false"/>
-          <w:color w:val="3D8BFF"/>
-          <w:sz w:val="22"/>
-          <w:szCs w:val="22"/>
-        </w:rPr>
-        <w:t xml:space="preserve">8. Python tools replace the placeholders; business rules live in code   ·   M2 · SLIDE 82 [footer 88]   ·   ~5 min</w:t>
-      </w:r>
-    </w:p>
-    <w:p>
-      <w:pPr>
-        <w:spacing w:after="80" w:before="40" w:line="264"/>
-      </w:pPr>
-      <w:r>
-        <w:rPr>
-          <w:rFonts w:ascii="Calibri" w:cs="Calibri" w:eastAsia="Calibri" w:hAnsi="Calibri"/>
-          <w:b/>
-          <w:bCs/>
-          <w:i w:val="false"/>
-          <w:iCs w:val="false"/>
-          <w:color w:val="2ECC71"/>
-          <w:sz w:val="20"/>
-          <w:szCs w:val="20"/>
-        </w:rPr>
-        <w:t xml:space="preserve">WHY  </w:t>
-      </w:r>
-      <w:r>
-        <w:rPr>
-          <w:rFonts w:ascii="Calibri" w:cs="Calibri" w:eastAsia="Calibri" w:hAnsi="Calibri"/>
-          <w:b w:val="false"/>
-          <w:bCs w:val="false"/>
-          <w:i w:val="false"/>
-          <w:iCs w:val="false"/>
-          <w:sz w:val="22"/>
-          <w:szCs w:val="22"/>
-        </w:rPr>
-        <w:t xml:space="preserve">The payment-arrangement rules ($100 minimum, 2–6 months, one per 12 months) live in create_payment_arrangement, not in a prompt. Slide 52: don't replicate back-end logic in the agent.</w:t>
-      </w:r>
-    </w:p>
-    <w:p>
-      <w:pPr>
-        <w:spacing w:after="80" w:before="40" w:line="264"/>
-      </w:pPr>
-      <w:r>
-        <w:rPr>
-          <w:rFonts w:ascii="Calibri" w:cs="Calibri" w:eastAsia="Calibri" w:hAnsi="Calibri"/>
-          <w:b/>
-          <w:bCs/>
-          <w:i w:val="false"/>
-          <w:iCs w:val="false"/>
-          <w:color w:val="2BB3B1"/>
-          <w:sz w:val="20"/>
-          <w:szCs w:val="20"/>
-        </w:rPr>
-        <w:t xml:space="preserve">SAY  </w:t>
-      </w:r>
-      <w:r>
-        <w:rPr>
-          <w:rFonts w:ascii="Calibri" w:cs="Calibri" w:eastAsia="Calibri" w:hAnsi="Calibri"/>
-          <w:b w:val="false"/>
-          <w:bCs w:val="false"/>
-          <w:i/>
-          <w:iCs/>
-          <w:sz w:val="22"/>
-          <w:szCs w:val="22"/>
-        </w:rPr>
-        <w:t xml:space="preserve">Start with AI stubbed out these five tools this morning. The names came from the tool catalog in the requirements doc; now they get real code. The docstring is the tool description the model reads: write it for the model, like a job aid.</w:t>
-      </w:r>
-    </w:p>
-    <w:p>
-      <w:pPr>
-        <w:spacing w:after="80" w:before="40" w:line="264"/>
-      </w:pPr>
-      <w:r>
-        <w:rPr>
-          <w:rFonts w:ascii="Calibri" w:cs="Calibri" w:eastAsia="Calibri" w:hAnsi="Calibri"/>
-          <w:b/>
-          <w:bCs/>
-          <w:i w:val="false"/>
-          <w:iCs w:val="false"/>
-          <w:color w:val="2BB3B1"/>
-          <w:sz w:val="20"/>
-          <w:szCs w:val="20"/>
-        </w:rPr>
-        <w:t xml:space="preserve">SAY  </w:t>
-      </w:r>
-      <w:r>
-        <w:rPr>
-          <w:rFonts w:ascii="Calibri" w:cs="Calibri" w:eastAsia="Calibri" w:hAnsi="Calibri"/>
-          <w:b w:val="false"/>
-          <w:bCs w:val="false"/>
-          <w:i/>
-          <w:iCs/>
-          <w:sz w:val="22"/>
-          <w:szCs w:val="22"/>
-        </w:rPr>
-        <w:t xml:space="preserve">Look where the payment-arrangement rules live: in create_payment_arrangement. The prompt can be wrong; the tool can't be talked out of the rule.</w:t>
       </w:r>
     </w:p>
     <w:tbl>
@@ -14832,24 +14843,55 @@
                 <w:sz w:val="18"/>
                 <w:szCs w:val="18"/>
               </w:rPr>
-              <w:t xml:space="preserve">RESET TO START STATE</w:t>
-            </w:r>
-          </w:p>
-          <w:p>
-            <w:pPr>
-              <w:spacing w:after="20" w:before="0" w:line="264"/>
-            </w:pPr>
-            <w:r>
-              <w:rPr>
-                <w:rFonts w:ascii="Calibri" w:cs="Calibri" w:eastAsia="Calibri" w:hAnsi="Calibri"/>
-                <w:b w:val="false"/>
-                <w:bCs w:val="false"/>
-                <w:i w:val="false"/>
-                <w:iCs w:val="false"/>
-                <w:sz w:val="21"/>
-                <w:szCs w:val="21"/>
-              </w:rPr>
-              <w:t xml:space="preserve">Continue from block 7</w:t>
+              <w:t xml:space="preserve">DO</w:t>
+            </w:r>
+          </w:p>
+          <w:p>
+            <w:pPr>
+              <w:spacing w:after="0" w:before="0" w:line="264"/>
+            </w:pPr>
+            <w:r>
+              <w:rPr>
+                <w:rFonts w:ascii="Calibri" w:cs="Calibri" w:eastAsia="Calibri" w:hAnsi="Calibri"/>
+                <w:b w:val="false"/>
+                <w:bCs w:val="false"/>
+                <w:i w:val="false"/>
+                <w:iCs w:val="false"/>
+                <w:sz w:val="20"/>
+                <w:szCs w:val="20"/>
+              </w:rPr>
+              <w:t xml:space="preserve">Under the reply: Steps row ▸ expand (˅) ▸ Variables (4 updated) ▸ › ▸ Overview panel ▸ Updated</w:t>
+            </w:r>
+          </w:p>
+          <w:p>
+            <w:pPr>
+              <w:spacing w:after="0" w:before="60" w:line="264"/>
+            </w:pPr>
+            <w:r>
+              <w:rPr>
+                <w:rFonts w:ascii="Calibri" w:cs="Calibri" w:eastAsia="Calibri" w:hAnsi="Calibri"/>
+                <w:b/>
+                <w:bCs/>
+                <w:i w:val="false"/>
+                <w:iCs w:val="false"/>
+                <w:color w:val="2ECC71"/>
+                <w:sz w:val="19"/>
+                <w:szCs w:val="19"/>
+              </w:rPr>
+              <w:t xml:space="preserve">→ </w:t>
+            </w:r>
+            <w:r>
+              <w:rPr>
+                <w:rFonts w:ascii="Calibri" w:cs="Calibri" w:eastAsia="Calibri" w:hAnsi="Calibri"/>
+                <w:b w:val="false"/>
+                <w:bCs w:val="false"/>
+                <w:i w:val="false"/>
+                <w:iCs w:val="false"/>
+                <w:color w:val="9AA4B2"/>
+                <w:sz w:val="19"/>
+                <w:szCs w:val="19"/>
+              </w:rPr>
+              <w:t xml:space="preserve">Filled by the callback (blue dot = changed this turn): outage_id OUT-58812, estimated_restoration 11:00 PM tonight, hours_without_power 76, storm_credit_eligible true. The first four are still empty: nobody has verified yet.</w:t>
             </w:r>
           </w:p>
         </w:tc>
@@ -14857,7 +14899,7 @@
     </w:tbl>
     <w:p>
       <w:pPr>
-        <w:spacing w:after="60" w:before="0" w:line="264"/>
+        <w:spacing w:after="20" w:before="0" w:line="264"/>
       </w:pPr>
       <w:r>
         <w:rPr>
@@ -14870,37 +14912,6 @@
           <w:szCs w:val="22"/>
         </w:rPr>
         <w:t xml:space="preserve"/>
-      </w:r>
-    </w:p>
-    <w:p>
-      <w:pPr>
-        <w:spacing w:after="80" w:before="40" w:line="264"/>
-      </w:pPr>
-      <w:r>
-        <w:rPr>
-          <w:rFonts w:ascii="Calibri" w:cs="Calibri" w:eastAsia="Calibri" w:hAnsi="Calibri"/>
-          <w:b/>
-          <w:bCs/>
-          <w:i w:val="false"/>
-          <w:iCs w:val="false"/>
-          <w:color w:val="B07CFF"/>
-          <w:sz w:val="20"/>
-          <w:szCs w:val="20"/>
-        </w:rPr>
-        <w:t xml:space="preserve">FILES  </w:t>
-      </w:r>
-      <w:r>
-        <w:rPr>
-          <w:rFonts w:ascii="Calibri" w:cs="Calibri" w:eastAsia="Calibri" w:hAnsi="Calibri"/>
-          <w:b w:val="false"/>
-          <w:bCs w:val="false"/>
-          <w:i w:val="false"/>
-          <w:iCs w:val="false"/>
-          <w:color w:val="B07CFF"/>
-          <w:sz w:val="20"/>
-          <w:szCs w:val="20"/>
-        </w:rPr>
-        <w:t xml:space="preserve">02-build/tools/ (4 .py files: verify_customer, report_outage, get_bill_summary, create_payment_arrangement)</w:t>
       </w:r>
     </w:p>
     <w:tbl>
@@ -14926,10 +14937,10 @@
           <w:tcPr>
             <w:tcW w:type="dxa" w:w="10080"/>
             <w:tcBorders>
-              <w:top w:val="single" w:color="B07CFF" w:sz="12"/>
-              <w:left w:val="single" w:color="B07CFF" w:sz="12"/>
-              <w:bottom w:val="single" w:color="B07CFF" w:sz="12"/>
-              <w:right w:val="single" w:color="B07CFF" w:sz="12"/>
+              <w:top w:val="single" w:color="F28C28" w:sz="12"/>
+              <w:left w:val="single" w:color="F28C28" w:sz="36"/>
+              <w:bottom w:val="single" w:color="F28C28" w:sz="12"/>
+              <w:right w:val="single" w:color="F28C28" w:sz="12"/>
             </w:tcBorders>
             <w:tcMar>
               <w:top w:type="dxa" w:w="80"/>
@@ -14949,11 +14960,11 @@
                 <w:bCs/>
                 <w:i w:val="false"/>
                 <w:iCs w:val="false"/>
-                <w:color w:val="B07CFF"/>
+                <w:color w:val="F28C28"/>
                 <w:sz w:val="18"/>
                 <w:szCs w:val="18"/>
               </w:rPr>
-              <w:t xml:space="preserve">DO</w:t>
+              <w:t xml:space="preserve">TYPE in Preview ▸ NEW CONVERSATION (the contrast)</w:t>
             </w:r>
           </w:p>
           <w:p>
@@ -14962,83 +14973,46 @@
             </w:pPr>
             <w:r>
               <w:rPr>
-                <w:rFonts w:ascii="Calibri" w:cs="Calibri" w:eastAsia="Calibri" w:hAnsi="Calibri"/>
-                <w:b w:val="false"/>
-                <w:bCs w:val="false"/>
-                <w:i w:val="false"/>
-                <w:iCs w:val="false"/>
-                <w:sz w:val="20"/>
-                <w:szCs w:val="20"/>
-              </w:rPr>
-              <w:t xml:space="preserve">Tools (right side) ▸ open each remaining Start with AI placeholder ▸ select ALL its code ▸ PASTE the matching file ▸ Save. From 02-build/tools (check_outage.py was done on slide 40):</w:t>
-            </w:r>
-          </w:p>
-          <w:p>
-            <w:pPr>
-              <w:spacing w:after="0" w:before="0" w:line="264"/>
-            </w:pPr>
-            <w:r>
-              <w:rPr>
-                <w:rFonts w:ascii="Calibri" w:cs="Calibri" w:eastAsia="Calibri" w:hAnsi="Calibri"/>
-                <w:b w:val="false"/>
-                <w:bCs w:val="false"/>
-                <w:i w:val="false"/>
-                <w:iCs w:val="false"/>
-                <w:sz w:val="20"/>
-                <w:szCs w:val="20"/>
-              </w:rPr>
-              <w:t xml:space="preserve">    verify_customer.py</w:t>
-            </w:r>
-          </w:p>
-          <w:p>
-            <w:pPr>
-              <w:spacing w:after="0" w:before="0" w:line="264"/>
-            </w:pPr>
-            <w:r>
-              <w:rPr>
-                <w:rFonts w:ascii="Calibri" w:cs="Calibri" w:eastAsia="Calibri" w:hAnsi="Calibri"/>
-                <w:b w:val="false"/>
-                <w:bCs w:val="false"/>
-                <w:i w:val="false"/>
-                <w:iCs w:val="false"/>
-                <w:sz w:val="20"/>
-                <w:szCs w:val="20"/>
-              </w:rPr>
-              <w:t xml:space="preserve">    report_outage.py</w:t>
-            </w:r>
-          </w:p>
-          <w:p>
-            <w:pPr>
-              <w:spacing w:after="0" w:before="0" w:line="264"/>
-            </w:pPr>
-            <w:r>
-              <w:rPr>
-                <w:rFonts w:ascii="Calibri" w:cs="Calibri" w:eastAsia="Calibri" w:hAnsi="Calibri"/>
-                <w:b w:val="false"/>
-                <w:bCs w:val="false"/>
-                <w:i w:val="false"/>
-                <w:iCs w:val="false"/>
-                <w:sz w:val="20"/>
-                <w:szCs w:val="20"/>
-              </w:rPr>
-              <w:t xml:space="preserve">    get_bill_summary.py</w:t>
-            </w:r>
-          </w:p>
-          <w:p>
-            <w:pPr>
-              <w:spacing w:after="0" w:before="0" w:line="264"/>
-            </w:pPr>
-            <w:r>
-              <w:rPr>
-                <w:rFonts w:ascii="Calibri" w:cs="Calibri" w:eastAsia="Calibri" w:hAnsi="Calibri"/>
-                <w:b w:val="false"/>
-                <w:bCs w:val="false"/>
-                <w:i w:val="false"/>
-                <w:iCs w:val="false"/>
-                <w:sz w:val="20"/>
-                <w:szCs w:val="20"/>
-              </w:rPr>
-              <w:t xml:space="preserve">    create_payment_arrangement.py</w:t>
+                <w:rFonts w:ascii="Consolas" w:cs="Consolas" w:eastAsia="Consolas" w:hAnsi="Consolas"/>
+                <w:b w:val="false"/>
+                <w:bCs w:val="false"/>
+                <w:i w:val="false"/>
+                <w:iCs w:val="false"/>
+                <w:sz w:val="19"/>
+                <w:szCs w:val="19"/>
+              </w:rPr>
+              <w:t xml:space="preserve">My lights went out about two hours ago. ZIP 39562.</w:t>
+            </w:r>
+          </w:p>
+          <w:p>
+            <w:pPr>
+              <w:spacing w:after="0" w:before="60" w:line="264"/>
+            </w:pPr>
+            <w:r>
+              <w:rPr>
+                <w:rFonts w:ascii="Calibri" w:cs="Calibri" w:eastAsia="Calibri" w:hAnsi="Calibri"/>
+                <w:b/>
+                <w:bCs/>
+                <w:i w:val="false"/>
+                <w:iCs w:val="false"/>
+                <w:color w:val="2ECC71"/>
+                <w:sz w:val="19"/>
+                <w:szCs w:val="19"/>
+              </w:rPr>
+              <w:t xml:space="preserve">→ </w:t>
+            </w:r>
+            <w:r>
+              <w:rPr>
+                <w:rFonts w:ascii="Calibri" w:cs="Calibri" w:eastAsia="Calibri" w:hAnsi="Calibri"/>
+                <w:b w:val="false"/>
+                <w:bCs w:val="false"/>
+                <w:i w:val="false"/>
+                <w:iCs w:val="false"/>
+                <w:color w:val="9AA4B2"/>
+                <w:sz w:val="19"/>
+                <w:szCs w:val="19"/>
+              </w:rPr>
+              <w:t xml:space="preserve">OUT-58840, 2 hours, no storm event: storm_credit_eligible false, and no credit mention.</w:t>
             </w:r>
           </w:p>
         </w:tc>
@@ -15059,6 +15033,146 @@
           <w:szCs w:val="22"/>
         </w:rPr>
         <w:t xml:space="preserve"/>
+      </w:r>
+    </w:p>
+    <w:p>
+      <w:pPr>
+        <w:spacing w:after="80" w:before="40" w:line="264"/>
+      </w:pPr>
+      <w:r>
+        <w:rPr>
+          <w:rFonts w:ascii="Calibri" w:cs="Calibri" w:eastAsia="Calibri" w:hAnsi="Calibri"/>
+          <w:b/>
+          <w:bCs/>
+          <w:i w:val="false"/>
+          <w:iCs w:val="false"/>
+          <w:color w:val="FF5C5C"/>
+          <w:sz w:val="20"/>
+          <w:szCs w:val="20"/>
+        </w:rPr>
+        <w:t xml:space="preserve">GOTCHA  </w:t>
+      </w:r>
+      <w:r>
+        <w:rPr>
+          <w:rFonts w:ascii="Calibri" w:cs="Calibri" w:eastAsia="Calibri" w:hAnsi="Calibri"/>
+          <w:b w:val="false"/>
+          <w:bCs w:val="false"/>
+          <w:i w:val="false"/>
+          <w:iCs w:val="false"/>
+          <w:sz w:val="20"/>
+          <w:szCs w:val="20"/>
+        </w:rPr>
+        <w:t xml:space="preserve">If Save rejects the signature, check the callback type is After tool (not After model). No [after_tool] line in the trace: the callback is on the wrong agent (it must be on the agent that CALLS check_outage). If a variable doesn't update, compare its name with the Variables panel: they must match exactly.</w:t>
+      </w:r>
+    </w:p>
+    <w:p>
+      <w:pPr>
+        <w:pStyle w:val="Heading3"/>
+        <w:keepNext/>
+        <w:spacing w:after="40" w:before="160"/>
+      </w:pPr>
+      <w:r>
+        <w:rPr>
+          <w:rFonts w:ascii="Calibri" w:cs="Calibri" w:eastAsia="Calibri" w:hAnsi="Calibri"/>
+          <w:b/>
+          <w:bCs/>
+          <w:i w:val="false"/>
+          <w:iCs w:val="false"/>
+          <w:color w:val="3D8BFF"/>
+          <w:sz w:val="22"/>
+          <w:szCs w:val="22"/>
+        </w:rPr>
+        <w:t xml:space="preserve">8. Python tools replace the placeholders; business rules live in code   ·   M2 · SLIDE 82 [footer 88]   ·   ~5 min</w:t>
+      </w:r>
+    </w:p>
+    <w:p>
+      <w:pPr>
+        <w:spacing w:after="80" w:before="40" w:line="264"/>
+      </w:pPr>
+      <w:r>
+        <w:rPr>
+          <w:rFonts w:ascii="Calibri" w:cs="Calibri" w:eastAsia="Calibri" w:hAnsi="Calibri"/>
+          <w:b/>
+          <w:bCs/>
+          <w:i w:val="false"/>
+          <w:iCs w:val="false"/>
+          <w:color w:val="2ECC71"/>
+          <w:sz w:val="20"/>
+          <w:szCs w:val="20"/>
+        </w:rPr>
+        <w:t xml:space="preserve">WHY  </w:t>
+      </w:r>
+      <w:r>
+        <w:rPr>
+          <w:rFonts w:ascii="Calibri" w:cs="Calibri" w:eastAsia="Calibri" w:hAnsi="Calibri"/>
+          <w:b w:val="false"/>
+          <w:bCs w:val="false"/>
+          <w:i w:val="false"/>
+          <w:iCs w:val="false"/>
+          <w:sz w:val="22"/>
+          <w:szCs w:val="22"/>
+        </w:rPr>
+        <w:t xml:space="preserve">The payment-arrangement rules ($100 minimum, 2–6 months, one per 12 months) live in create_payment_arrangement, not in a prompt. Slide 52: don't replicate back-end logic in the agent.</w:t>
+      </w:r>
+    </w:p>
+    <w:p>
+      <w:pPr>
+        <w:spacing w:after="80" w:before="40" w:line="264"/>
+      </w:pPr>
+      <w:r>
+        <w:rPr>
+          <w:rFonts w:ascii="Calibri" w:cs="Calibri" w:eastAsia="Calibri" w:hAnsi="Calibri"/>
+          <w:b/>
+          <w:bCs/>
+          <w:i w:val="false"/>
+          <w:iCs w:val="false"/>
+          <w:color w:val="2BB3B1"/>
+          <w:sz w:val="20"/>
+          <w:szCs w:val="20"/>
+        </w:rPr>
+        <w:t xml:space="preserve">SAY  </w:t>
+      </w:r>
+      <w:r>
+        <w:rPr>
+          <w:rFonts w:ascii="Calibri" w:cs="Calibri" w:eastAsia="Calibri" w:hAnsi="Calibri"/>
+          <w:b w:val="false"/>
+          <w:bCs w:val="false"/>
+          <w:i/>
+          <w:iCs/>
+          <w:sz w:val="22"/>
+          <w:szCs w:val="22"/>
+        </w:rPr>
+        <w:t xml:space="preserve">Start with AI stubbed out these five tools this morning. The names came from the tool catalog in the requirements doc; now they get real code. The docstring is the tool description the model reads: write it for the model, like a job aid.</w:t>
+      </w:r>
+    </w:p>
+    <w:p>
+      <w:pPr>
+        <w:spacing w:after="80" w:before="40" w:line="264"/>
+      </w:pPr>
+      <w:r>
+        <w:rPr>
+          <w:rFonts w:ascii="Calibri" w:cs="Calibri" w:eastAsia="Calibri" w:hAnsi="Calibri"/>
+          <w:b/>
+          <w:bCs/>
+          <w:i w:val="false"/>
+          <w:iCs w:val="false"/>
+          <w:color w:val="2BB3B1"/>
+          <w:sz w:val="20"/>
+          <w:szCs w:val="20"/>
+        </w:rPr>
+        <w:t xml:space="preserve">SAY  </w:t>
+      </w:r>
+      <w:r>
+        <w:rPr>
+          <w:rFonts w:ascii="Calibri" w:cs="Calibri" w:eastAsia="Calibri" w:hAnsi="Calibri"/>
+          <w:b w:val="false"/>
+          <w:bCs w:val="false"/>
+          <w:i/>
+          <w:iCs/>
+          <w:sz w:val="22"/>
+          <w:szCs w:val="22"/>
+        </w:rPr>
+        <w:t xml:space="preserve">Look where the payment-arrangement rules live: in create_payment_arrangement. The prompt can be wrong; the tool can't be talked out of the rule.</w:t>
       </w:r>
     </w:p>
     <w:tbl>
@@ -15111,55 +15225,24 @@
                 <w:sz w:val="18"/>
                 <w:szCs w:val="18"/>
               </w:rPr>
-              <w:t xml:space="preserve">DO</w:t>
-            </w:r>
-          </w:p>
-          <w:p>
-            <w:pPr>
-              <w:spacing w:after="0" w:before="0" w:line="264"/>
-            </w:pPr>
-            <w:r>
-              <w:rPr>
-                <w:rFonts w:ascii="Calibri" w:cs="Calibri" w:eastAsia="Calibri" w:hAnsi="Calibri"/>
-                <w:b w:val="false"/>
-                <w:bCs w:val="false"/>
-                <w:i w:val="false"/>
-                <w:iCs w:val="false"/>
-                <w:sz w:val="20"/>
-                <w:szCs w:val="20"/>
-              </w:rPr>
-              <w:t xml:space="preserve">create_payment_arrangement ▸ Test Tool ▸ installments = 12</w:t>
-            </w:r>
-          </w:p>
-          <w:p>
-            <w:pPr>
-              <w:spacing w:after="0" w:before="60" w:line="264"/>
-            </w:pPr>
-            <w:r>
-              <w:rPr>
-                <w:rFonts w:ascii="Calibri" w:cs="Calibri" w:eastAsia="Calibri" w:hAnsi="Calibri"/>
-                <w:b/>
-                <w:bCs/>
-                <w:i w:val="false"/>
-                <w:iCs w:val="false"/>
-                <w:color w:val="2ECC71"/>
-                <w:sz w:val="19"/>
-                <w:szCs w:val="19"/>
-              </w:rPr>
-              <w:t xml:space="preserve">→ </w:t>
-            </w:r>
-            <w:r>
-              <w:rPr>
-                <w:rFonts w:ascii="Calibri" w:cs="Calibri" w:eastAsia="Calibri" w:hAnsi="Calibri"/>
-                <w:b w:val="false"/>
-                <w:bCs w:val="false"/>
-                <w:i w:val="false"/>
-                <w:iCs w:val="false"/>
-                <w:color w:val="9AA4B2"/>
-                <w:sz w:val="19"/>
-                <w:szCs w:val="19"/>
-              </w:rPr>
-              <w:t xml:space="preserve">approved false: "Customer is not verified" — the tool enforces the rules itself, no matter what the prompt says.</w:t>
+              <w:t xml:space="preserve">RESET TO START STATE</w:t>
+            </w:r>
+          </w:p>
+          <w:p>
+            <w:pPr>
+              <w:spacing w:after="20" w:before="0" w:line="264"/>
+            </w:pPr>
+            <w:r>
+              <w:rPr>
+                <w:rFonts w:ascii="Calibri" w:cs="Calibri" w:eastAsia="Calibri" w:hAnsi="Calibri"/>
+                <w:b w:val="false"/>
+                <w:bCs w:val="false"/>
+                <w:i w:val="false"/>
+                <w:iCs w:val="false"/>
+                <w:sz w:val="21"/>
+                <w:szCs w:val="21"/>
+              </w:rPr>
+              <w:t xml:space="preserve">Continue from block 7</w:t>
             </w:r>
           </w:p>
         </w:tc>
@@ -15167,7 +15250,7 @@
     </w:tbl>
     <w:p>
       <w:pPr>
-        <w:spacing w:after="20" w:before="0" w:line="264"/>
+        <w:spacing w:after="60" w:before="0" w:line="264"/>
       </w:pPr>
       <w:r>
         <w:rPr>
@@ -15193,11 +15276,11 @@
           <w:bCs/>
           <w:i w:val="false"/>
           <w:iCs w:val="false"/>
-          <w:color w:val="FF5C5C"/>
+          <w:color w:val="B07CFF"/>
           <w:sz w:val="20"/>
           <w:szCs w:val="20"/>
         </w:rPr>
-        <w:t xml:space="preserve">GOTCHA  </w:t>
+        <w:t xml:space="preserve">FILES  </w:t>
       </w:r>
       <w:r>
         <w:rPr>
@@ -15206,90 +15289,11 @@
           <w:bCs w:val="false"/>
           <w:i w:val="false"/>
           <w:iCs w:val="false"/>
+          <w:color w:val="B07CFF"/>
           <w:sz w:val="20"/>
           <w:szCs w:val="20"/>
         </w:rPr>
-        <w:t xml:space="preserve">If a placeholder won't save after the paste (signature or type mismatch), delete it and create a new tool with the same name: Tools ▸ + ▸ Python code ▸ paste ▸ Create. Test Tool errors on set_variable/get_variable usually mean the variables from block 6 are missing or misspelled. Don't point out the billing_agent's "up to 12 monthly installments" line. It contradicts the tool (max 6) on purpose: the evaluation in M5 catches it.</w:t>
-      </w:r>
-    </w:p>
-    <w:p>
-      <w:pPr>
-        <w:pStyle w:val="Heading3"/>
-        <w:keepNext/>
-        <w:spacing w:after="40" w:before="160"/>
-      </w:pPr>
-      <w:r>
-        <w:rPr>
-          <w:rFonts w:ascii="Calibri" w:cs="Calibri" w:eastAsia="Calibri" w:hAnsi="Calibri"/>
-          <w:b/>
-          <w:bCs/>
-          <w:i w:val="false"/>
-          <w:iCs w:val="false"/>
-          <w:color w:val="3D8BFF"/>
-          <w:sz w:val="22"/>
-          <w:szCs w:val="22"/>
-        </w:rPr>
-        <w:t xml:space="preserve">9. Wire the tools to the specialists and have a real conversation   ·   M2 · SLIDE 82 [footer 88]   ·   ~6 min</w:t>
-      </w:r>
-    </w:p>
-    <w:p>
-      <w:pPr>
-        <w:spacing w:after="80" w:before="40" w:line="264"/>
-      </w:pPr>
-      <w:r>
-        <w:rPr>
-          <w:rFonts w:ascii="Calibri" w:cs="Calibri" w:eastAsia="Calibri" w:hAnsi="Calibri"/>
-          <w:b/>
-          <w:bCs/>
-          <w:i w:val="false"/>
-          <w:iCs w:val="false"/>
-          <w:color w:val="2ECC71"/>
-          <w:sz w:val="20"/>
-          <w:szCs w:val="20"/>
-        </w:rPr>
-        <w:t xml:space="preserve">WHY  </w:t>
-      </w:r>
-      <w:r>
-        <w:rPr>
-          <w:rFonts w:ascii="Calibri" w:cs="Calibri" w:eastAsia="Calibri" w:hAnsi="Calibri"/>
-          <w:b w:val="false"/>
-          <w:bCs w:val="false"/>
-          <w:i w:val="false"/>
-          <w:iCs w:val="false"/>
-          <w:sz w:val="22"/>
-          <w:szCs w:val="22"/>
-        </w:rPr>
-        <w:t xml:space="preserve">Tools are attached per agent: the outage_agent can't touch billing, and the billing_agent can't report outages. Verification writes variables; every other agent reads them.</w:t>
-      </w:r>
-    </w:p>
-    <w:p>
-      <w:pPr>
-        <w:spacing w:after="80" w:before="40" w:line="264"/>
-      </w:pPr>
-      <w:r>
-        <w:rPr>
-          <w:rFonts w:ascii="Calibri" w:cs="Calibri" w:eastAsia="Calibri" w:hAnsi="Calibri"/>
-          <w:b/>
-          <w:bCs/>
-          <w:i w:val="false"/>
-          <w:iCs w:val="false"/>
-          <w:color w:val="2BB3B1"/>
-          <w:sz w:val="20"/>
-          <w:szCs w:val="20"/>
-        </w:rPr>
-        <w:t xml:space="preserve">SAY  </w:t>
-      </w:r>
-      <w:r>
-        <w:rPr>
-          <w:rFonts w:ascii="Calibri" w:cs="Calibri" w:eastAsia="Calibri" w:hAnsi="Calibri"/>
-          <w:b w:val="false"/>
-          <w:bCs w:val="false"/>
-          <w:i/>
-          <w:iCs/>
-          <w:sz w:val="22"/>
-          <w:szCs w:val="22"/>
-        </w:rPr>
-        <w:t xml:space="preserve">Watch the Variables panel: verification happened in Billing, and the outage_agent just used the ZIP. That's memory across agents.</w:t>
+        <w:t xml:space="preserve">02-build/tools/ (4 .py files: verify_customer, report_outage, get_bill_summary, create_payment_arrangement)</w:t>
       </w:r>
     </w:p>
     <w:tbl>
@@ -15342,24 +15346,92 @@
                 <w:sz w:val="18"/>
                 <w:szCs w:val="18"/>
               </w:rPr>
-              <w:t xml:space="preserve">RESET TO START STATE</w:t>
-            </w:r>
-          </w:p>
-          <w:p>
-            <w:pPr>
-              <w:spacing w:after="20" w:before="0" w:line="264"/>
-            </w:pPr>
-            <w:r>
-              <w:rPr>
-                <w:rFonts w:ascii="Calibri" w:cs="Calibri" w:eastAsia="Calibri" w:hAnsi="Calibri"/>
-                <w:b w:val="false"/>
-                <w:bCs w:val="false"/>
-                <w:i w:val="false"/>
-                <w:iCs w:val="false"/>
-                <w:sz w:val="21"/>
-                <w:szCs w:val="21"/>
-              </w:rPr>
-              <w:t xml:space="preserve">Continue from the previous block (five tools created)</w:t>
+              <w:t xml:space="preserve">DO</w:t>
+            </w:r>
+          </w:p>
+          <w:p>
+            <w:pPr>
+              <w:spacing w:after="0" w:before="0" w:line="264"/>
+            </w:pPr>
+            <w:r>
+              <w:rPr>
+                <w:rFonts w:ascii="Calibri" w:cs="Calibri" w:eastAsia="Calibri" w:hAnsi="Calibri"/>
+                <w:b w:val="false"/>
+                <w:bCs w:val="false"/>
+                <w:i w:val="false"/>
+                <w:iCs w:val="false"/>
+                <w:sz w:val="20"/>
+                <w:szCs w:val="20"/>
+              </w:rPr>
+              <w:t xml:space="preserve">Tools (right side) ▸ open each remaining Start with AI placeholder ▸ select ALL its code ▸ PASTE the matching file ▸ Save. From 02-build/tools (check_outage.py was done on slide 40):</w:t>
+            </w:r>
+          </w:p>
+          <w:p>
+            <w:pPr>
+              <w:spacing w:after="0" w:before="0" w:line="264"/>
+            </w:pPr>
+            <w:r>
+              <w:rPr>
+                <w:rFonts w:ascii="Calibri" w:cs="Calibri" w:eastAsia="Calibri" w:hAnsi="Calibri"/>
+                <w:b w:val="false"/>
+                <w:bCs w:val="false"/>
+                <w:i w:val="false"/>
+                <w:iCs w:val="false"/>
+                <w:sz w:val="20"/>
+                <w:szCs w:val="20"/>
+              </w:rPr>
+              <w:t xml:space="preserve">    verify_customer.py</w:t>
+            </w:r>
+          </w:p>
+          <w:p>
+            <w:pPr>
+              <w:spacing w:after="0" w:before="0" w:line="264"/>
+            </w:pPr>
+            <w:r>
+              <w:rPr>
+                <w:rFonts w:ascii="Calibri" w:cs="Calibri" w:eastAsia="Calibri" w:hAnsi="Calibri"/>
+                <w:b w:val="false"/>
+                <w:bCs w:val="false"/>
+                <w:i w:val="false"/>
+                <w:iCs w:val="false"/>
+                <w:sz w:val="20"/>
+                <w:szCs w:val="20"/>
+              </w:rPr>
+              <w:t xml:space="preserve">    report_outage.py</w:t>
+            </w:r>
+          </w:p>
+          <w:p>
+            <w:pPr>
+              <w:spacing w:after="0" w:before="0" w:line="264"/>
+            </w:pPr>
+            <w:r>
+              <w:rPr>
+                <w:rFonts w:ascii="Calibri" w:cs="Calibri" w:eastAsia="Calibri" w:hAnsi="Calibri"/>
+                <w:b w:val="false"/>
+                <w:bCs w:val="false"/>
+                <w:i w:val="false"/>
+                <w:iCs w:val="false"/>
+                <w:sz w:val="20"/>
+                <w:szCs w:val="20"/>
+              </w:rPr>
+              <w:t xml:space="preserve">    get_bill_summary.py</w:t>
+            </w:r>
+          </w:p>
+          <w:p>
+            <w:pPr>
+              <w:spacing w:after="0" w:before="0" w:line="264"/>
+            </w:pPr>
+            <w:r>
+              <w:rPr>
+                <w:rFonts w:ascii="Calibri" w:cs="Calibri" w:eastAsia="Calibri" w:hAnsi="Calibri"/>
+                <w:b w:val="false"/>
+                <w:bCs w:val="false"/>
+                <w:i w:val="false"/>
+                <w:iCs w:val="false"/>
+                <w:sz w:val="20"/>
+                <w:szCs w:val="20"/>
+              </w:rPr>
+              <w:t xml:space="preserve">    create_payment_arrangement.py</w:t>
             </w:r>
           </w:p>
         </w:tc>
@@ -15367,7 +15439,7 @@
     </w:tbl>
     <w:p>
       <w:pPr>
-        <w:spacing w:after="60" w:before="0" w:line="264"/>
+        <w:spacing w:after="20" w:before="0" w:line="264"/>
       </w:pPr>
       <w:r>
         <w:rPr>
@@ -15380,37 +15452,6 @@
           <w:szCs w:val="22"/>
         </w:rPr>
         <w:t xml:space="preserve"/>
-      </w:r>
-    </w:p>
-    <w:p>
-      <w:pPr>
-        <w:spacing w:after="80" w:before="40" w:line="264"/>
-      </w:pPr>
-      <w:r>
-        <w:rPr>
-          <w:rFonts w:ascii="Calibri" w:cs="Calibri" w:eastAsia="Calibri" w:hAnsi="Calibri"/>
-          <w:b/>
-          <w:bCs/>
-          <w:i w:val="false"/>
-          <w:iCs w:val="false"/>
-          <w:color w:val="B07CFF"/>
-          <w:sz w:val="20"/>
-          <w:szCs w:val="20"/>
-        </w:rPr>
-        <w:t xml:space="preserve">FILES  </w:t>
-      </w:r>
-      <w:r>
-        <w:rPr>
-          <w:rFonts w:ascii="Calibri" w:cs="Calibri" w:eastAsia="Calibri" w:hAnsi="Calibri"/>
-          <w:b w:val="false"/>
-          <w:bCs w:val="false"/>
-          <w:i w:val="false"/>
-          <w:iCs w:val="false"/>
-          <w:color w:val="B07CFF"/>
-          <w:sz w:val="20"/>
-          <w:szCs w:val="20"/>
-        </w:rPr>
-        <w:t xml:space="preserve">02-build/instructions/outage_agent.txt   ·   02-build/instructions/billing_agent.txt</w:t>
       </w:r>
     </w:p>
     <w:tbl>
@@ -15480,58 +15521,38 @@
                 <w:sz w:val="20"/>
                 <w:szCs w:val="20"/>
               </w:rPr>
-              <w:t xml:space="preserve">Attach (hover agent ▸ Add tool):</w:t>
-            </w:r>
-          </w:p>
-          <w:p>
-            <w:pPr>
-              <w:spacing w:after="0" w:before="0" w:line="264"/>
-            </w:pPr>
-            <w:r>
-              <w:rPr>
-                <w:rFonts w:ascii="Calibri" w:cs="Calibri" w:eastAsia="Calibri" w:hAnsi="Calibri"/>
-                <w:b w:val="false"/>
-                <w:bCs w:val="false"/>
-                <w:i w:val="false"/>
-                <w:iCs w:val="false"/>
-                <w:sz w:val="20"/>
-                <w:szCs w:val="20"/>
-              </w:rPr>
-              <w:t xml:space="preserve">  outage_agent: report_outage (check_outage is already there)</w:t>
-            </w:r>
-          </w:p>
-          <w:p>
-            <w:pPr>
-              <w:spacing w:after="0" w:before="0" w:line="264"/>
-            </w:pPr>
-            <w:r>
-              <w:rPr>
-                <w:rFonts w:ascii="Calibri" w:cs="Calibri" w:eastAsia="Calibri" w:hAnsi="Calibri"/>
-                <w:b w:val="false"/>
-                <w:bCs w:val="false"/>
-                <w:i w:val="false"/>
-                <w:iCs w:val="false"/>
-                <w:sz w:val="20"/>
-                <w:szCs w:val="20"/>
-              </w:rPr>
-              <w:t xml:space="preserve">  billing_agent: verify_customer, get_bill_summary, create_payment_arrangement</w:t>
-            </w:r>
-          </w:p>
-          <w:p>
-            <w:pPr>
-              <w:spacing w:after="0" w:before="0" w:line="264"/>
-            </w:pPr>
-            <w:r>
-              <w:rPr>
-                <w:rFonts w:ascii="Calibri" w:cs="Calibri" w:eastAsia="Calibri" w:hAnsi="Calibri"/>
-                <w:b w:val="false"/>
-                <w:bCs w:val="false"/>
-                <w:i w:val="false"/>
-                <w:iCs w:val="false"/>
-                <w:sz w:val="20"/>
-                <w:szCs w:val="20"/>
-              </w:rPr>
-              <w:t xml:space="preserve">cymbal_care: REMOVE the remaining four (x) — Start with AI attached them to the root; the root only routes now</w:t>
+              <w:t xml:space="preserve">create_payment_arrangement ▸ Test Tool ▸ installments = 12</w:t>
+            </w:r>
+          </w:p>
+          <w:p>
+            <w:pPr>
+              <w:spacing w:after="0" w:before="60" w:line="264"/>
+            </w:pPr>
+            <w:r>
+              <w:rPr>
+                <w:rFonts w:ascii="Calibri" w:cs="Calibri" w:eastAsia="Calibri" w:hAnsi="Calibri"/>
+                <w:b/>
+                <w:bCs/>
+                <w:i w:val="false"/>
+                <w:iCs w:val="false"/>
+                <w:color w:val="2ECC71"/>
+                <w:sz w:val="19"/>
+                <w:szCs w:val="19"/>
+              </w:rPr>
+              <w:t xml:space="preserve">→ </w:t>
+            </w:r>
+            <w:r>
+              <w:rPr>
+                <w:rFonts w:ascii="Calibri" w:cs="Calibri" w:eastAsia="Calibri" w:hAnsi="Calibri"/>
+                <w:b w:val="false"/>
+                <w:bCs w:val="false"/>
+                <w:i w:val="false"/>
+                <w:iCs w:val="false"/>
+                <w:color w:val="9AA4B2"/>
+                <w:sz w:val="19"/>
+                <w:szCs w:val="19"/>
+              </w:rPr>
+              <w:t xml:space="preserve">approved false: "Customer is not verified" — the tool enforces the rules itself, no matter what the prompt says.</w:t>
             </w:r>
           </w:p>
         </w:tc>
@@ -15552,6 +15573,116 @@
           <w:szCs w:val="22"/>
         </w:rPr>
         <w:t xml:space="preserve"/>
+      </w:r>
+    </w:p>
+    <w:p>
+      <w:pPr>
+        <w:spacing w:after="80" w:before="40" w:line="264"/>
+      </w:pPr>
+      <w:r>
+        <w:rPr>
+          <w:rFonts w:ascii="Calibri" w:cs="Calibri" w:eastAsia="Calibri" w:hAnsi="Calibri"/>
+          <w:b/>
+          <w:bCs/>
+          <w:i w:val="false"/>
+          <w:iCs w:val="false"/>
+          <w:color w:val="FF5C5C"/>
+          <w:sz w:val="20"/>
+          <w:szCs w:val="20"/>
+        </w:rPr>
+        <w:t xml:space="preserve">GOTCHA  </w:t>
+      </w:r>
+      <w:r>
+        <w:rPr>
+          <w:rFonts w:ascii="Calibri" w:cs="Calibri" w:eastAsia="Calibri" w:hAnsi="Calibri"/>
+          <w:b w:val="false"/>
+          <w:bCs w:val="false"/>
+          <w:i w:val="false"/>
+          <w:iCs w:val="false"/>
+          <w:sz w:val="20"/>
+          <w:szCs w:val="20"/>
+        </w:rPr>
+        <w:t xml:space="preserve">If a placeholder won't save after the paste (signature or type mismatch), delete it and create a new tool with the same name: Tools ▸ + ▸ Python code ▸ paste ▸ Create. Test Tool errors on set_variable/get_variable usually mean the variables from block 6 are missing or misspelled. Don't point out the billing_agent's "up to 12 monthly installments" line. It contradicts the tool (max 6) on purpose: the evaluation in M5 catches it.</w:t>
+      </w:r>
+    </w:p>
+    <w:p>
+      <w:pPr>
+        <w:pStyle w:val="Heading3"/>
+        <w:keepNext/>
+        <w:spacing w:after="40" w:before="160"/>
+      </w:pPr>
+      <w:r>
+        <w:rPr>
+          <w:rFonts w:ascii="Calibri" w:cs="Calibri" w:eastAsia="Calibri" w:hAnsi="Calibri"/>
+          <w:b/>
+          <w:bCs/>
+          <w:i w:val="false"/>
+          <w:iCs w:val="false"/>
+          <w:color w:val="3D8BFF"/>
+          <w:sz w:val="22"/>
+          <w:szCs w:val="22"/>
+        </w:rPr>
+        <w:t xml:space="preserve">9. Wire the tools to the specialists and have a real conversation   ·   M2 · SLIDE 82 [footer 88]   ·   ~6 min</w:t>
+      </w:r>
+    </w:p>
+    <w:p>
+      <w:pPr>
+        <w:spacing w:after="80" w:before="40" w:line="264"/>
+      </w:pPr>
+      <w:r>
+        <w:rPr>
+          <w:rFonts w:ascii="Calibri" w:cs="Calibri" w:eastAsia="Calibri" w:hAnsi="Calibri"/>
+          <w:b/>
+          <w:bCs/>
+          <w:i w:val="false"/>
+          <w:iCs w:val="false"/>
+          <w:color w:val="2ECC71"/>
+          <w:sz w:val="20"/>
+          <w:szCs w:val="20"/>
+        </w:rPr>
+        <w:t xml:space="preserve">WHY  </w:t>
+      </w:r>
+      <w:r>
+        <w:rPr>
+          <w:rFonts w:ascii="Calibri" w:cs="Calibri" w:eastAsia="Calibri" w:hAnsi="Calibri"/>
+          <w:b w:val="false"/>
+          <w:bCs w:val="false"/>
+          <w:i w:val="false"/>
+          <w:iCs w:val="false"/>
+          <w:sz w:val="22"/>
+          <w:szCs w:val="22"/>
+        </w:rPr>
+        <w:t xml:space="preserve">Tools are attached per agent: the outage_agent can't touch billing, and the billing_agent can't report outages. Verification writes variables; every other agent reads them.</w:t>
+      </w:r>
+    </w:p>
+    <w:p>
+      <w:pPr>
+        <w:spacing w:after="80" w:before="40" w:line="264"/>
+      </w:pPr>
+      <w:r>
+        <w:rPr>
+          <w:rFonts w:ascii="Calibri" w:cs="Calibri" w:eastAsia="Calibri" w:hAnsi="Calibri"/>
+          <w:b/>
+          <w:bCs/>
+          <w:i w:val="false"/>
+          <w:iCs w:val="false"/>
+          <w:color w:val="2BB3B1"/>
+          <w:sz w:val="20"/>
+          <w:szCs w:val="20"/>
+        </w:rPr>
+        <w:t xml:space="preserve">SAY  </w:t>
+      </w:r>
+      <w:r>
+        <w:rPr>
+          <w:rFonts w:ascii="Calibri" w:cs="Calibri" w:eastAsia="Calibri" w:hAnsi="Calibri"/>
+          <w:b w:val="false"/>
+          <w:bCs w:val="false"/>
+          <w:i/>
+          <w:iCs/>
+          <w:sz w:val="22"/>
+          <w:szCs w:val="22"/>
+        </w:rPr>
+        <w:t xml:space="preserve">The tool set those four, the callback set the other four. Verification happened in Billing, and the outage_agent just used the ZIP without asking. That's memory across agents.</w:t>
       </w:r>
     </w:p>
     <w:tbl>
@@ -15577,10 +15708,10 @@
           <w:tcPr>
             <w:tcW w:type="dxa" w:w="10080"/>
             <w:tcBorders>
-              <w:top w:val="single" w:color="2BB3B1" w:sz="12"/>
-              <w:left w:val="single" w:color="2BB3B1" w:sz="36"/>
-              <w:bottom w:val="single" w:color="2BB3B1" w:sz="12"/>
-              <w:right w:val="single" w:color="2BB3B1" w:sz="12"/>
+              <w:top w:val="single" w:color="B07CFF" w:sz="12"/>
+              <w:left w:val="single" w:color="B07CFF" w:sz="12"/>
+              <w:bottom w:val="single" w:color="B07CFF" w:sz="12"/>
+              <w:right w:val="single" w:color="B07CFF" w:sz="12"/>
             </w:tcBorders>
             <w:tcMar>
               <w:top w:type="dxa" w:w="80"/>
@@ -15600,62 +15731,28 @@
                 <w:bCs/>
                 <w:i w:val="false"/>
                 <w:iCs w:val="false"/>
-                <w:color w:val="2BB3B1"/>
+                <w:color w:val="B07CFF"/>
                 <w:sz w:val="18"/>
                 <w:szCs w:val="18"/>
               </w:rPr>
-              <w:t xml:space="preserve">PASTE file ▸ where</w:t>
-            </w:r>
-          </w:p>
-          <w:p>
-            <w:pPr>
-              <w:spacing w:after="0" w:before="0" w:line="264"/>
-            </w:pPr>
-            <w:r>
-              <w:rPr>
-                <w:rFonts w:ascii="Calibri" w:cs="Calibri" w:eastAsia="Calibri" w:hAnsi="Calibri"/>
-                <w:b w:val="false"/>
-                <w:bCs w:val="false"/>
-                <w:i w:val="false"/>
-                <w:iCs w:val="false"/>
-                <w:sz w:val="20"/>
-                <w:szCs w:val="20"/>
-              </w:rPr>
-              <w:t xml:space="preserve">02-build/instructions/outage_agent.txt ▸ outage_agent instructions (replace ALL; it keeps the storm-credit step)</w:t>
-            </w:r>
-          </w:p>
-          <w:p>
-            <w:pPr>
-              <w:spacing w:after="0" w:before="0" w:line="264"/>
-            </w:pPr>
-            <w:r>
-              <w:rPr>
-                <w:rFonts w:ascii="Calibri" w:cs="Calibri" w:eastAsia="Calibri" w:hAnsi="Calibri"/>
-                <w:b w:val="false"/>
-                <w:bCs w:val="false"/>
-                <w:i w:val="false"/>
-                <w:iCs w:val="false"/>
-                <w:sz w:val="20"/>
-                <w:szCs w:val="20"/>
-              </w:rPr>
-              <w:t xml:space="preserve">02-build/instructions/billing_agent.txt ▸ billing_agent instructions (replace ALL)</w:t>
-            </w:r>
-          </w:p>
-          <w:p>
-            <w:pPr>
-              <w:spacing w:after="0" w:before="0" w:line="264"/>
-            </w:pPr>
-            <w:r>
-              <w:rPr>
-                <w:rFonts w:ascii="Calibri" w:cs="Calibri" w:eastAsia="Calibri" w:hAnsi="Calibri"/>
-                <w:b w:val="false"/>
-                <w:bCs w:val="false"/>
-                <w:i w:val="false"/>
-                <w:iCs w:val="false"/>
-                <w:sz w:val="20"/>
-                <w:szCs w:val="20"/>
-              </w:rPr>
-              <w:t xml:space="preserve">▸ Save</w:t>
+              <w:t xml:space="preserve">RESET TO START STATE</w:t>
+            </w:r>
+          </w:p>
+          <w:p>
+            <w:pPr>
+              <w:spacing w:after="20" w:before="0" w:line="264"/>
+            </w:pPr>
+            <w:r>
+              <w:rPr>
+                <w:rFonts w:ascii="Calibri" w:cs="Calibri" w:eastAsia="Calibri" w:hAnsi="Calibri"/>
+                <w:b w:val="false"/>
+                <w:bCs w:val="false"/>
+                <w:i w:val="false"/>
+                <w:iCs w:val="false"/>
+                <w:sz w:val="21"/>
+                <w:szCs w:val="21"/>
+              </w:rPr>
+              <w:t xml:space="preserve">Continue from the previous block (five tools created)</w:t>
             </w:r>
           </w:p>
         </w:tc>
@@ -15663,7 +15760,7 @@
     </w:tbl>
     <w:p>
       <w:pPr>
-        <w:spacing w:after="20" w:before="0" w:line="264"/>
+        <w:spacing w:after="60" w:before="0" w:line="264"/>
       </w:pPr>
       <w:r>
         <w:rPr>
@@ -15676,6 +15773,37 @@
           <w:szCs w:val="22"/>
         </w:rPr>
         <w:t xml:space="preserve"/>
+      </w:r>
+    </w:p>
+    <w:p>
+      <w:pPr>
+        <w:spacing w:after="80" w:before="40" w:line="264"/>
+      </w:pPr>
+      <w:r>
+        <w:rPr>
+          <w:rFonts w:ascii="Calibri" w:cs="Calibri" w:eastAsia="Calibri" w:hAnsi="Calibri"/>
+          <w:b/>
+          <w:bCs/>
+          <w:i w:val="false"/>
+          <w:iCs w:val="false"/>
+          <w:color w:val="B07CFF"/>
+          <w:sz w:val="20"/>
+          <w:szCs w:val="20"/>
+        </w:rPr>
+        <w:t xml:space="preserve">FILES  </w:t>
+      </w:r>
+      <w:r>
+        <w:rPr>
+          <w:rFonts w:ascii="Calibri" w:cs="Calibri" w:eastAsia="Calibri" w:hAnsi="Calibri"/>
+          <w:b w:val="false"/>
+          <w:bCs w:val="false"/>
+          <w:i w:val="false"/>
+          <w:iCs w:val="false"/>
+          <w:color w:val="B07CFF"/>
+          <w:sz w:val="20"/>
+          <w:szCs w:val="20"/>
+        </w:rPr>
+        <w:t xml:space="preserve">02-build/instructions/outage_agent.txt   ·   02-build/instructions/billing_agent.txt</w:t>
       </w:r>
     </w:p>
     <w:tbl>
@@ -15701,10 +15829,10 @@
           <w:tcPr>
             <w:tcW w:type="dxa" w:w="10080"/>
             <w:tcBorders>
-              <w:top w:val="single" w:color="F28C28" w:sz="12"/>
-              <w:left w:val="single" w:color="F28C28" w:sz="36"/>
-              <w:bottom w:val="single" w:color="F28C28" w:sz="12"/>
-              <w:right w:val="single" w:color="F28C28" w:sz="12"/>
+              <w:top w:val="single" w:color="B07CFF" w:sz="12"/>
+              <w:left w:val="single" w:color="B07CFF" w:sz="12"/>
+              <w:bottom w:val="single" w:color="B07CFF" w:sz="12"/>
+              <w:right w:val="single" w:color="B07CFF" w:sz="12"/>
             </w:tcBorders>
             <w:tcMar>
               <w:top w:type="dxa" w:w="80"/>
@@ -15724,11 +15852,11 @@
                 <w:bCs/>
                 <w:i w:val="false"/>
                 <w:iCs w:val="false"/>
-                <w:color w:val="F28C28"/>
+                <w:color w:val="B07CFF"/>
                 <w:sz w:val="18"/>
                 <w:szCs w:val="18"/>
               </w:rPr>
-              <w:t xml:space="preserve">TYPE in Preview ▸ NEW CONVERSATION</w:t>
+              <w:t xml:space="preserve">DO</w:t>
             </w:r>
           </w:p>
           <w:p>
@@ -15737,46 +15865,66 @@
             </w:pPr>
             <w:r>
               <w:rPr>
-                <w:rFonts w:ascii="Consolas" w:cs="Consolas" w:eastAsia="Consolas" w:hAnsi="Consolas"/>
-                <w:b w:val="false"/>
-                <w:bCs w:val="false"/>
-                <w:i w:val="false"/>
-                <w:iCs w:val="false"/>
-                <w:sz w:val="19"/>
-                <w:szCs w:val="19"/>
-              </w:rPr>
-              <w:t xml:space="preserve">What's my balance?</w:t>
-            </w:r>
-          </w:p>
-          <w:p>
-            <w:pPr>
-              <w:spacing w:after="0" w:before="60" w:line="264"/>
-            </w:pPr>
-            <w:r>
-              <w:rPr>
-                <w:rFonts w:ascii="Calibri" w:cs="Calibri" w:eastAsia="Calibri" w:hAnsi="Calibri"/>
-                <w:b/>
-                <w:bCs/>
-                <w:i w:val="false"/>
-                <w:iCs w:val="false"/>
-                <w:color w:val="2ECC71"/>
-                <w:sz w:val="19"/>
-                <w:szCs w:val="19"/>
-              </w:rPr>
-              <w:t xml:space="preserve">→ </w:t>
-            </w:r>
-            <w:r>
-              <w:rPr>
-                <w:rFonts w:ascii="Calibri" w:cs="Calibri" w:eastAsia="Calibri" w:hAnsi="Calibri"/>
-                <w:b w:val="false"/>
-                <w:bCs w:val="false"/>
-                <w:i w:val="false"/>
-                <w:iCs w:val="false"/>
-                <w:color w:val="9AA4B2"/>
-                <w:sz w:val="19"/>
-                <w:szCs w:val="19"/>
-              </w:rPr>
-              <w:t xml:space="preserve">billing_agent asks for account number and ZIP.</w:t>
+                <w:rFonts w:ascii="Calibri" w:cs="Calibri" w:eastAsia="Calibri" w:hAnsi="Calibri"/>
+                <w:b w:val="false"/>
+                <w:bCs w:val="false"/>
+                <w:i w:val="false"/>
+                <w:iCs w:val="false"/>
+                <w:sz w:val="20"/>
+                <w:szCs w:val="20"/>
+              </w:rPr>
+              <w:t xml:space="preserve">Attach (hover agent ▸ Add tool):</w:t>
+            </w:r>
+          </w:p>
+          <w:p>
+            <w:pPr>
+              <w:spacing w:after="0" w:before="0" w:line="264"/>
+            </w:pPr>
+            <w:r>
+              <w:rPr>
+                <w:rFonts w:ascii="Calibri" w:cs="Calibri" w:eastAsia="Calibri" w:hAnsi="Calibri"/>
+                <w:b w:val="false"/>
+                <w:bCs w:val="false"/>
+                <w:i w:val="false"/>
+                <w:iCs w:val="false"/>
+                <w:sz w:val="20"/>
+                <w:szCs w:val="20"/>
+              </w:rPr>
+              <w:t xml:space="preserve">  outage_agent: report_outage (check_outage is already there)</w:t>
+            </w:r>
+          </w:p>
+          <w:p>
+            <w:pPr>
+              <w:spacing w:after="0" w:before="0" w:line="264"/>
+            </w:pPr>
+            <w:r>
+              <w:rPr>
+                <w:rFonts w:ascii="Calibri" w:cs="Calibri" w:eastAsia="Calibri" w:hAnsi="Calibri"/>
+                <w:b w:val="false"/>
+                <w:bCs w:val="false"/>
+                <w:i w:val="false"/>
+                <w:iCs w:val="false"/>
+                <w:sz w:val="20"/>
+                <w:szCs w:val="20"/>
+              </w:rPr>
+              <w:t xml:space="preserve">  billing_agent: verify_customer, get_bill_summary, create_payment_arrangement</w:t>
+            </w:r>
+          </w:p>
+          <w:p>
+            <w:pPr>
+              <w:spacing w:after="0" w:before="0" w:line="264"/>
+            </w:pPr>
+            <w:r>
+              <w:rPr>
+                <w:rFonts w:ascii="Calibri" w:cs="Calibri" w:eastAsia="Calibri" w:hAnsi="Calibri"/>
+                <w:b w:val="false"/>
+                <w:bCs w:val="false"/>
+                <w:i w:val="false"/>
+                <w:iCs w:val="false"/>
+                <w:sz w:val="20"/>
+                <w:szCs w:val="20"/>
+              </w:rPr>
+              <w:t xml:space="preserve">cymbal_care: REMOVE the remaining four (x) — Start with AI attached them to the root; the root only routes now</w:t>
             </w:r>
           </w:p>
         </w:tc>
@@ -15822,10 +15970,10 @@
           <w:tcPr>
             <w:tcW w:type="dxa" w:w="10080"/>
             <w:tcBorders>
-              <w:top w:val="single" w:color="F28C28" w:sz="12"/>
-              <w:left w:val="single" w:color="F28C28" w:sz="36"/>
-              <w:bottom w:val="single" w:color="F28C28" w:sz="12"/>
-              <w:right w:val="single" w:color="F28C28" w:sz="12"/>
+              <w:top w:val="single" w:color="2BB3B1" w:sz="12"/>
+              <w:left w:val="single" w:color="2BB3B1" w:sz="36"/>
+              <w:bottom w:val="single" w:color="2BB3B1" w:sz="12"/>
+              <w:right w:val="single" w:color="2BB3B1" w:sz="12"/>
             </w:tcBorders>
             <w:tcMar>
               <w:top w:type="dxa" w:w="80"/>
@@ -15845,11 +15993,11 @@
                 <w:bCs/>
                 <w:i w:val="false"/>
                 <w:iCs w:val="false"/>
-                <w:color w:val="F28C28"/>
+                <w:color w:val="2BB3B1"/>
                 <w:sz w:val="18"/>
                 <w:szCs w:val="18"/>
               </w:rPr>
-              <w:t xml:space="preserve">TYPE in Preview</w:t>
+              <w:t xml:space="preserve">PASTE file ▸ where</w:t>
             </w:r>
           </w:p>
           <w:p>
@@ -15858,46 +16006,49 @@
             </w:pPr>
             <w:r>
               <w:rPr>
-                <w:rFonts w:ascii="Consolas" w:cs="Consolas" w:eastAsia="Consolas" w:hAnsi="Consolas"/>
-                <w:b w:val="false"/>
-                <w:bCs w:val="false"/>
-                <w:i w:val="false"/>
-                <w:iCs w:val="false"/>
-                <w:sz w:val="19"/>
-                <w:szCs w:val="19"/>
-              </w:rPr>
-              <w:t xml:space="preserve">100234, 39567</w:t>
-            </w:r>
-          </w:p>
-          <w:p>
-            <w:pPr>
-              <w:spacing w:after="0" w:before="60" w:line="264"/>
-            </w:pPr>
-            <w:r>
-              <w:rPr>
-                <w:rFonts w:ascii="Calibri" w:cs="Calibri" w:eastAsia="Calibri" w:hAnsi="Calibri"/>
-                <w:b/>
-                <w:bCs/>
-                <w:i w:val="false"/>
-                <w:iCs w:val="false"/>
-                <w:color w:val="2ECC71"/>
-                <w:sz w:val="19"/>
-                <w:szCs w:val="19"/>
-              </w:rPr>
-              <w:t xml:space="preserve">→ </w:t>
-            </w:r>
-            <w:r>
-              <w:rPr>
-                <w:rFonts w:ascii="Calibri" w:cs="Calibri" w:eastAsia="Calibri" w:hAnsi="Calibri"/>
-                <w:b w:val="false"/>
-                <w:bCs w:val="false"/>
-                <w:i w:val="false"/>
-                <w:iCs w:val="false"/>
-                <w:color w:val="9AA4B2"/>
-                <w:sz w:val="19"/>
-                <w:szCs w:val="19"/>
-              </w:rPr>
-              <w:t xml:space="preserve">Verified, Renee. $142.80 due October 6. Variables panel: is_authenticated true, service_zip 39567.</w:t>
+                <w:rFonts w:ascii="Calibri" w:cs="Calibri" w:eastAsia="Calibri" w:hAnsi="Calibri"/>
+                <w:b w:val="false"/>
+                <w:bCs w:val="false"/>
+                <w:i w:val="false"/>
+                <w:iCs w:val="false"/>
+                <w:sz w:val="20"/>
+                <w:szCs w:val="20"/>
+              </w:rPr>
+              <w:t xml:space="preserve">02-build/instructions/outage_agent.txt ▸ outage_agent instructions (replace ALL; it keeps the storm-credit step)</w:t>
+            </w:r>
+          </w:p>
+          <w:p>
+            <w:pPr>
+              <w:spacing w:after="0" w:before="0" w:line="264"/>
+            </w:pPr>
+            <w:r>
+              <w:rPr>
+                <w:rFonts w:ascii="Calibri" w:cs="Calibri" w:eastAsia="Calibri" w:hAnsi="Calibri"/>
+                <w:b w:val="false"/>
+                <w:bCs w:val="false"/>
+                <w:i w:val="false"/>
+                <w:iCs w:val="false"/>
+                <w:sz w:val="20"/>
+                <w:szCs w:val="20"/>
+              </w:rPr>
+              <w:t xml:space="preserve">02-build/instructions/billing_agent.txt ▸ billing_agent instructions (replace ALL)</w:t>
+            </w:r>
+          </w:p>
+          <w:p>
+            <w:pPr>
+              <w:spacing w:after="0" w:before="0" w:line="264"/>
+            </w:pPr>
+            <w:r>
+              <w:rPr>
+                <w:rFonts w:ascii="Calibri" w:cs="Calibri" w:eastAsia="Calibri" w:hAnsi="Calibri"/>
+                <w:b w:val="false"/>
+                <w:bCs w:val="false"/>
+                <w:i w:val="false"/>
+                <w:iCs w:val="false"/>
+                <w:sz w:val="20"/>
+                <w:szCs w:val="20"/>
+              </w:rPr>
+              <w:t xml:space="preserve">▸ Save</w:t>
             </w:r>
           </w:p>
         </w:tc>
@@ -15970,7 +16121,7 @@
                 <w:sz w:val="18"/>
                 <w:szCs w:val="18"/>
               </w:rPr>
-              <w:t xml:space="preserve">TYPE in Preview</w:t>
+              <w:t xml:space="preserve">TYPE in Preview ▸ NEW CONVERSATION</w:t>
             </w:r>
           </w:p>
           <w:p>
@@ -15987,7 +16138,7 @@
                 <w:sz w:val="19"/>
                 <w:szCs w:val="19"/>
               </w:rPr>
-              <w:t xml:space="preserve">Is my power still out?</w:t>
+              <w:t xml:space="preserve">What's my balance?</w:t>
             </w:r>
           </w:p>
           <w:p>
@@ -16018,7 +16169,7 @@
                 <w:sz w:val="19"/>
                 <w:szCs w:val="19"/>
               </w:rPr>
-              <w:t xml:space="preserve">Transfers to outage_agent, does NOT ask for the ZIP again (read {service_zip}), quotes 11:00 PM tonight.</w:t>
+              <w:t xml:space="preserve">billing_agent asks for account number and ZIP.</w:t>
             </w:r>
           </w:p>
         </w:tc>
@@ -16041,6 +16192,369 @@
         <w:t xml:space="preserve"/>
       </w:r>
     </w:p>
+    <w:tbl>
+      <w:tblPr>
+        <w:tblW w:type="dxa" w:w="10080"/>
+        <w:tblBorders>
+          <w:top w:val="single" w:color="auto" w:sz="4"/>
+          <w:left w:val="single" w:color="auto" w:sz="4"/>
+          <w:bottom w:val="single" w:color="auto" w:sz="4"/>
+          <w:right w:val="single" w:color="auto" w:sz="4"/>
+          <w:insideH w:val="single" w:color="auto" w:sz="4"/>
+          <w:insideV w:val="single" w:color="auto" w:sz="4"/>
+        </w:tblBorders>
+      </w:tblPr>
+      <w:tblGrid>
+        <w:gridCol w:w="10080"/>
+      </w:tblGrid>
+      <w:tr>
+        <w:trPr>
+          <w:cantSplit/>
+        </w:trPr>
+        <w:tc>
+          <w:tcPr>
+            <w:tcW w:type="dxa" w:w="10080"/>
+            <w:tcBorders>
+              <w:top w:val="single" w:color="F28C28" w:sz="12"/>
+              <w:left w:val="single" w:color="F28C28" w:sz="36"/>
+              <w:bottom w:val="single" w:color="F28C28" w:sz="12"/>
+              <w:right w:val="single" w:color="F28C28" w:sz="12"/>
+            </w:tcBorders>
+            <w:tcMar>
+              <w:top w:type="dxa" w:w="80"/>
+              <w:left w:type="dxa" w:w="160"/>
+              <w:bottom w:type="dxa" w:w="80"/>
+              <w:right w:type="dxa" w:w="160"/>
+            </w:tcMar>
+          </w:tcPr>
+          <w:p>
+            <w:pPr>
+              <w:spacing w:after="40" w:before="0" w:line="264"/>
+            </w:pPr>
+            <w:r>
+              <w:rPr>
+                <w:rFonts w:ascii="Calibri" w:cs="Calibri" w:eastAsia="Calibri" w:hAnsi="Calibri"/>
+                <w:b/>
+                <w:bCs/>
+                <w:i w:val="false"/>
+                <w:iCs w:val="false"/>
+                <w:color w:val="F28C28"/>
+                <w:sz w:val="18"/>
+                <w:szCs w:val="18"/>
+              </w:rPr>
+              <w:t xml:space="preserve">TYPE in Preview</w:t>
+            </w:r>
+          </w:p>
+          <w:p>
+            <w:pPr>
+              <w:spacing w:after="0" w:before="0" w:line="264"/>
+            </w:pPr>
+            <w:r>
+              <w:rPr>
+                <w:rFonts w:ascii="Consolas" w:cs="Consolas" w:eastAsia="Consolas" w:hAnsi="Consolas"/>
+                <w:b w:val="false"/>
+                <w:bCs w:val="false"/>
+                <w:i w:val="false"/>
+                <w:iCs w:val="false"/>
+                <w:sz w:val="19"/>
+                <w:szCs w:val="19"/>
+              </w:rPr>
+              <w:t xml:space="preserve">100234, 39567</w:t>
+            </w:r>
+          </w:p>
+          <w:p>
+            <w:pPr>
+              <w:spacing w:after="0" w:before="60" w:line="264"/>
+            </w:pPr>
+            <w:r>
+              <w:rPr>
+                <w:rFonts w:ascii="Calibri" w:cs="Calibri" w:eastAsia="Calibri" w:hAnsi="Calibri"/>
+                <w:b/>
+                <w:bCs/>
+                <w:i w:val="false"/>
+                <w:iCs w:val="false"/>
+                <w:color w:val="2ECC71"/>
+                <w:sz w:val="19"/>
+                <w:szCs w:val="19"/>
+              </w:rPr>
+              <w:t xml:space="preserve">→ </w:t>
+            </w:r>
+            <w:r>
+              <w:rPr>
+                <w:rFonts w:ascii="Calibri" w:cs="Calibri" w:eastAsia="Calibri" w:hAnsi="Calibri"/>
+                <w:b w:val="false"/>
+                <w:bCs w:val="false"/>
+                <w:i w:val="false"/>
+                <w:iCs w:val="false"/>
+                <w:color w:val="9AA4B2"/>
+                <w:sz w:val="19"/>
+                <w:szCs w:val="19"/>
+              </w:rPr>
+              <w:t xml:space="preserve">Verified, Renee. $142.80 due October 6, in the same reply. Trace: verify_customer and its [verify_customer] print line, then get_bill_summary.</w:t>
+            </w:r>
+          </w:p>
+        </w:tc>
+      </w:tr>
+    </w:tbl>
+    <w:p>
+      <w:pPr>
+        <w:spacing w:after="20" w:before="0" w:line="264"/>
+      </w:pPr>
+      <w:r>
+        <w:rPr>
+          <w:rFonts w:ascii="Calibri" w:cs="Calibri" w:eastAsia="Calibri" w:hAnsi="Calibri"/>
+          <w:b w:val="false"/>
+          <w:bCs w:val="false"/>
+          <w:i w:val="false"/>
+          <w:iCs w:val="false"/>
+          <w:sz w:val="22"/>
+          <w:szCs w:val="22"/>
+        </w:rPr>
+        <w:t xml:space="preserve"/>
+      </w:r>
+    </w:p>
+    <w:tbl>
+      <w:tblPr>
+        <w:tblW w:type="dxa" w:w="10080"/>
+        <w:tblBorders>
+          <w:top w:val="single" w:color="auto" w:sz="4"/>
+          <w:left w:val="single" w:color="auto" w:sz="4"/>
+          <w:bottom w:val="single" w:color="auto" w:sz="4"/>
+          <w:right w:val="single" w:color="auto" w:sz="4"/>
+          <w:insideH w:val="single" w:color="auto" w:sz="4"/>
+          <w:insideV w:val="single" w:color="auto" w:sz="4"/>
+        </w:tblBorders>
+      </w:tblPr>
+      <w:tblGrid>
+        <w:gridCol w:w="10080"/>
+      </w:tblGrid>
+      <w:tr>
+        <w:trPr>
+          <w:cantSplit/>
+        </w:trPr>
+        <w:tc>
+          <w:tcPr>
+            <w:tcW w:type="dxa" w:w="10080"/>
+            <w:tcBorders>
+              <w:top w:val="single" w:color="B07CFF" w:sz="12"/>
+              <w:left w:val="single" w:color="B07CFF" w:sz="12"/>
+              <w:bottom w:val="single" w:color="B07CFF" w:sz="12"/>
+              <w:right w:val="single" w:color="B07CFF" w:sz="12"/>
+            </w:tcBorders>
+            <w:tcMar>
+              <w:top w:type="dxa" w:w="80"/>
+              <w:left w:type="dxa" w:w="160"/>
+              <w:bottom w:type="dxa" w:w="80"/>
+              <w:right w:type="dxa" w:w="160"/>
+            </w:tcMar>
+          </w:tcPr>
+          <w:p>
+            <w:pPr>
+              <w:spacing w:after="40" w:before="0" w:line="264"/>
+            </w:pPr>
+            <w:r>
+              <w:rPr>
+                <w:rFonts w:ascii="Calibri" w:cs="Calibri" w:eastAsia="Calibri" w:hAnsi="Calibri"/>
+                <w:b/>
+                <w:bCs/>
+                <w:i w:val="false"/>
+                <w:iCs w:val="false"/>
+                <w:color w:val="B07CFF"/>
+                <w:sz w:val="18"/>
+                <w:szCs w:val="18"/>
+              </w:rPr>
+              <w:t xml:space="preserve">DO</w:t>
+            </w:r>
+          </w:p>
+          <w:p>
+            <w:pPr>
+              <w:spacing w:after="0" w:before="0" w:line="264"/>
+            </w:pPr>
+            <w:r>
+              <w:rPr>
+                <w:rFonts w:ascii="Calibri" w:cs="Calibri" w:eastAsia="Calibri" w:hAnsi="Calibri"/>
+                <w:b w:val="false"/>
+                <w:bCs w:val="false"/>
+                <w:i w:val="false"/>
+                <w:iCs w:val="false"/>
+                <w:sz w:val="20"/>
+                <w:szCs w:val="20"/>
+              </w:rPr>
+              <w:t xml:space="preserve">Under the reply: Steps row ▸ expand (˅) ▸ Variables (4 updated) ▸ › ▸ Overview panel ▸ Updated</w:t>
+            </w:r>
+          </w:p>
+          <w:p>
+            <w:pPr>
+              <w:spacing w:after="0" w:before="60" w:line="264"/>
+            </w:pPr>
+            <w:r>
+              <w:rPr>
+                <w:rFonts w:ascii="Calibri" w:cs="Calibri" w:eastAsia="Calibri" w:hAnsi="Calibri"/>
+                <w:b/>
+                <w:bCs/>
+                <w:i w:val="false"/>
+                <w:iCs w:val="false"/>
+                <w:color w:val="2ECC71"/>
+                <w:sz w:val="19"/>
+                <w:szCs w:val="19"/>
+              </w:rPr>
+              <w:t xml:space="preserve">→ </w:t>
+            </w:r>
+            <w:r>
+              <w:rPr>
+                <w:rFonts w:ascii="Calibri" w:cs="Calibri" w:eastAsia="Calibri" w:hAnsi="Calibri"/>
+                <w:b w:val="false"/>
+                <w:bCs w:val="false"/>
+                <w:i w:val="false"/>
+                <w:iCs w:val="false"/>
+                <w:color w:val="9AA4B2"/>
+                <w:sz w:val="19"/>
+                <w:szCs w:val="19"/>
+              </w:rPr>
+              <w:t xml:space="preserve">Filled by the tool (blue dot = changed this turn): is_authenticated true, account_id 100234, customer_name Renee Thibodeaux, service_zip 39567.</w:t>
+            </w:r>
+          </w:p>
+        </w:tc>
+      </w:tr>
+    </w:tbl>
+    <w:p>
+      <w:pPr>
+        <w:spacing w:after="20" w:before="0" w:line="264"/>
+      </w:pPr>
+      <w:r>
+        <w:rPr>
+          <w:rFonts w:ascii="Calibri" w:cs="Calibri" w:eastAsia="Calibri" w:hAnsi="Calibri"/>
+          <w:b w:val="false"/>
+          <w:bCs w:val="false"/>
+          <w:i w:val="false"/>
+          <w:iCs w:val="false"/>
+          <w:sz w:val="22"/>
+          <w:szCs w:val="22"/>
+        </w:rPr>
+        <w:t xml:space="preserve"/>
+      </w:r>
+    </w:p>
+    <w:tbl>
+      <w:tblPr>
+        <w:tblW w:type="dxa" w:w="10080"/>
+        <w:tblBorders>
+          <w:top w:val="single" w:color="auto" w:sz="4"/>
+          <w:left w:val="single" w:color="auto" w:sz="4"/>
+          <w:bottom w:val="single" w:color="auto" w:sz="4"/>
+          <w:right w:val="single" w:color="auto" w:sz="4"/>
+          <w:insideH w:val="single" w:color="auto" w:sz="4"/>
+          <w:insideV w:val="single" w:color="auto" w:sz="4"/>
+        </w:tblBorders>
+      </w:tblPr>
+      <w:tblGrid>
+        <w:gridCol w:w="10080"/>
+      </w:tblGrid>
+      <w:tr>
+        <w:trPr>
+          <w:cantSplit/>
+        </w:trPr>
+        <w:tc>
+          <w:tcPr>
+            <w:tcW w:type="dxa" w:w="10080"/>
+            <w:tcBorders>
+              <w:top w:val="single" w:color="F28C28" w:sz="12"/>
+              <w:left w:val="single" w:color="F28C28" w:sz="36"/>
+              <w:bottom w:val="single" w:color="F28C28" w:sz="12"/>
+              <w:right w:val="single" w:color="F28C28" w:sz="12"/>
+            </w:tcBorders>
+            <w:tcMar>
+              <w:top w:type="dxa" w:w="80"/>
+              <w:left w:type="dxa" w:w="160"/>
+              <w:bottom w:type="dxa" w:w="80"/>
+              <w:right w:type="dxa" w:w="160"/>
+            </w:tcMar>
+          </w:tcPr>
+          <w:p>
+            <w:pPr>
+              <w:spacing w:after="40" w:before="0" w:line="264"/>
+            </w:pPr>
+            <w:r>
+              <w:rPr>
+                <w:rFonts w:ascii="Calibri" w:cs="Calibri" w:eastAsia="Calibri" w:hAnsi="Calibri"/>
+                <w:b/>
+                <w:bCs/>
+                <w:i w:val="false"/>
+                <w:iCs w:val="false"/>
+                <w:color w:val="F28C28"/>
+                <w:sz w:val="18"/>
+                <w:szCs w:val="18"/>
+              </w:rPr>
+              <w:t xml:space="preserve">TYPE in Preview</w:t>
+            </w:r>
+          </w:p>
+          <w:p>
+            <w:pPr>
+              <w:spacing w:after="0" w:before="0" w:line="264"/>
+            </w:pPr>
+            <w:r>
+              <w:rPr>
+                <w:rFonts w:ascii="Consolas" w:cs="Consolas" w:eastAsia="Consolas" w:hAnsi="Consolas"/>
+                <w:b w:val="false"/>
+                <w:bCs w:val="false"/>
+                <w:i w:val="false"/>
+                <w:iCs w:val="false"/>
+                <w:sz w:val="19"/>
+                <w:szCs w:val="19"/>
+              </w:rPr>
+              <w:t xml:space="preserve">Is my power still out?</w:t>
+            </w:r>
+          </w:p>
+          <w:p>
+            <w:pPr>
+              <w:spacing w:after="0" w:before="60" w:line="264"/>
+            </w:pPr>
+            <w:r>
+              <w:rPr>
+                <w:rFonts w:ascii="Calibri" w:cs="Calibri" w:eastAsia="Calibri" w:hAnsi="Calibri"/>
+                <w:b/>
+                <w:bCs/>
+                <w:i w:val="false"/>
+                <w:iCs w:val="false"/>
+                <w:color w:val="2ECC71"/>
+                <w:sz w:val="19"/>
+                <w:szCs w:val="19"/>
+              </w:rPr>
+              <w:t xml:space="preserve">→ </w:t>
+            </w:r>
+            <w:r>
+              <w:rPr>
+                <w:rFonts w:ascii="Calibri" w:cs="Calibri" w:eastAsia="Calibri" w:hAnsi="Calibri"/>
+                <w:b w:val="false"/>
+                <w:bCs w:val="false"/>
+                <w:i w:val="false"/>
+                <w:iCs w:val="false"/>
+                <w:color w:val="9AA4B2"/>
+                <w:sz w:val="19"/>
+                <w:szCs w:val="19"/>
+              </w:rPr>
+              <w:t xml:space="preserve">Transfers to outage_agent, does NOT ask for the ZIP again (read {service_zip}), quotes 11:00 PM tonight.</w:t>
+            </w:r>
+          </w:p>
+        </w:tc>
+      </w:tr>
+    </w:tbl>
+    <w:p>
+      <w:pPr>
+        <w:spacing w:after="20" w:before="0" w:line="264"/>
+      </w:pPr>
+      <w:r>
+        <w:rPr>
+          <w:rFonts w:ascii="Calibri" w:cs="Calibri" w:eastAsia="Calibri" w:hAnsi="Calibri"/>
+          <w:b w:val="false"/>
+          <w:bCs w:val="false"/>
+          <w:i w:val="false"/>
+          <w:iCs w:val="false"/>
+          <w:sz w:val="22"/>
+          <w:szCs w:val="22"/>
+        </w:rPr>
+        <w:t xml:space="preserve"/>
+      </w:r>
+    </w:p>
     <w:p>
       <w:pPr>
         <w:spacing w:after="80" w:before="40" w:line="264"/>
@@ -16068,7 +16582,7 @@
           <w:sz w:val="20"/>
           <w:szCs w:val="20"/>
         </w:rPr>
-        <w:t xml:space="preserve">If an agent says it has no way to look something up, the tool isn't attached to THAT agent (tools are per agent). Don't point out the "up to 12 monthly installments" line in the billing_agent: M5's evaluation catches it.</w:t>
+        <w:t xml:space="preserve">If an agent says it has no way to look something up, the tool isn't attached to THAT agent (tools are per agent). "One moment while I get that" and then nothing: the model replied instead of calling the tool; the global instruction line and verify_customer's agent_action prevent it (type "ok?" to nudge it). Don't point out the "up to 12 monthly installments" line in the billing_agent: M5's evaluation catches it.</w:t>
       </w:r>
     </w:p>
     <w:p>

</xml_diff>